<commit_message>
feat(add): Sprint 11A — Experiment Result Standardization
feat(comparison): Sprint 11B — Forecast Comparison & Evaluation
</commit_message>
<xml_diff>
--- a/docs/draft/development_flow.docx
+++ b/docs/draft/development_flow.docx
@@ -23608,9 +23608,800 @@
           <w:u w:val="single"/>
         </w:rPr>
         <w:lastRenderedPageBreak/>
-        <w:t>Architecture of ‘</w:t>
-      </w:r>
-      <w:r>
+        <w:t>Architecture of ‘HybridDiagnostics’ :</w:t>
+      </w:r>
+    </w:p>
+    <w:p>
+      <w:pPr>
+        <w:spacing w:after="0" w:line="240" w:lineRule="auto"/>
+        <w:rPr>
+          <w:noProof/>
+          <w:sz w:val="24"/>
+          <w:szCs w:val="24"/>
+          <w:lang w:val="tr-TR"/>
+        </w:rPr>
+      </w:pPr>
+    </w:p>
+    <w:p>
+      <w:pPr>
+        <w:spacing w:after="0" w:line="240" w:lineRule="auto"/>
+        <w:rPr>
+          <w:b/>
+          <w:bCs/>
+          <w:noProof/>
+          <w:sz w:val="28"/>
+          <w:szCs w:val="28"/>
+          <w:lang w:val="tr-TR"/>
+        </w:rPr>
+      </w:pPr>
+      <w:r>
+        <w:rPr>
+          <w:b/>
+          <w:bCs/>
+          <w:noProof/>
+          <w:sz w:val="28"/>
+          <w:szCs w:val="28"/>
+          <w:lang w:val="tr-TR"/>
+        </w:rPr>
+        <w:t>HybridDiagnostics</w:t>
+      </w:r>
+    </w:p>
+    <w:p>
+      <w:pPr>
+        <w:spacing w:after="0" w:line="240" w:lineRule="auto"/>
+        <w:rPr>
+          <w:noProof/>
+          <w:sz w:val="24"/>
+          <w:szCs w:val="24"/>
+          <w:lang w:val="tr-TR"/>
+        </w:rPr>
+      </w:pPr>
+    </w:p>
+    <w:p>
+      <w:pPr>
+        <w:spacing w:after="0" w:line="240" w:lineRule="auto"/>
+        <w:rPr>
+          <w:noProof/>
+          <w:sz w:val="24"/>
+          <w:szCs w:val="24"/>
+          <w:lang w:val="tr-TR"/>
+        </w:rPr>
+      </w:pPr>
+      <w:r>
+        <w:rPr>
+          <w:rFonts w:ascii="MS Gothic" w:eastAsia="MS Gothic" w:hAnsi="MS Gothic" w:cs="MS Gothic" w:hint="eastAsia"/>
+          <w:noProof/>
+          <w:sz w:val="24"/>
+          <w:szCs w:val="24"/>
+          <w:lang w:val="tr-TR"/>
+        </w:rPr>
+        <w:t>├</w:t>
+      </w:r>
+      <w:r>
+        <w:rPr>
+          <w:rFonts w:ascii="Calibri" w:hAnsi="Calibri" w:cs="Calibri"/>
+          <w:noProof/>
+          <w:sz w:val="24"/>
+          <w:szCs w:val="24"/>
+          <w:lang w:val="tr-TR"/>
+        </w:rPr>
+        <w:t>──</w:t>
+      </w:r>
+      <w:r>
+        <w:rPr>
+          <w:noProof/>
+          <w:sz w:val="24"/>
+          <w:szCs w:val="24"/>
+          <w:lang w:val="tr-TR"/>
+        </w:rPr>
+        <w:t xml:space="preserve"> </w:t>
+      </w:r>
+      <w:r>
+        <w:rPr>
+          <w:b/>
+          <w:bCs/>
+          <w:noProof/>
+          <w:sz w:val="24"/>
+          <w:szCs w:val="24"/>
+          <w:lang w:val="tr-TR"/>
+        </w:rPr>
+        <w:t>Decomposition</w:t>
+      </w:r>
+    </w:p>
+    <w:p>
+      <w:pPr>
+        <w:spacing w:after="0" w:line="240" w:lineRule="auto"/>
+        <w:rPr>
+          <w:noProof/>
+          <w:sz w:val="24"/>
+          <w:szCs w:val="24"/>
+          <w:lang w:val="tr-TR"/>
+        </w:rPr>
+      </w:pPr>
+    </w:p>
+    <w:p>
+      <w:pPr>
+        <w:spacing w:after="0" w:line="240" w:lineRule="auto"/>
+        <w:rPr>
+          <w:noProof/>
+          <w:sz w:val="24"/>
+          <w:szCs w:val="24"/>
+          <w:lang w:val="tr-TR"/>
+        </w:rPr>
+      </w:pPr>
+      <w:r>
+        <w:rPr>
+          <w:noProof/>
+          <w:sz w:val="24"/>
+          <w:szCs w:val="24"/>
+          <w:lang w:val="tr-TR"/>
+        </w:rPr>
+        <w:t xml:space="preserve"> </w:t>
+      </w:r>
+      <w:r>
+        <w:rPr>
+          <w:noProof/>
+          <w:sz w:val="24"/>
+          <w:szCs w:val="24"/>
+          <w:lang w:val="tr-TR"/>
+        </w:rPr>
+        <w:t>│      verify_decomposition()</w:t>
+      </w:r>
+    </w:p>
+    <w:p>
+      <w:pPr>
+        <w:spacing w:after="0" w:line="240" w:lineRule="auto"/>
+        <w:rPr>
+          <w:noProof/>
+          <w:sz w:val="24"/>
+          <w:szCs w:val="24"/>
+          <w:lang w:val="tr-TR"/>
+        </w:rPr>
+      </w:pPr>
+    </w:p>
+    <w:p>
+      <w:pPr>
+        <w:spacing w:after="0" w:line="240" w:lineRule="auto"/>
+        <w:rPr>
+          <w:noProof/>
+          <w:sz w:val="24"/>
+          <w:szCs w:val="24"/>
+          <w:lang w:val="tr-TR"/>
+        </w:rPr>
+      </w:pPr>
+      <w:r>
+        <w:rPr>
+          <w:noProof/>
+          <w:sz w:val="24"/>
+          <w:szCs w:val="24"/>
+          <w:lang w:val="tr-TR"/>
+        </w:rPr>
+        <w:t xml:space="preserve"> </w:t>
+      </w:r>
+      <w:r>
+        <w:rPr>
+          <w:noProof/>
+          <w:sz w:val="24"/>
+          <w:szCs w:val="24"/>
+          <w:lang w:val="tr-TR"/>
+        </w:rPr>
+        <w:t>│      trend_variance()</w:t>
+      </w:r>
+    </w:p>
+    <w:p>
+      <w:pPr>
+        <w:spacing w:after="0" w:line="240" w:lineRule="auto"/>
+        <w:rPr>
+          <w:noProof/>
+          <w:sz w:val="24"/>
+          <w:szCs w:val="24"/>
+          <w:lang w:val="tr-TR"/>
+        </w:rPr>
+      </w:pPr>
+    </w:p>
+    <w:p>
+      <w:pPr>
+        <w:spacing w:after="0" w:line="240" w:lineRule="auto"/>
+        <w:rPr>
+          <w:noProof/>
+          <w:sz w:val="24"/>
+          <w:szCs w:val="24"/>
+          <w:lang w:val="tr-TR"/>
+        </w:rPr>
+      </w:pPr>
+      <w:r>
+        <w:rPr>
+          <w:noProof/>
+          <w:sz w:val="24"/>
+          <w:szCs w:val="24"/>
+          <w:lang w:val="tr-TR"/>
+        </w:rPr>
+        <w:t xml:space="preserve"> </w:t>
+      </w:r>
+      <w:r>
+        <w:rPr>
+          <w:noProof/>
+          <w:sz w:val="24"/>
+          <w:szCs w:val="24"/>
+          <w:lang w:val="tr-TR"/>
+        </w:rPr>
+        <w:t>│      residual_variance()</w:t>
+      </w:r>
+    </w:p>
+    <w:p>
+      <w:pPr>
+        <w:spacing w:after="0" w:line="240" w:lineRule="auto"/>
+        <w:rPr>
+          <w:noProof/>
+          <w:sz w:val="24"/>
+          <w:szCs w:val="24"/>
+          <w:lang w:val="tr-TR"/>
+        </w:rPr>
+      </w:pPr>
+    </w:p>
+    <w:p>
+      <w:pPr>
+        <w:spacing w:after="0" w:line="240" w:lineRule="auto"/>
+        <w:rPr>
+          <w:noProof/>
+          <w:sz w:val="24"/>
+          <w:szCs w:val="24"/>
+          <w:lang w:val="tr-TR"/>
+        </w:rPr>
+      </w:pPr>
+      <w:r>
+        <w:rPr>
+          <w:noProof/>
+          <w:sz w:val="24"/>
+          <w:szCs w:val="24"/>
+          <w:lang w:val="tr-TR"/>
+        </w:rPr>
+        <w:t xml:space="preserve"> </w:t>
+      </w:r>
+      <w:r>
+        <w:rPr>
+          <w:noProof/>
+          <w:sz w:val="24"/>
+          <w:szCs w:val="24"/>
+          <w:lang w:val="tr-TR"/>
+        </w:rPr>
+        <w:t>│</w:t>
+      </w:r>
+    </w:p>
+    <w:p>
+      <w:pPr>
+        <w:spacing w:after="0" w:line="240" w:lineRule="auto"/>
+        <w:rPr>
+          <w:noProof/>
+          <w:sz w:val="24"/>
+          <w:szCs w:val="24"/>
+          <w:lang w:val="tr-TR"/>
+        </w:rPr>
+      </w:pPr>
+    </w:p>
+    <w:p>
+      <w:pPr>
+        <w:spacing w:after="0" w:line="240" w:lineRule="auto"/>
+        <w:rPr>
+          <w:noProof/>
+          <w:sz w:val="24"/>
+          <w:szCs w:val="24"/>
+          <w:lang w:val="tr-TR"/>
+        </w:rPr>
+      </w:pPr>
+      <w:r>
+        <w:rPr>
+          <w:rFonts w:ascii="MS Gothic" w:eastAsia="MS Gothic" w:hAnsi="MS Gothic" w:cs="MS Gothic" w:hint="eastAsia"/>
+          <w:noProof/>
+          <w:sz w:val="24"/>
+          <w:szCs w:val="24"/>
+          <w:lang w:val="tr-TR"/>
+        </w:rPr>
+        <w:t>├</w:t>
+      </w:r>
+      <w:r>
+        <w:rPr>
+          <w:rFonts w:ascii="Calibri" w:hAnsi="Calibri" w:cs="Calibri"/>
+          <w:noProof/>
+          <w:sz w:val="24"/>
+          <w:szCs w:val="24"/>
+          <w:lang w:val="tr-TR"/>
+        </w:rPr>
+        <w:t>──</w:t>
+      </w:r>
+      <w:r>
+        <w:rPr>
+          <w:noProof/>
+          <w:sz w:val="24"/>
+          <w:szCs w:val="24"/>
+          <w:lang w:val="tr-TR"/>
+        </w:rPr>
+        <w:t xml:space="preserve"> </w:t>
+      </w:r>
+      <w:r>
+        <w:rPr>
+          <w:b/>
+          <w:bCs/>
+          <w:noProof/>
+          <w:sz w:val="24"/>
+          <w:szCs w:val="24"/>
+          <w:lang w:val="tr-TR"/>
+        </w:rPr>
+        <w:t>Residual Statistics</w:t>
+      </w:r>
+    </w:p>
+    <w:p>
+      <w:pPr>
+        <w:spacing w:after="0" w:line="240" w:lineRule="auto"/>
+        <w:rPr>
+          <w:noProof/>
+          <w:sz w:val="24"/>
+          <w:szCs w:val="24"/>
+          <w:lang w:val="tr-TR"/>
+        </w:rPr>
+      </w:pPr>
+    </w:p>
+    <w:p>
+      <w:pPr>
+        <w:spacing w:after="0" w:line="240" w:lineRule="auto"/>
+        <w:rPr>
+          <w:noProof/>
+          <w:sz w:val="24"/>
+          <w:szCs w:val="24"/>
+          <w:lang w:val="tr-TR"/>
+        </w:rPr>
+      </w:pPr>
+      <w:r>
+        <w:rPr>
+          <w:noProof/>
+          <w:sz w:val="24"/>
+          <w:szCs w:val="24"/>
+          <w:lang w:val="tr-TR"/>
+        </w:rPr>
+        <w:t xml:space="preserve"> </w:t>
+      </w:r>
+      <w:r>
+        <w:rPr>
+          <w:noProof/>
+          <w:sz w:val="24"/>
+          <w:szCs w:val="24"/>
+          <w:lang w:val="tr-TR"/>
+        </w:rPr>
+        <w:t>│      residual_mean()</w:t>
+      </w:r>
+    </w:p>
+    <w:p>
+      <w:pPr>
+        <w:spacing w:after="0" w:line="240" w:lineRule="auto"/>
+        <w:rPr>
+          <w:noProof/>
+          <w:sz w:val="24"/>
+          <w:szCs w:val="24"/>
+          <w:lang w:val="tr-TR"/>
+        </w:rPr>
+      </w:pPr>
+    </w:p>
+    <w:p>
+      <w:pPr>
+        <w:spacing w:after="0" w:line="240" w:lineRule="auto"/>
+        <w:rPr>
+          <w:noProof/>
+          <w:sz w:val="24"/>
+          <w:szCs w:val="24"/>
+          <w:lang w:val="tr-TR"/>
+        </w:rPr>
+      </w:pPr>
+      <w:r>
+        <w:rPr>
+          <w:noProof/>
+          <w:sz w:val="24"/>
+          <w:szCs w:val="24"/>
+          <w:lang w:val="tr-TR"/>
+        </w:rPr>
+        <w:t xml:space="preserve"> </w:t>
+      </w:r>
+      <w:r>
+        <w:rPr>
+          <w:noProof/>
+          <w:sz w:val="24"/>
+          <w:szCs w:val="24"/>
+          <w:lang w:val="tr-TR"/>
+        </w:rPr>
+        <w:t>│      residual_std()</w:t>
+      </w:r>
+    </w:p>
+    <w:p>
+      <w:pPr>
+        <w:spacing w:after="0" w:line="240" w:lineRule="auto"/>
+        <w:rPr>
+          <w:noProof/>
+          <w:sz w:val="24"/>
+          <w:szCs w:val="24"/>
+          <w:lang w:val="tr-TR"/>
+        </w:rPr>
+      </w:pPr>
+    </w:p>
+    <w:p>
+      <w:pPr>
+        <w:spacing w:after="0" w:line="240" w:lineRule="auto"/>
+        <w:rPr>
+          <w:noProof/>
+          <w:sz w:val="24"/>
+          <w:szCs w:val="24"/>
+          <w:lang w:val="tr-TR"/>
+        </w:rPr>
+      </w:pPr>
+      <w:r>
+        <w:rPr>
+          <w:noProof/>
+          <w:sz w:val="24"/>
+          <w:szCs w:val="24"/>
+          <w:lang w:val="tr-TR"/>
+        </w:rPr>
+        <w:t xml:space="preserve"> </w:t>
+      </w:r>
+      <w:r>
+        <w:rPr>
+          <w:noProof/>
+          <w:sz w:val="24"/>
+          <w:szCs w:val="24"/>
+          <w:lang w:val="tr-TR"/>
+        </w:rPr>
+        <w:t>│      autocorrelation()</w:t>
+      </w:r>
+    </w:p>
+    <w:p>
+      <w:pPr>
+        <w:spacing w:after="0" w:line="240" w:lineRule="auto"/>
+        <w:rPr>
+          <w:noProof/>
+          <w:sz w:val="24"/>
+          <w:szCs w:val="24"/>
+          <w:lang w:val="tr-TR"/>
+        </w:rPr>
+      </w:pPr>
+    </w:p>
+    <w:p>
+      <w:pPr>
+        <w:spacing w:after="0" w:line="240" w:lineRule="auto"/>
+        <w:rPr>
+          <w:noProof/>
+          <w:sz w:val="24"/>
+          <w:szCs w:val="24"/>
+          <w:lang w:val="tr-TR"/>
+        </w:rPr>
+      </w:pPr>
+      <w:r>
+        <w:rPr>
+          <w:noProof/>
+          <w:sz w:val="24"/>
+          <w:szCs w:val="24"/>
+          <w:lang w:val="tr-TR"/>
+        </w:rPr>
+        <w:t xml:space="preserve"> </w:t>
+      </w:r>
+      <w:r>
+        <w:rPr>
+          <w:noProof/>
+          <w:sz w:val="24"/>
+          <w:szCs w:val="24"/>
+          <w:lang w:val="tr-TR"/>
+        </w:rPr>
+        <w:t>│      durbin_watson()</w:t>
+      </w:r>
+    </w:p>
+    <w:p>
+      <w:pPr>
+        <w:spacing w:after="0" w:line="240" w:lineRule="auto"/>
+        <w:rPr>
+          <w:noProof/>
+          <w:sz w:val="24"/>
+          <w:szCs w:val="24"/>
+          <w:lang w:val="tr-TR"/>
+        </w:rPr>
+      </w:pPr>
+    </w:p>
+    <w:p>
+      <w:pPr>
+        <w:spacing w:after="0" w:line="240" w:lineRule="auto"/>
+        <w:rPr>
+          <w:noProof/>
+          <w:sz w:val="24"/>
+          <w:szCs w:val="24"/>
+          <w:lang w:val="tr-TR"/>
+        </w:rPr>
+      </w:pPr>
+      <w:r>
+        <w:rPr>
+          <w:noProof/>
+          <w:sz w:val="24"/>
+          <w:szCs w:val="24"/>
+          <w:lang w:val="tr-TR"/>
+        </w:rPr>
+        <w:t xml:space="preserve"> </w:t>
+      </w:r>
+      <w:r>
+        <w:rPr>
+          <w:noProof/>
+          <w:sz w:val="24"/>
+          <w:szCs w:val="24"/>
+          <w:lang w:val="tr-TR"/>
+        </w:rPr>
+        <w:t>│      ljung_box()</w:t>
+      </w:r>
+    </w:p>
+    <w:p>
+      <w:pPr>
+        <w:spacing w:after="0" w:line="240" w:lineRule="auto"/>
+        <w:rPr>
+          <w:noProof/>
+          <w:sz w:val="24"/>
+          <w:szCs w:val="24"/>
+          <w:lang w:val="tr-TR"/>
+        </w:rPr>
+      </w:pPr>
+    </w:p>
+    <w:p>
+      <w:pPr>
+        <w:spacing w:after="0" w:line="240" w:lineRule="auto"/>
+        <w:rPr>
+          <w:noProof/>
+          <w:sz w:val="24"/>
+          <w:szCs w:val="24"/>
+          <w:lang w:val="tr-TR"/>
+        </w:rPr>
+      </w:pPr>
+      <w:r>
+        <w:rPr>
+          <w:noProof/>
+          <w:sz w:val="24"/>
+          <w:szCs w:val="24"/>
+          <w:lang w:val="tr-TR"/>
+        </w:rPr>
+        <w:t xml:space="preserve"> </w:t>
+      </w:r>
+      <w:r>
+        <w:rPr>
+          <w:noProof/>
+          <w:sz w:val="24"/>
+          <w:szCs w:val="24"/>
+          <w:lang w:val="tr-TR"/>
+        </w:rPr>
+        <w:t>│</w:t>
+      </w:r>
+    </w:p>
+    <w:p>
+      <w:pPr>
+        <w:spacing w:after="0" w:line="240" w:lineRule="auto"/>
+        <w:rPr>
+          <w:noProof/>
+          <w:sz w:val="24"/>
+          <w:szCs w:val="24"/>
+          <w:lang w:val="tr-TR"/>
+        </w:rPr>
+      </w:pPr>
+    </w:p>
+    <w:p>
+      <w:pPr>
+        <w:spacing w:after="0" w:line="240" w:lineRule="auto"/>
+        <w:rPr>
+          <w:noProof/>
+          <w:sz w:val="24"/>
+          <w:szCs w:val="24"/>
+          <w:lang w:val="tr-TR"/>
+        </w:rPr>
+      </w:pPr>
+      <w:r>
+        <w:rPr>
+          <w:noProof/>
+          <w:sz w:val="24"/>
+          <w:szCs w:val="24"/>
+          <w:lang w:val="tr-TR"/>
+        </w:rPr>
+        <w:t xml:space="preserve"> </w:t>
+      </w:r>
+      <w:r>
+        <w:rPr>
+          <w:noProof/>
+          <w:sz w:val="24"/>
+          <w:szCs w:val="24"/>
+          <w:lang w:val="tr-TR"/>
+        </w:rPr>
+        <w:t xml:space="preserve">└── </w:t>
+      </w:r>
+      <w:r>
+        <w:rPr>
+          <w:b/>
+          <w:bCs/>
+          <w:noProof/>
+          <w:sz w:val="24"/>
+          <w:szCs w:val="24"/>
+          <w:lang w:val="tr-TR"/>
+        </w:rPr>
+        <w:t>Quality Assessment</w:t>
+      </w:r>
+    </w:p>
+    <w:p>
+      <w:pPr>
+        <w:spacing w:after="0" w:line="240" w:lineRule="auto"/>
+        <w:rPr>
+          <w:noProof/>
+          <w:sz w:val="24"/>
+          <w:szCs w:val="24"/>
+          <w:lang w:val="tr-TR"/>
+        </w:rPr>
+      </w:pPr>
+    </w:p>
+    <w:p>
+      <w:pPr>
+        <w:spacing w:after="0" w:line="240" w:lineRule="auto"/>
+        <w:rPr>
+          <w:noProof/>
+          <w:sz w:val="24"/>
+          <w:szCs w:val="24"/>
+          <w:lang w:val="tr-TR"/>
+        </w:rPr>
+      </w:pPr>
+      <w:r>
+        <w:rPr>
+          <w:noProof/>
+          <w:sz w:val="24"/>
+          <w:szCs w:val="24"/>
+          <w:lang w:val="tr-TR"/>
+        </w:rPr>
+        <w:t xml:space="preserve">       </w:t>
+      </w:r>
+      <w:r>
+        <w:rPr>
+          <w:noProof/>
+          <w:sz w:val="24"/>
+          <w:szCs w:val="24"/>
+          <w:lang w:val="tr-TR"/>
+        </w:rPr>
+        <w:t xml:space="preserve"> </w:t>
+      </w:r>
+      <w:r>
+        <w:rPr>
+          <w:noProof/>
+          <w:sz w:val="24"/>
+          <w:szCs w:val="24"/>
+          <w:lang w:val="tr-TR"/>
+        </w:rPr>
+        <w:t>quality_score()</w:t>
+      </w:r>
+    </w:p>
+    <w:p>
+      <w:pPr>
+        <w:spacing w:after="0" w:line="240" w:lineRule="auto"/>
+        <w:rPr>
+          <w:noProof/>
+          <w:sz w:val="24"/>
+          <w:szCs w:val="24"/>
+          <w:lang w:val="tr-TR"/>
+        </w:rPr>
+      </w:pPr>
+    </w:p>
+    <w:p>
+      <w:pPr>
+        <w:spacing w:after="0" w:line="240" w:lineRule="auto"/>
+        <w:rPr>
+          <w:noProof/>
+          <w:sz w:val="24"/>
+          <w:szCs w:val="24"/>
+          <w:lang w:val="tr-TR"/>
+        </w:rPr>
+      </w:pPr>
+      <w:r>
+        <w:rPr>
+          <w:noProof/>
+          <w:sz w:val="24"/>
+          <w:szCs w:val="24"/>
+          <w:lang w:val="tr-TR"/>
+        </w:rPr>
+        <w:t xml:space="preserve">       </w:t>
+      </w:r>
+      <w:r>
+        <w:rPr>
+          <w:noProof/>
+          <w:sz w:val="24"/>
+          <w:szCs w:val="24"/>
+          <w:lang w:val="tr-TR"/>
+        </w:rPr>
+        <w:t xml:space="preserve"> </w:t>
+      </w:r>
+      <w:r>
+        <w:rPr>
+          <w:noProof/>
+          <w:sz w:val="24"/>
+          <w:szCs w:val="24"/>
+          <w:lang w:val="tr-TR"/>
+        </w:rPr>
+        <w:t>quality_grade()</w:t>
+      </w:r>
+    </w:p>
+    <w:p>
+      <w:pPr>
+        <w:spacing w:after="0" w:line="240" w:lineRule="auto"/>
+        <w:rPr>
+          <w:noProof/>
+          <w:sz w:val="24"/>
+          <w:szCs w:val="24"/>
+          <w:lang w:val="tr-TR"/>
+        </w:rPr>
+      </w:pPr>
+    </w:p>
+    <w:p>
+      <w:pPr>
+        <w:spacing w:after="0" w:line="240" w:lineRule="auto"/>
+        <w:rPr>
+          <w:noProof/>
+          <w:sz w:val="24"/>
+          <w:szCs w:val="24"/>
+          <w:lang w:val="tr-TR"/>
+        </w:rPr>
+      </w:pPr>
+      <w:r>
+        <w:rPr>
+          <w:noProof/>
+          <w:sz w:val="24"/>
+          <w:szCs w:val="24"/>
+          <w:lang w:val="tr-TR"/>
+        </w:rPr>
+        <w:t xml:space="preserve">       </w:t>
+      </w:r>
+      <w:r>
+        <w:rPr>
+          <w:noProof/>
+          <w:sz w:val="24"/>
+          <w:szCs w:val="24"/>
+          <w:lang w:val="tr-TR"/>
+        </w:rPr>
+        <w:t xml:space="preserve"> </w:t>
+      </w:r>
+      <w:r>
+        <w:rPr>
+          <w:noProof/>
+          <w:sz w:val="24"/>
+          <w:szCs w:val="24"/>
+          <w:lang w:val="tr-TR"/>
+        </w:rPr>
+        <w:t>recommendations()</w:t>
+      </w:r>
+    </w:p>
+    <w:p>
+      <w:pPr>
+        <w:spacing w:after="0" w:line="240" w:lineRule="auto"/>
+        <w:rPr>
+          <w:noProof/>
+          <w:sz w:val="24"/>
+          <w:szCs w:val="24"/>
+          <w:lang w:val="tr-TR"/>
+        </w:rPr>
+      </w:pPr>
+    </w:p>
+    <w:p>
+      <w:pPr>
+        <w:rPr>
+          <w:noProof/>
+          <w:sz w:val="24"/>
+          <w:szCs w:val="24"/>
+          <w:lang w:val="tr-TR"/>
+        </w:rPr>
+      </w:pPr>
+      <w:r>
+        <w:rPr>
+          <w:noProof/>
+          <w:sz w:val="24"/>
+          <w:szCs w:val="24"/>
+          <w:lang w:val="tr-TR"/>
+        </w:rPr>
+        <w:br w:type="page"/>
+      </w:r>
+    </w:p>
+    <w:p>
+      <w:pPr>
+        <w:spacing w:after="0" w:line="240" w:lineRule="auto"/>
+        <w:jc w:val="center"/>
         <w:rPr>
           <w:b/>
           <w:bCs/>
@@ -23618,9 +24409,9 @@
           <w:sz w:val="32"/>
           <w:szCs w:val="32"/>
           <w:u w:val="single"/>
-        </w:rPr>
-        <w:t>HybridDiagnostics</w:t>
-      </w:r>
+          <w:lang w:val="tr-TR"/>
+        </w:rPr>
+      </w:pPr>
       <w:r>
         <w:rPr>
           <w:b/>
@@ -23629,66 +24420,122 @@
           <w:sz w:val="32"/>
           <w:szCs w:val="32"/>
           <w:u w:val="single"/>
-        </w:rPr>
-        <w:t>’ :</w:t>
-      </w:r>
-    </w:p>
-    <w:p>
-      <w:pPr>
-        <w:spacing w:after="0" w:line="240" w:lineRule="auto"/>
-        <w:rPr>
-          <w:noProof/>
-          <w:sz w:val="24"/>
-          <w:szCs w:val="24"/>
-          <w:lang w:val="tr-TR"/>
-        </w:rPr>
-      </w:pPr>
-    </w:p>
-    <w:p>
-      <w:pPr>
-        <w:spacing w:after="0" w:line="240" w:lineRule="auto"/>
-        <w:rPr>
-          <w:b/>
-          <w:bCs/>
-          <w:noProof/>
-          <w:sz w:val="28"/>
-          <w:szCs w:val="28"/>
-          <w:lang w:val="tr-TR"/>
-        </w:rPr>
-      </w:pPr>
-      <w:r>
-        <w:rPr>
-          <w:b/>
-          <w:bCs/>
-          <w:noProof/>
-          <w:sz w:val="28"/>
-          <w:szCs w:val="28"/>
-          <w:lang w:val="tr-TR"/>
-        </w:rPr>
-        <w:t>HybridDiagnostics</w:t>
-      </w:r>
-    </w:p>
-    <w:p>
-      <w:pPr>
-        <w:spacing w:after="0" w:line="240" w:lineRule="auto"/>
-        <w:rPr>
-          <w:noProof/>
-          <w:sz w:val="24"/>
-          <w:szCs w:val="24"/>
-          <w:lang w:val="tr-TR"/>
-        </w:rPr>
-      </w:pPr>
-    </w:p>
-    <w:p>
-      <w:pPr>
-        <w:spacing w:after="0" w:line="240" w:lineRule="auto"/>
-        <w:rPr>
-          <w:noProof/>
-          <w:sz w:val="24"/>
-          <w:szCs w:val="24"/>
-          <w:lang w:val="tr-TR"/>
-        </w:rPr>
-      </w:pPr>
+          <w:lang w:val="tr-TR"/>
+        </w:rPr>
+        <w:lastRenderedPageBreak/>
+        <w:t>Sprint 11:</w:t>
+      </w:r>
+    </w:p>
+    <w:p>
+      <w:pPr>
+        <w:spacing w:after="0" w:line="240" w:lineRule="auto"/>
+        <w:jc w:val="center"/>
+        <w:rPr>
+          <w:noProof/>
+          <w:sz w:val="24"/>
+          <w:szCs w:val="24"/>
+          <w:lang w:val="tr-TR"/>
+        </w:rPr>
+      </w:pPr>
+    </w:p>
+    <w:p>
+      <w:pPr>
+        <w:spacing w:after="0" w:line="240" w:lineRule="auto"/>
+        <w:jc w:val="center"/>
+        <w:rPr>
+          <w:noProof/>
+          <w:sz w:val="24"/>
+          <w:szCs w:val="24"/>
+          <w:lang w:val="tr-TR"/>
+        </w:rPr>
+      </w:pPr>
+      <w:r>
+        <w:rPr>
+          <w:noProof/>
+          <w:sz w:val="24"/>
+          <w:szCs w:val="24"/>
+          <w:lang w:val="tr-TR"/>
+        </w:rPr>
+        <w:t xml:space="preserve">              ┌───────────────┐</w:t>
+      </w:r>
+    </w:p>
+    <w:p>
+      <w:pPr>
+        <w:spacing w:after="0" w:line="240" w:lineRule="auto"/>
+        <w:jc w:val="center"/>
+        <w:rPr>
+          <w:noProof/>
+          <w:sz w:val="24"/>
+          <w:szCs w:val="24"/>
+          <w:lang w:val="tr-TR"/>
+        </w:rPr>
+      </w:pPr>
+      <w:r>
+        <w:rPr>
+          <w:noProof/>
+          <w:sz w:val="24"/>
+          <w:szCs w:val="24"/>
+          <w:lang w:val="tr-TR"/>
+        </w:rPr>
+        <w:t xml:space="preserve">           </w:t>
+      </w:r>
+      <w:r>
+        <w:rPr>
+          <w:noProof/>
+          <w:sz w:val="24"/>
+          <w:szCs w:val="24"/>
+          <w:lang w:val="tr-TR"/>
+        </w:rPr>
+        <w:t xml:space="preserve">   </w:t>
+      </w:r>
+      <w:r>
+        <w:rPr>
+          <w:noProof/>
+          <w:sz w:val="24"/>
+          <w:szCs w:val="24"/>
+          <w:lang w:val="tr-TR"/>
+        </w:rPr>
+        <w:t xml:space="preserve">│  Demo / Model </w:t>
+      </w:r>
+      <w:r>
+        <w:rPr>
+          <w:noProof/>
+          <w:sz w:val="24"/>
+          <w:szCs w:val="24"/>
+          <w:lang w:val="tr-TR"/>
+        </w:rPr>
+        <w:t xml:space="preserve">  </w:t>
+      </w:r>
+      <w:r>
+        <w:rPr>
+          <w:noProof/>
+          <w:sz w:val="24"/>
+          <w:szCs w:val="24"/>
+          <w:lang w:val="tr-TR"/>
+        </w:rPr>
+        <w:t>│</w:t>
+      </w:r>
+    </w:p>
+    <w:p>
+      <w:pPr>
+        <w:spacing w:after="0" w:line="240" w:lineRule="auto"/>
+        <w:jc w:val="center"/>
+        <w:rPr>
+          <w:noProof/>
+          <w:sz w:val="24"/>
+          <w:szCs w:val="24"/>
+          <w:lang w:val="tr-TR"/>
+        </w:rPr>
+      </w:pPr>
+      <w:r>
+        <w:rPr>
+          <w:noProof/>
+          <w:sz w:val="24"/>
+          <w:szCs w:val="24"/>
+          <w:lang w:val="tr-TR"/>
+        </w:rPr>
+        <w:t xml:space="preserve">              └───────</w:t>
+      </w:r>
       <w:r>
         <w:rPr>
           <w:rFonts w:ascii="MS Gothic" w:eastAsia="MS Gothic" w:hAnsi="MS Gothic" w:cs="MS Gothic" w:hint="eastAsia"/>
@@ -23697,7 +24544,7 @@
           <w:szCs w:val="24"/>
           <w:lang w:val="tr-TR"/>
         </w:rPr>
-        <w:t>├</w:t>
+        <w:t>┬</w:t>
       </w:r>
       <w:r>
         <w:rPr>
@@ -23707,210 +24554,159 @@
           <w:szCs w:val="24"/>
           <w:lang w:val="tr-TR"/>
         </w:rPr>
-        <w:t>──</w:t>
-      </w:r>
-      <w:r>
-        <w:rPr>
-          <w:noProof/>
-          <w:sz w:val="24"/>
-          <w:szCs w:val="24"/>
-          <w:lang w:val="tr-TR"/>
-        </w:rPr>
-        <w:t xml:space="preserve"> </w:t>
-      </w:r>
-      <w:r>
-        <w:rPr>
-          <w:b/>
-          <w:bCs/>
-          <w:noProof/>
-          <w:sz w:val="24"/>
-          <w:szCs w:val="24"/>
-          <w:lang w:val="tr-TR"/>
-        </w:rPr>
-        <w:t>Decomposition</w:t>
-      </w:r>
-    </w:p>
-    <w:p>
-      <w:pPr>
-        <w:spacing w:after="0" w:line="240" w:lineRule="auto"/>
-        <w:rPr>
-          <w:noProof/>
-          <w:sz w:val="24"/>
-          <w:szCs w:val="24"/>
-          <w:lang w:val="tr-TR"/>
-        </w:rPr>
-      </w:pPr>
-    </w:p>
-    <w:p>
-      <w:pPr>
-        <w:spacing w:after="0" w:line="240" w:lineRule="auto"/>
-        <w:rPr>
-          <w:noProof/>
-          <w:sz w:val="24"/>
-          <w:szCs w:val="24"/>
-          <w:lang w:val="tr-TR"/>
-        </w:rPr>
-      </w:pPr>
-      <w:r>
-        <w:rPr>
-          <w:noProof/>
-          <w:sz w:val="24"/>
-          <w:szCs w:val="24"/>
-          <w:lang w:val="tr-TR"/>
-        </w:rPr>
-        <w:t xml:space="preserve"> </w:t>
-      </w:r>
-      <w:r>
-        <w:rPr>
-          <w:noProof/>
-          <w:sz w:val="24"/>
-          <w:szCs w:val="24"/>
-          <w:lang w:val="tr-TR"/>
-        </w:rPr>
-        <w:t>│      verify_decomposition()</w:t>
-      </w:r>
-    </w:p>
-    <w:p>
-      <w:pPr>
-        <w:spacing w:after="0" w:line="240" w:lineRule="auto"/>
-        <w:rPr>
-          <w:noProof/>
-          <w:sz w:val="24"/>
-          <w:szCs w:val="24"/>
-          <w:lang w:val="tr-TR"/>
-        </w:rPr>
-      </w:pPr>
-    </w:p>
-    <w:p>
-      <w:pPr>
-        <w:spacing w:after="0" w:line="240" w:lineRule="auto"/>
-        <w:rPr>
-          <w:noProof/>
-          <w:sz w:val="24"/>
-          <w:szCs w:val="24"/>
-          <w:lang w:val="tr-TR"/>
-        </w:rPr>
-      </w:pPr>
-      <w:r>
-        <w:rPr>
-          <w:noProof/>
-          <w:sz w:val="24"/>
-          <w:szCs w:val="24"/>
-          <w:lang w:val="tr-TR"/>
-        </w:rPr>
-        <w:t xml:space="preserve"> </w:t>
-      </w:r>
-      <w:r>
-        <w:rPr>
-          <w:noProof/>
-          <w:sz w:val="24"/>
-          <w:szCs w:val="24"/>
-          <w:lang w:val="tr-TR"/>
-        </w:rPr>
-        <w:t>│      trend_variance()</w:t>
-      </w:r>
-    </w:p>
-    <w:p>
-      <w:pPr>
-        <w:spacing w:after="0" w:line="240" w:lineRule="auto"/>
-        <w:rPr>
-          <w:noProof/>
-          <w:sz w:val="24"/>
-          <w:szCs w:val="24"/>
-          <w:lang w:val="tr-TR"/>
-        </w:rPr>
-      </w:pPr>
-    </w:p>
-    <w:p>
-      <w:pPr>
-        <w:spacing w:after="0" w:line="240" w:lineRule="auto"/>
-        <w:rPr>
-          <w:noProof/>
-          <w:sz w:val="24"/>
-          <w:szCs w:val="24"/>
-          <w:lang w:val="tr-TR"/>
-        </w:rPr>
-      </w:pPr>
-      <w:r>
-        <w:rPr>
-          <w:noProof/>
-          <w:sz w:val="24"/>
-          <w:szCs w:val="24"/>
-          <w:lang w:val="tr-TR"/>
-        </w:rPr>
-        <w:t xml:space="preserve"> </w:t>
-      </w:r>
-      <w:r>
-        <w:rPr>
-          <w:noProof/>
-          <w:sz w:val="24"/>
-          <w:szCs w:val="24"/>
-          <w:lang w:val="tr-TR"/>
-        </w:rPr>
-        <w:t>│      residual_variance()</w:t>
-      </w:r>
-    </w:p>
-    <w:p>
-      <w:pPr>
-        <w:spacing w:after="0" w:line="240" w:lineRule="auto"/>
-        <w:rPr>
-          <w:noProof/>
-          <w:sz w:val="24"/>
-          <w:szCs w:val="24"/>
-          <w:lang w:val="tr-TR"/>
-        </w:rPr>
-      </w:pPr>
-    </w:p>
-    <w:p>
-      <w:pPr>
-        <w:spacing w:after="0" w:line="240" w:lineRule="auto"/>
-        <w:rPr>
-          <w:noProof/>
-          <w:sz w:val="24"/>
-          <w:szCs w:val="24"/>
-          <w:lang w:val="tr-TR"/>
-        </w:rPr>
-      </w:pPr>
-      <w:r>
-        <w:rPr>
-          <w:noProof/>
-          <w:sz w:val="24"/>
-          <w:szCs w:val="24"/>
-          <w:lang w:val="tr-TR"/>
-        </w:rPr>
-        <w:t xml:space="preserve"> </w:t>
-      </w:r>
-      <w:r>
-        <w:rPr>
-          <w:noProof/>
-          <w:sz w:val="24"/>
-          <w:szCs w:val="24"/>
-          <w:lang w:val="tr-TR"/>
-        </w:rPr>
-        <w:t>│</w:t>
-      </w:r>
-    </w:p>
-    <w:p>
-      <w:pPr>
-        <w:spacing w:after="0" w:line="240" w:lineRule="auto"/>
-        <w:rPr>
-          <w:noProof/>
-          <w:sz w:val="24"/>
-          <w:szCs w:val="24"/>
-          <w:lang w:val="tr-TR"/>
-        </w:rPr>
-      </w:pPr>
-    </w:p>
-    <w:p>
-      <w:pPr>
-        <w:spacing w:after="0" w:line="240" w:lineRule="auto"/>
-        <w:rPr>
-          <w:noProof/>
-          <w:sz w:val="24"/>
-          <w:szCs w:val="24"/>
-          <w:lang w:val="tr-TR"/>
-        </w:rPr>
-      </w:pPr>
+        <w:t>───────┘</w:t>
+      </w:r>
+    </w:p>
+    <w:p>
+      <w:pPr>
+        <w:spacing w:after="0" w:line="240" w:lineRule="auto"/>
+        <w:jc w:val="center"/>
+        <w:rPr>
+          <w:noProof/>
+          <w:sz w:val="24"/>
+          <w:szCs w:val="24"/>
+          <w:lang w:val="tr-TR"/>
+        </w:rPr>
+      </w:pPr>
+      <w:r>
+        <w:rPr>
+          <w:noProof/>
+          <w:sz w:val="24"/>
+          <w:szCs w:val="24"/>
+          <w:lang w:val="tr-TR"/>
+        </w:rPr>
+        <w:t xml:space="preserve">                      │</w:t>
+      </w:r>
+    </w:p>
+    <w:p>
+      <w:pPr>
+        <w:spacing w:after="0" w:line="240" w:lineRule="auto"/>
+        <w:jc w:val="center"/>
+        <w:rPr>
+          <w:noProof/>
+          <w:sz w:val="24"/>
+          <w:szCs w:val="24"/>
+          <w:lang w:val="tr-TR"/>
+        </w:rPr>
+      </w:pPr>
+      <w:r>
+        <w:rPr>
+          <w:noProof/>
+          <w:sz w:val="24"/>
+          <w:szCs w:val="24"/>
+          <w:lang w:val="tr-TR"/>
+        </w:rPr>
+        <w:t xml:space="preserve">                      </w:t>
+      </w:r>
+      <w:r>
+        <w:rPr>
+          <w:rFonts w:ascii="Arial" w:hAnsi="Arial" w:cs="Arial"/>
+          <w:noProof/>
+          <w:sz w:val="24"/>
+          <w:szCs w:val="24"/>
+          <w:lang w:val="tr-TR"/>
+        </w:rPr>
+        <w:t>▼</w:t>
+      </w:r>
+    </w:p>
+    <w:p>
+      <w:pPr>
+        <w:spacing w:after="0" w:line="240" w:lineRule="auto"/>
+        <w:jc w:val="center"/>
+        <w:rPr>
+          <w:noProof/>
+          <w:sz w:val="24"/>
+          <w:szCs w:val="24"/>
+          <w:lang w:val="tr-TR"/>
+        </w:rPr>
+      </w:pPr>
+      <w:r>
+        <w:rPr>
+          <w:noProof/>
+          <w:sz w:val="24"/>
+          <w:szCs w:val="24"/>
+          <w:lang w:val="tr-TR"/>
+        </w:rPr>
+        <w:t xml:space="preserve">              </w:t>
+      </w:r>
+      <w:r>
+        <w:rPr>
+          <w:noProof/>
+          <w:sz w:val="24"/>
+          <w:szCs w:val="24"/>
+          <w:lang w:val="tr-TR"/>
+        </w:rPr>
+        <w:t xml:space="preserve">            </w:t>
+      </w:r>
+      <w:r>
+        <w:rPr>
+          <w:noProof/>
+          <w:sz w:val="24"/>
+          <w:szCs w:val="24"/>
+          <w:lang w:val="tr-TR"/>
+        </w:rPr>
+        <w:t>Standard Experiment</w:t>
+      </w:r>
+    </w:p>
+    <w:p>
+      <w:pPr>
+        <w:spacing w:after="0" w:line="240" w:lineRule="auto"/>
+        <w:jc w:val="center"/>
+        <w:rPr>
+          <w:noProof/>
+          <w:sz w:val="24"/>
+          <w:szCs w:val="24"/>
+          <w:lang w:val="tr-TR"/>
+        </w:rPr>
+      </w:pPr>
+      <w:r>
+        <w:rPr>
+          <w:noProof/>
+          <w:sz w:val="24"/>
+          <w:szCs w:val="24"/>
+          <w:lang w:val="tr-TR"/>
+        </w:rPr>
+        <w:t xml:space="preserve">                      │</w:t>
+      </w:r>
+    </w:p>
+    <w:p>
+      <w:pPr>
+        <w:spacing w:after="0" w:line="240" w:lineRule="auto"/>
+        <w:jc w:val="center"/>
+        <w:rPr>
+          <w:noProof/>
+          <w:sz w:val="24"/>
+          <w:szCs w:val="24"/>
+          <w:lang w:val="tr-TR"/>
+        </w:rPr>
+      </w:pPr>
+      <w:r>
+        <w:rPr>
+          <w:noProof/>
+          <w:sz w:val="24"/>
+          <w:szCs w:val="24"/>
+          <w:lang w:val="tr-TR"/>
+        </w:rPr>
+        <w:t xml:space="preserve">         </w:t>
+      </w:r>
+      <w:r>
+        <w:rPr>
+          <w:noProof/>
+          <w:sz w:val="24"/>
+          <w:szCs w:val="24"/>
+          <w:lang w:val="tr-TR"/>
+        </w:rPr>
+        <w:t xml:space="preserve">            </w:t>
+      </w:r>
+      <w:r>
+        <w:rPr>
+          <w:noProof/>
+          <w:sz w:val="24"/>
+          <w:szCs w:val="24"/>
+          <w:lang w:val="tr-TR"/>
+        </w:rPr>
+        <w:t xml:space="preserve"> ┌───────────</w:t>
+      </w:r>
       <w:r>
         <w:rPr>
           <w:rFonts w:ascii="MS Gothic" w:eastAsia="MS Gothic" w:hAnsi="MS Gothic" w:cs="MS Gothic" w:hint="eastAsia"/>
@@ -23919,7 +24715,7 @@
           <w:szCs w:val="24"/>
           <w:lang w:val="tr-TR"/>
         </w:rPr>
-        <w:t>├</w:t>
+        <w:t>┼</w:t>
       </w:r>
       <w:r>
         <w:rPr>
@@ -23929,465 +24725,786 @@
           <w:szCs w:val="24"/>
           <w:lang w:val="tr-TR"/>
         </w:rPr>
-        <w:t>──</w:t>
-      </w:r>
-      <w:r>
-        <w:rPr>
-          <w:noProof/>
-          <w:sz w:val="24"/>
-          <w:szCs w:val="24"/>
-          <w:lang w:val="tr-TR"/>
-        </w:rPr>
-        <w:t xml:space="preserve"> </w:t>
-      </w:r>
-      <w:r>
-        <w:rPr>
-          <w:b/>
-          <w:bCs/>
-          <w:noProof/>
-          <w:sz w:val="24"/>
-          <w:szCs w:val="24"/>
-          <w:lang w:val="tr-TR"/>
-        </w:rPr>
-        <w:t>Residual Statistics</w:t>
-      </w:r>
-    </w:p>
-    <w:p>
-      <w:pPr>
-        <w:spacing w:after="0" w:line="240" w:lineRule="auto"/>
-        <w:rPr>
-          <w:noProof/>
-          <w:sz w:val="24"/>
-          <w:szCs w:val="24"/>
-          <w:lang w:val="tr-TR"/>
-        </w:rPr>
-      </w:pPr>
-    </w:p>
-    <w:p>
-      <w:pPr>
-        <w:spacing w:after="0" w:line="240" w:lineRule="auto"/>
-        <w:rPr>
-          <w:noProof/>
-          <w:sz w:val="24"/>
-          <w:szCs w:val="24"/>
-          <w:lang w:val="tr-TR"/>
-        </w:rPr>
-      </w:pPr>
-      <w:r>
-        <w:rPr>
-          <w:noProof/>
-          <w:sz w:val="24"/>
-          <w:szCs w:val="24"/>
-          <w:lang w:val="tr-TR"/>
-        </w:rPr>
-        <w:t xml:space="preserve"> </w:t>
-      </w:r>
-      <w:r>
-        <w:rPr>
-          <w:noProof/>
-          <w:sz w:val="24"/>
-          <w:szCs w:val="24"/>
-          <w:lang w:val="tr-TR"/>
-        </w:rPr>
-        <w:t>│      residual_mean()</w:t>
-      </w:r>
-    </w:p>
-    <w:p>
-      <w:pPr>
-        <w:spacing w:after="0" w:line="240" w:lineRule="auto"/>
-        <w:rPr>
-          <w:noProof/>
-          <w:sz w:val="24"/>
-          <w:szCs w:val="24"/>
-          <w:lang w:val="tr-TR"/>
-        </w:rPr>
-      </w:pPr>
-    </w:p>
-    <w:p>
-      <w:pPr>
-        <w:spacing w:after="0" w:line="240" w:lineRule="auto"/>
-        <w:rPr>
-          <w:noProof/>
-          <w:sz w:val="24"/>
-          <w:szCs w:val="24"/>
-          <w:lang w:val="tr-TR"/>
-        </w:rPr>
-      </w:pPr>
-      <w:r>
-        <w:rPr>
-          <w:noProof/>
-          <w:sz w:val="24"/>
-          <w:szCs w:val="24"/>
-          <w:lang w:val="tr-TR"/>
-        </w:rPr>
-        <w:t xml:space="preserve"> </w:t>
-      </w:r>
-      <w:r>
-        <w:rPr>
-          <w:noProof/>
-          <w:sz w:val="24"/>
-          <w:szCs w:val="24"/>
-          <w:lang w:val="tr-TR"/>
-        </w:rPr>
-        <w:t>│      residual_std()</w:t>
-      </w:r>
-    </w:p>
-    <w:p>
-      <w:pPr>
-        <w:spacing w:after="0" w:line="240" w:lineRule="auto"/>
-        <w:rPr>
-          <w:noProof/>
-          <w:sz w:val="24"/>
-          <w:szCs w:val="24"/>
-          <w:lang w:val="tr-TR"/>
-        </w:rPr>
-      </w:pPr>
-    </w:p>
-    <w:p>
-      <w:pPr>
-        <w:spacing w:after="0" w:line="240" w:lineRule="auto"/>
-        <w:rPr>
-          <w:noProof/>
-          <w:sz w:val="24"/>
-          <w:szCs w:val="24"/>
-          <w:lang w:val="tr-TR"/>
-        </w:rPr>
-      </w:pPr>
-      <w:r>
-        <w:rPr>
-          <w:noProof/>
-          <w:sz w:val="24"/>
-          <w:szCs w:val="24"/>
-          <w:lang w:val="tr-TR"/>
-        </w:rPr>
-        <w:t xml:space="preserve"> </w:t>
-      </w:r>
-      <w:r>
-        <w:rPr>
-          <w:noProof/>
-          <w:sz w:val="24"/>
-          <w:szCs w:val="24"/>
-          <w:lang w:val="tr-TR"/>
-        </w:rPr>
-        <w:t>│      autocorrelation()</w:t>
-      </w:r>
-    </w:p>
-    <w:p>
-      <w:pPr>
-        <w:spacing w:after="0" w:line="240" w:lineRule="auto"/>
-        <w:rPr>
-          <w:noProof/>
-          <w:sz w:val="24"/>
-          <w:szCs w:val="24"/>
-          <w:lang w:val="tr-TR"/>
-        </w:rPr>
-      </w:pPr>
-    </w:p>
-    <w:p>
-      <w:pPr>
-        <w:spacing w:after="0" w:line="240" w:lineRule="auto"/>
-        <w:rPr>
-          <w:noProof/>
-          <w:sz w:val="24"/>
-          <w:szCs w:val="24"/>
-          <w:lang w:val="tr-TR"/>
-        </w:rPr>
-      </w:pPr>
-      <w:r>
-        <w:rPr>
-          <w:noProof/>
-          <w:sz w:val="24"/>
-          <w:szCs w:val="24"/>
-          <w:lang w:val="tr-TR"/>
-        </w:rPr>
-        <w:t xml:space="preserve"> </w:t>
-      </w:r>
-      <w:r>
-        <w:rPr>
-          <w:noProof/>
-          <w:sz w:val="24"/>
-          <w:szCs w:val="24"/>
-          <w:lang w:val="tr-TR"/>
-        </w:rPr>
-        <w:t>│      durbin_watson()</w:t>
-      </w:r>
-    </w:p>
-    <w:p>
-      <w:pPr>
-        <w:spacing w:after="0" w:line="240" w:lineRule="auto"/>
-        <w:rPr>
-          <w:noProof/>
-          <w:sz w:val="24"/>
-          <w:szCs w:val="24"/>
-          <w:lang w:val="tr-TR"/>
-        </w:rPr>
-      </w:pPr>
-    </w:p>
-    <w:p>
-      <w:pPr>
-        <w:spacing w:after="0" w:line="240" w:lineRule="auto"/>
-        <w:rPr>
-          <w:noProof/>
-          <w:sz w:val="24"/>
-          <w:szCs w:val="24"/>
-          <w:lang w:val="tr-TR"/>
-        </w:rPr>
-      </w:pPr>
-      <w:r>
-        <w:rPr>
-          <w:noProof/>
-          <w:sz w:val="24"/>
-          <w:szCs w:val="24"/>
-          <w:lang w:val="tr-TR"/>
-        </w:rPr>
-        <w:t xml:space="preserve"> </w:t>
-      </w:r>
-      <w:r>
-        <w:rPr>
-          <w:noProof/>
-          <w:sz w:val="24"/>
-          <w:szCs w:val="24"/>
-          <w:lang w:val="tr-TR"/>
-        </w:rPr>
-        <w:t>│      ljung_box()</w:t>
-      </w:r>
-    </w:p>
-    <w:p>
-      <w:pPr>
-        <w:spacing w:after="0" w:line="240" w:lineRule="auto"/>
-        <w:rPr>
-          <w:noProof/>
-          <w:sz w:val="24"/>
-          <w:szCs w:val="24"/>
-          <w:lang w:val="tr-TR"/>
-        </w:rPr>
-      </w:pPr>
-    </w:p>
-    <w:p>
-      <w:pPr>
-        <w:spacing w:after="0" w:line="240" w:lineRule="auto"/>
-        <w:rPr>
-          <w:noProof/>
-          <w:sz w:val="24"/>
-          <w:szCs w:val="24"/>
-          <w:lang w:val="tr-TR"/>
-        </w:rPr>
-      </w:pPr>
-      <w:r>
-        <w:rPr>
-          <w:noProof/>
-          <w:sz w:val="24"/>
-          <w:szCs w:val="24"/>
-          <w:lang w:val="tr-TR"/>
-        </w:rPr>
-        <w:t xml:space="preserve"> </w:t>
-      </w:r>
-      <w:r>
-        <w:rPr>
-          <w:noProof/>
-          <w:sz w:val="24"/>
-          <w:szCs w:val="24"/>
-          <w:lang w:val="tr-TR"/>
-        </w:rPr>
-        <w:t>│</w:t>
-      </w:r>
-    </w:p>
-    <w:p>
-      <w:pPr>
-        <w:spacing w:after="0" w:line="240" w:lineRule="auto"/>
-        <w:rPr>
-          <w:noProof/>
-          <w:sz w:val="24"/>
-          <w:szCs w:val="24"/>
-          <w:lang w:val="tr-TR"/>
-        </w:rPr>
-      </w:pPr>
-    </w:p>
-    <w:p>
-      <w:pPr>
-        <w:spacing w:after="0" w:line="240" w:lineRule="auto"/>
-        <w:rPr>
-          <w:noProof/>
-          <w:sz w:val="24"/>
-          <w:szCs w:val="24"/>
-          <w:lang w:val="tr-TR"/>
-        </w:rPr>
-      </w:pPr>
-      <w:r>
-        <w:rPr>
-          <w:noProof/>
-          <w:sz w:val="24"/>
-          <w:szCs w:val="24"/>
-          <w:lang w:val="tr-TR"/>
-        </w:rPr>
-        <w:t xml:space="preserve"> </w:t>
-      </w:r>
-      <w:r>
-        <w:rPr>
-          <w:noProof/>
-          <w:sz w:val="24"/>
-          <w:szCs w:val="24"/>
-          <w:lang w:val="tr-TR"/>
-        </w:rPr>
-        <w:t xml:space="preserve">└── </w:t>
-      </w:r>
-      <w:r>
-        <w:rPr>
-          <w:b/>
-          <w:bCs/>
-          <w:noProof/>
-          <w:sz w:val="24"/>
-          <w:szCs w:val="24"/>
-          <w:lang w:val="tr-TR"/>
-        </w:rPr>
-        <w:t>Quality Assessment</w:t>
-      </w:r>
-    </w:p>
-    <w:p>
-      <w:pPr>
-        <w:spacing w:after="0" w:line="240" w:lineRule="auto"/>
-        <w:rPr>
-          <w:noProof/>
-          <w:sz w:val="24"/>
-          <w:szCs w:val="24"/>
-          <w:lang w:val="tr-TR"/>
-        </w:rPr>
-      </w:pPr>
-    </w:p>
-    <w:p>
-      <w:pPr>
-        <w:spacing w:after="0" w:line="240" w:lineRule="auto"/>
-        <w:rPr>
-          <w:noProof/>
-          <w:sz w:val="24"/>
-          <w:szCs w:val="24"/>
-          <w:lang w:val="tr-TR"/>
-        </w:rPr>
-      </w:pPr>
-      <w:r>
-        <w:rPr>
-          <w:noProof/>
-          <w:sz w:val="24"/>
-          <w:szCs w:val="24"/>
-          <w:lang w:val="tr-TR"/>
-        </w:rPr>
-        <w:t xml:space="preserve">       </w:t>
-      </w:r>
-      <w:r>
-        <w:rPr>
-          <w:noProof/>
-          <w:sz w:val="24"/>
-          <w:szCs w:val="24"/>
-          <w:lang w:val="tr-TR"/>
-        </w:rPr>
-        <w:t xml:space="preserve"> </w:t>
-      </w:r>
-      <w:r>
-        <w:rPr>
-          <w:noProof/>
-          <w:sz w:val="24"/>
-          <w:szCs w:val="24"/>
-          <w:lang w:val="tr-TR"/>
-        </w:rPr>
-        <w:t>quality_score()</w:t>
-      </w:r>
-    </w:p>
-    <w:p>
-      <w:pPr>
-        <w:spacing w:after="0" w:line="240" w:lineRule="auto"/>
-        <w:rPr>
-          <w:noProof/>
-          <w:sz w:val="24"/>
-          <w:szCs w:val="24"/>
-          <w:lang w:val="tr-TR"/>
-        </w:rPr>
-      </w:pPr>
-    </w:p>
-    <w:p>
-      <w:pPr>
-        <w:spacing w:after="0" w:line="240" w:lineRule="auto"/>
-        <w:rPr>
-          <w:noProof/>
-          <w:sz w:val="24"/>
-          <w:szCs w:val="24"/>
-          <w:lang w:val="tr-TR"/>
-        </w:rPr>
-      </w:pPr>
-      <w:r>
-        <w:rPr>
-          <w:noProof/>
-          <w:sz w:val="24"/>
-          <w:szCs w:val="24"/>
-          <w:lang w:val="tr-TR"/>
-        </w:rPr>
-        <w:t xml:space="preserve">       </w:t>
-      </w:r>
-      <w:r>
-        <w:rPr>
-          <w:noProof/>
-          <w:sz w:val="24"/>
-          <w:szCs w:val="24"/>
-          <w:lang w:val="tr-TR"/>
-        </w:rPr>
-        <w:t xml:space="preserve"> </w:t>
-      </w:r>
-      <w:r>
-        <w:rPr>
-          <w:noProof/>
-          <w:sz w:val="24"/>
-          <w:szCs w:val="24"/>
-          <w:lang w:val="tr-TR"/>
-        </w:rPr>
-        <w:t>quality_grade()</w:t>
-      </w:r>
-    </w:p>
-    <w:p>
-      <w:pPr>
-        <w:spacing w:after="0" w:line="240" w:lineRule="auto"/>
-        <w:rPr>
-          <w:noProof/>
-          <w:sz w:val="24"/>
-          <w:szCs w:val="24"/>
-          <w:lang w:val="tr-TR"/>
-        </w:rPr>
-      </w:pPr>
-    </w:p>
-    <w:p>
-      <w:pPr>
-        <w:spacing w:after="0" w:line="240" w:lineRule="auto"/>
-        <w:rPr>
-          <w:noProof/>
-          <w:sz w:val="24"/>
-          <w:szCs w:val="24"/>
-          <w:lang w:val="tr-TR"/>
-        </w:rPr>
-      </w:pPr>
-      <w:r>
-        <w:rPr>
-          <w:noProof/>
-          <w:sz w:val="24"/>
-          <w:szCs w:val="24"/>
-          <w:lang w:val="tr-TR"/>
-        </w:rPr>
-        <w:t xml:space="preserve">       </w:t>
-      </w:r>
-      <w:r>
-        <w:rPr>
-          <w:noProof/>
-          <w:sz w:val="24"/>
-          <w:szCs w:val="24"/>
-          <w:lang w:val="tr-TR"/>
-        </w:rPr>
-        <w:t xml:space="preserve"> </w:t>
-      </w:r>
-      <w:r>
-        <w:rPr>
-          <w:noProof/>
-          <w:sz w:val="24"/>
-          <w:szCs w:val="24"/>
-          <w:lang w:val="tr-TR"/>
-        </w:rPr>
-        <w:t>recommendations()</w:t>
+        <w:t>───────────┐</w:t>
+      </w:r>
+    </w:p>
+    <w:p>
+      <w:pPr>
+        <w:spacing w:after="0" w:line="240" w:lineRule="auto"/>
+        <w:jc w:val="center"/>
+        <w:rPr>
+          <w:noProof/>
+          <w:sz w:val="24"/>
+          <w:szCs w:val="24"/>
+          <w:lang w:val="tr-TR"/>
+        </w:rPr>
+      </w:pPr>
+      <w:r>
+        <w:rPr>
+          <w:noProof/>
+          <w:sz w:val="24"/>
+          <w:szCs w:val="24"/>
+          <w:lang w:val="tr-TR"/>
+        </w:rPr>
+        <w:t xml:space="preserve">          </w:t>
+      </w:r>
+      <w:r>
+        <w:rPr>
+          <w:rFonts w:ascii="Arial" w:hAnsi="Arial" w:cs="Arial"/>
+          <w:noProof/>
+          <w:sz w:val="24"/>
+          <w:szCs w:val="24"/>
+          <w:lang w:val="tr-TR"/>
+        </w:rPr>
+        <w:t>▼</w:t>
+      </w:r>
+      <w:r>
+        <w:rPr>
+          <w:noProof/>
+          <w:sz w:val="24"/>
+          <w:szCs w:val="24"/>
+          <w:lang w:val="tr-TR"/>
+        </w:rPr>
+        <w:t xml:space="preserve">           </w:t>
+      </w:r>
+      <w:r>
+        <w:rPr>
+          <w:rFonts w:ascii="Arial" w:hAnsi="Arial" w:cs="Arial"/>
+          <w:noProof/>
+          <w:sz w:val="24"/>
+          <w:szCs w:val="24"/>
+          <w:lang w:val="tr-TR"/>
+        </w:rPr>
+        <w:t>▼</w:t>
+      </w:r>
+      <w:r>
+        <w:rPr>
+          <w:noProof/>
+          <w:sz w:val="24"/>
+          <w:szCs w:val="24"/>
+          <w:lang w:val="tr-TR"/>
+        </w:rPr>
+        <w:t xml:space="preserve">           </w:t>
+      </w:r>
+      <w:r>
+        <w:rPr>
+          <w:rFonts w:ascii="Arial" w:hAnsi="Arial" w:cs="Arial"/>
+          <w:noProof/>
+          <w:sz w:val="24"/>
+          <w:szCs w:val="24"/>
+          <w:lang w:val="tr-TR"/>
+        </w:rPr>
+        <w:t>▼</w:t>
+      </w:r>
+    </w:p>
+    <w:p>
+      <w:pPr>
+        <w:spacing w:after="0" w:line="240" w:lineRule="auto"/>
+        <w:jc w:val="center"/>
+        <w:rPr>
+          <w:noProof/>
+          <w:sz w:val="24"/>
+          <w:szCs w:val="24"/>
+          <w:lang w:val="tr-TR"/>
+        </w:rPr>
+      </w:pPr>
+      <w:r>
+        <w:rPr>
+          <w:noProof/>
+          <w:sz w:val="24"/>
+          <w:szCs w:val="24"/>
+          <w:lang w:val="tr-TR"/>
+        </w:rPr>
+        <w:t xml:space="preserve">     forecast.json evaluation  diagnostics</w:t>
+      </w:r>
+    </w:p>
+    <w:p>
+      <w:pPr>
+        <w:spacing w:after="0" w:line="240" w:lineRule="auto"/>
+        <w:jc w:val="center"/>
+        <w:rPr>
+          <w:noProof/>
+          <w:sz w:val="24"/>
+          <w:szCs w:val="24"/>
+          <w:lang w:val="tr-TR"/>
+        </w:rPr>
+      </w:pPr>
+      <w:r>
+        <w:rPr>
+          <w:noProof/>
+          <w:sz w:val="24"/>
+          <w:szCs w:val="24"/>
+          <w:lang w:val="tr-TR"/>
+        </w:rPr>
+        <w:t xml:space="preserve">          │           │           │</w:t>
+      </w:r>
+    </w:p>
+    <w:p>
+      <w:pPr>
+        <w:spacing w:after="0" w:line="240" w:lineRule="auto"/>
+        <w:jc w:val="center"/>
+        <w:rPr>
+          <w:noProof/>
+          <w:sz w:val="24"/>
+          <w:szCs w:val="24"/>
+          <w:lang w:val="tr-TR"/>
+        </w:rPr>
+      </w:pPr>
+      <w:r>
+        <w:rPr>
+          <w:noProof/>
+          <w:sz w:val="24"/>
+          <w:szCs w:val="24"/>
+          <w:lang w:val="tr-TR"/>
+        </w:rPr>
+        <w:t xml:space="preserve">          └───────────</w:t>
+      </w:r>
+      <w:r>
+        <w:rPr>
+          <w:rFonts w:ascii="MS Gothic" w:eastAsia="MS Gothic" w:hAnsi="MS Gothic" w:cs="MS Gothic" w:hint="eastAsia"/>
+          <w:noProof/>
+          <w:sz w:val="24"/>
+          <w:szCs w:val="24"/>
+          <w:lang w:val="tr-TR"/>
+        </w:rPr>
+        <w:t>┼</w:t>
+      </w:r>
+      <w:r>
+        <w:rPr>
+          <w:rFonts w:ascii="Calibri" w:hAnsi="Calibri" w:cs="Calibri"/>
+          <w:noProof/>
+          <w:sz w:val="24"/>
+          <w:szCs w:val="24"/>
+          <w:lang w:val="tr-TR"/>
+        </w:rPr>
+        <w:t>───────────┘</w:t>
+      </w:r>
+    </w:p>
+    <w:p>
+      <w:pPr>
+        <w:spacing w:after="0" w:line="240" w:lineRule="auto"/>
+        <w:jc w:val="center"/>
+        <w:rPr>
+          <w:noProof/>
+          <w:sz w:val="24"/>
+          <w:szCs w:val="24"/>
+          <w:lang w:val="tr-TR"/>
+        </w:rPr>
+      </w:pPr>
+      <w:r>
+        <w:rPr>
+          <w:noProof/>
+          <w:sz w:val="24"/>
+          <w:szCs w:val="24"/>
+          <w:lang w:val="tr-TR"/>
+        </w:rPr>
+        <w:t xml:space="preserve">                      </w:t>
+      </w:r>
+      <w:r>
+        <w:rPr>
+          <w:rFonts w:ascii="Arial" w:hAnsi="Arial" w:cs="Arial"/>
+          <w:noProof/>
+          <w:sz w:val="24"/>
+          <w:szCs w:val="24"/>
+          <w:lang w:val="tr-TR"/>
+        </w:rPr>
+        <w:t>▼</w:t>
+      </w:r>
+    </w:p>
+    <w:p>
+      <w:pPr>
+        <w:spacing w:after="0" w:line="240" w:lineRule="auto"/>
+        <w:jc w:val="center"/>
+        <w:rPr>
+          <w:noProof/>
+          <w:sz w:val="24"/>
+          <w:szCs w:val="24"/>
+          <w:lang w:val="tr-TR"/>
+        </w:rPr>
+      </w:pPr>
+      <w:r>
+        <w:rPr>
+          <w:noProof/>
+          <w:sz w:val="24"/>
+          <w:szCs w:val="24"/>
+          <w:lang w:val="tr-TR"/>
+        </w:rPr>
+        <w:t xml:space="preserve">             ForecastComparison</w:t>
+      </w:r>
+    </w:p>
+    <w:p>
+      <w:pPr>
+        <w:spacing w:after="0" w:line="240" w:lineRule="auto"/>
+        <w:jc w:val="center"/>
+        <w:rPr>
+          <w:noProof/>
+          <w:sz w:val="24"/>
+          <w:szCs w:val="24"/>
+          <w:lang w:val="tr-TR"/>
+        </w:rPr>
+      </w:pPr>
+      <w:r>
+        <w:rPr>
+          <w:noProof/>
+          <w:sz w:val="24"/>
+          <w:szCs w:val="24"/>
+          <w:lang w:val="tr-TR"/>
+        </w:rPr>
+        <w:t xml:space="preserve">                      │</w:t>
+      </w:r>
+    </w:p>
+    <w:p>
+      <w:pPr>
+        <w:spacing w:after="0" w:line="240" w:lineRule="auto"/>
+        <w:jc w:val="center"/>
+        <w:rPr>
+          <w:noProof/>
+          <w:sz w:val="24"/>
+          <w:szCs w:val="24"/>
+          <w:lang w:val="tr-TR"/>
+        </w:rPr>
+      </w:pPr>
+      <w:r>
+        <w:rPr>
+          <w:noProof/>
+          <w:sz w:val="24"/>
+          <w:szCs w:val="24"/>
+          <w:lang w:val="tr-TR"/>
+        </w:rPr>
+        <w:t xml:space="preserve">          ┌───────────</w:t>
+      </w:r>
+      <w:r>
+        <w:rPr>
+          <w:rFonts w:ascii="MS Gothic" w:eastAsia="MS Gothic" w:hAnsi="MS Gothic" w:cs="MS Gothic" w:hint="eastAsia"/>
+          <w:noProof/>
+          <w:sz w:val="24"/>
+          <w:szCs w:val="24"/>
+          <w:lang w:val="tr-TR"/>
+        </w:rPr>
+        <w:t>┼</w:t>
+      </w:r>
+      <w:r>
+        <w:rPr>
+          <w:rFonts w:ascii="Calibri" w:hAnsi="Calibri" w:cs="Calibri"/>
+          <w:noProof/>
+          <w:sz w:val="24"/>
+          <w:szCs w:val="24"/>
+          <w:lang w:val="tr-TR"/>
+        </w:rPr>
+        <w:t>───────────┐</w:t>
+      </w:r>
+    </w:p>
+    <w:p>
+      <w:pPr>
+        <w:spacing w:after="0" w:line="240" w:lineRule="auto"/>
+        <w:jc w:val="center"/>
+        <w:rPr>
+          <w:noProof/>
+          <w:sz w:val="24"/>
+          <w:szCs w:val="24"/>
+          <w:lang w:val="tr-TR"/>
+        </w:rPr>
+      </w:pPr>
+      <w:r>
+        <w:rPr>
+          <w:noProof/>
+          <w:sz w:val="24"/>
+          <w:szCs w:val="24"/>
+          <w:lang w:val="tr-TR"/>
+        </w:rPr>
+        <w:t xml:space="preserve">          </w:t>
+      </w:r>
+      <w:r>
+        <w:rPr>
+          <w:rFonts w:ascii="Arial" w:hAnsi="Arial" w:cs="Arial"/>
+          <w:noProof/>
+          <w:sz w:val="24"/>
+          <w:szCs w:val="24"/>
+          <w:lang w:val="tr-TR"/>
+        </w:rPr>
+        <w:t>▼</w:t>
+      </w:r>
+      <w:r>
+        <w:rPr>
+          <w:noProof/>
+          <w:sz w:val="24"/>
+          <w:szCs w:val="24"/>
+          <w:lang w:val="tr-TR"/>
+        </w:rPr>
+        <w:t xml:space="preserve">           </w:t>
+      </w:r>
+      <w:r>
+        <w:rPr>
+          <w:rFonts w:ascii="Arial" w:hAnsi="Arial" w:cs="Arial"/>
+          <w:noProof/>
+          <w:sz w:val="24"/>
+          <w:szCs w:val="24"/>
+          <w:lang w:val="tr-TR"/>
+        </w:rPr>
+        <w:t>▼</w:t>
+      </w:r>
+      <w:r>
+        <w:rPr>
+          <w:noProof/>
+          <w:sz w:val="24"/>
+          <w:szCs w:val="24"/>
+          <w:lang w:val="tr-TR"/>
+        </w:rPr>
+        <w:t xml:space="preserve">           </w:t>
+      </w:r>
+      <w:r>
+        <w:rPr>
+          <w:rFonts w:ascii="Arial" w:hAnsi="Arial" w:cs="Arial"/>
+          <w:noProof/>
+          <w:sz w:val="24"/>
+          <w:szCs w:val="24"/>
+          <w:lang w:val="tr-TR"/>
+        </w:rPr>
+        <w:t>▼</w:t>
+      </w:r>
+    </w:p>
+    <w:p>
+      <w:pPr>
+        <w:spacing w:after="0" w:line="240" w:lineRule="auto"/>
+        <w:jc w:val="center"/>
+        <w:rPr>
+          <w:noProof/>
+          <w:sz w:val="24"/>
+          <w:szCs w:val="24"/>
+          <w:lang w:val="tr-TR"/>
+        </w:rPr>
+      </w:pPr>
+      <w:r>
+        <w:rPr>
+          <w:noProof/>
+          <w:sz w:val="24"/>
+          <w:szCs w:val="24"/>
+          <w:lang w:val="tr-TR"/>
+        </w:rPr>
+        <w:t xml:space="preserve">       Ranking     Stability   Hybrid vs</w:t>
+      </w:r>
+    </w:p>
+    <w:p>
+      <w:pPr>
+        <w:spacing w:after="0" w:line="240" w:lineRule="auto"/>
+        <w:jc w:val="center"/>
+        <w:rPr>
+          <w:noProof/>
+          <w:sz w:val="24"/>
+          <w:szCs w:val="24"/>
+          <w:lang w:val="tr-TR"/>
+        </w:rPr>
+      </w:pPr>
+      <w:r>
+        <w:rPr>
+          <w:noProof/>
+          <w:sz w:val="24"/>
+          <w:szCs w:val="24"/>
+          <w:lang w:val="tr-TR"/>
+        </w:rPr>
+        <w:t xml:space="preserve">                              Individual</w:t>
+      </w:r>
+    </w:p>
+    <w:p>
+      <w:pPr>
+        <w:spacing w:after="0" w:line="240" w:lineRule="auto"/>
+        <w:jc w:val="center"/>
+        <w:rPr>
+          <w:noProof/>
+          <w:sz w:val="24"/>
+          <w:szCs w:val="24"/>
+          <w:lang w:val="tr-TR"/>
+        </w:rPr>
+      </w:pPr>
+      <w:r>
+        <w:rPr>
+          <w:noProof/>
+          <w:sz w:val="24"/>
+          <w:szCs w:val="24"/>
+          <w:lang w:val="tr-TR"/>
+        </w:rPr>
+        <w:t xml:space="preserve">                      │</w:t>
+      </w:r>
+    </w:p>
+    <w:p>
+      <w:pPr>
+        <w:spacing w:after="0" w:line="240" w:lineRule="auto"/>
+        <w:jc w:val="center"/>
+        <w:rPr>
+          <w:noProof/>
+          <w:sz w:val="24"/>
+          <w:szCs w:val="24"/>
+          <w:lang w:val="tr-TR"/>
+        </w:rPr>
+      </w:pPr>
+      <w:r>
+        <w:rPr>
+          <w:noProof/>
+          <w:sz w:val="24"/>
+          <w:szCs w:val="24"/>
+          <w:lang w:val="tr-TR"/>
+        </w:rPr>
+        <w:t xml:space="preserve">                      </w:t>
+      </w:r>
+      <w:r>
+        <w:rPr>
+          <w:rFonts w:ascii="Arial" w:hAnsi="Arial" w:cs="Arial"/>
+          <w:noProof/>
+          <w:sz w:val="24"/>
+          <w:szCs w:val="24"/>
+          <w:lang w:val="tr-TR"/>
+        </w:rPr>
+        <w:t>▼</w:t>
+      </w:r>
+    </w:p>
+    <w:p>
+      <w:pPr>
+        <w:spacing w:after="0" w:line="240" w:lineRule="auto"/>
+        <w:jc w:val="center"/>
+        <w:rPr>
+          <w:noProof/>
+          <w:sz w:val="24"/>
+          <w:szCs w:val="24"/>
+          <w:lang w:val="tr-TR"/>
+        </w:rPr>
+      </w:pPr>
+      <w:r>
+        <w:rPr>
+          <w:noProof/>
+          <w:sz w:val="24"/>
+          <w:szCs w:val="24"/>
+          <w:lang w:val="tr-TR"/>
+        </w:rPr>
+        <w:t xml:space="preserve">             Comparative Report</w:t>
+      </w:r>
+    </w:p>
+    <w:p>
+      <w:pPr>
+        <w:spacing w:after="0" w:line="240" w:lineRule="auto"/>
+        <w:jc w:val="center"/>
+        <w:rPr>
+          <w:noProof/>
+          <w:sz w:val="24"/>
+          <w:szCs w:val="24"/>
+          <w:lang w:val="tr-TR"/>
+        </w:rPr>
+      </w:pPr>
+      <w:r>
+        <w:rPr>
+          <w:noProof/>
+          <w:sz w:val="24"/>
+          <w:szCs w:val="24"/>
+          <w:lang w:val="tr-TR"/>
+        </w:rPr>
+        <w:t xml:space="preserve">                      │</w:t>
+      </w:r>
+    </w:p>
+    <w:p>
+      <w:pPr>
+        <w:spacing w:after="0" w:line="240" w:lineRule="auto"/>
+        <w:jc w:val="center"/>
+        <w:rPr>
+          <w:noProof/>
+          <w:sz w:val="24"/>
+          <w:szCs w:val="24"/>
+          <w:lang w:val="tr-TR"/>
+        </w:rPr>
+      </w:pPr>
+      <w:r>
+        <w:rPr>
+          <w:noProof/>
+          <w:sz w:val="24"/>
+          <w:szCs w:val="24"/>
+          <w:lang w:val="tr-TR"/>
+        </w:rPr>
+        <w:t xml:space="preserve">                      </w:t>
+      </w:r>
+      <w:r>
+        <w:rPr>
+          <w:rFonts w:ascii="Arial" w:hAnsi="Arial" w:cs="Arial"/>
+          <w:noProof/>
+          <w:sz w:val="24"/>
+          <w:szCs w:val="24"/>
+          <w:lang w:val="tr-TR"/>
+        </w:rPr>
+        <w:t>▼</w:t>
+      </w:r>
+    </w:p>
+    <w:p>
+      <w:pPr>
+        <w:spacing w:after="0" w:line="240" w:lineRule="auto"/>
+        <w:jc w:val="center"/>
+        <w:rPr>
+          <w:noProof/>
+          <w:sz w:val="24"/>
+          <w:szCs w:val="24"/>
+          <w:lang w:val="tr-TR"/>
+        </w:rPr>
+      </w:pPr>
+      <w:r>
+        <w:rPr>
+          <w:noProof/>
+          <w:sz w:val="24"/>
+          <w:szCs w:val="24"/>
+          <w:lang w:val="tr-TR"/>
+        </w:rPr>
+        <w:t xml:space="preserve">             Comparative Plot</w:t>
+      </w:r>
+    </w:p>
+    <w:p>
+      <w:pPr>
+        <w:spacing w:after="0" w:line="240" w:lineRule="auto"/>
+        <w:jc w:val="center"/>
+        <w:rPr>
+          <w:noProof/>
+          <w:sz w:val="24"/>
+          <w:szCs w:val="24"/>
+          <w:lang w:val="tr-TR"/>
+        </w:rPr>
+      </w:pPr>
+    </w:p>
+    <w:p>
+      <w:pPr>
+        <w:spacing w:after="0" w:line="240" w:lineRule="auto"/>
+        <w:rPr>
+          <w:noProof/>
+          <w:sz w:val="24"/>
+          <w:szCs w:val="24"/>
+          <w:lang w:val="tr-TR"/>
+        </w:rPr>
+      </w:pPr>
+    </w:p>
+    <w:p>
+      <w:pPr>
+        <w:spacing w:after="0" w:line="240" w:lineRule="auto"/>
+        <w:rPr>
+          <w:noProof/>
+          <w:sz w:val="24"/>
+          <w:szCs w:val="24"/>
+          <w:lang w:val="tr-TR"/>
+        </w:rPr>
+      </w:pPr>
+    </w:p>
+    <w:p>
+      <w:pPr>
+        <w:spacing w:after="0" w:line="240" w:lineRule="auto"/>
+        <w:rPr>
+          <w:noProof/>
+          <w:sz w:val="24"/>
+          <w:szCs w:val="24"/>
+          <w:lang w:val="tr-TR"/>
+        </w:rPr>
+      </w:pPr>
+      <w:r>
+        <w:rPr>
+          <w:noProof/>
+          <w:sz w:val="24"/>
+          <w:szCs w:val="24"/>
+        </w:rPr>
+        <w:t>The registry's experiment ID is the true logical identity, while the directory name is the physical artifact location</w:t>
+      </w:r>
+      <w:r>
+        <w:rPr>
+          <w:noProof/>
+          <w:sz w:val="24"/>
+          <w:szCs w:val="24"/>
+        </w:rPr>
+        <w:t>:</w:t>
+      </w:r>
+    </w:p>
+    <w:p>
+      <w:pPr>
+        <w:spacing w:after="0" w:line="240" w:lineRule="auto"/>
+        <w:rPr>
+          <w:noProof/>
+          <w:sz w:val="24"/>
+          <w:szCs w:val="24"/>
+          <w:lang w:val="tr-TR"/>
+        </w:rPr>
+      </w:pPr>
+    </w:p>
+    <w:p>
+      <w:pPr>
+        <w:spacing w:after="0" w:line="240" w:lineRule="auto"/>
+        <w:rPr>
+          <w:b/>
+          <w:bCs/>
+          <w:noProof/>
+          <w:sz w:val="24"/>
+          <w:szCs w:val="24"/>
+          <w:lang w:val="tr-TR"/>
+        </w:rPr>
+      </w:pPr>
+      <w:r>
+        <w:rPr>
+          <w:b/>
+          <w:bCs/>
+          <w:noProof/>
+          <w:sz w:val="24"/>
+          <w:szCs w:val="24"/>
+          <w:lang w:val="tr-TR"/>
+        </w:rPr>
+        <w:t>Experiment ID</w:t>
+      </w:r>
+    </w:p>
+    <w:p>
+      <w:pPr>
+        <w:spacing w:after="0" w:line="240" w:lineRule="auto"/>
+        <w:rPr>
+          <w:noProof/>
+          <w:sz w:val="24"/>
+          <w:szCs w:val="24"/>
+          <w:lang w:val="tr-TR"/>
+        </w:rPr>
+      </w:pPr>
+      <w:r>
+        <w:rPr>
+          <w:noProof/>
+          <w:sz w:val="24"/>
+          <w:szCs w:val="24"/>
+          <w:lang w:val="tr-TR"/>
+        </w:rPr>
+        <w:t xml:space="preserve">     │</w:t>
+      </w:r>
+    </w:p>
+    <w:p>
+      <w:pPr>
+        <w:spacing w:after="0" w:line="240" w:lineRule="auto"/>
+        <w:rPr>
+          <w:noProof/>
+          <w:sz w:val="24"/>
+          <w:szCs w:val="24"/>
+          <w:lang w:val="tr-TR"/>
+        </w:rPr>
+      </w:pPr>
+      <w:r>
+        <w:rPr>
+          <w:noProof/>
+          <w:sz w:val="24"/>
+          <w:szCs w:val="24"/>
+          <w:lang w:val="tr-TR"/>
+        </w:rPr>
+        <w:t xml:space="preserve">     └── 127</w:t>
+      </w:r>
+    </w:p>
+    <w:p>
+      <w:pPr>
+        <w:spacing w:after="0" w:line="240" w:lineRule="auto"/>
+        <w:rPr>
+          <w:noProof/>
+          <w:sz w:val="24"/>
+          <w:szCs w:val="24"/>
+          <w:lang w:val="tr-TR"/>
+        </w:rPr>
+      </w:pPr>
+      <w:r>
+        <w:rPr>
+          <w:noProof/>
+          <w:sz w:val="24"/>
+          <w:szCs w:val="24"/>
+          <w:lang w:val="tr-TR"/>
+        </w:rPr>
+        <w:t xml:space="preserve">          │</w:t>
+      </w:r>
+    </w:p>
+    <w:p>
+      <w:pPr>
+        <w:spacing w:after="0" w:line="240" w:lineRule="auto"/>
+        <w:rPr>
+          <w:noProof/>
+          <w:sz w:val="24"/>
+          <w:szCs w:val="24"/>
+          <w:lang w:val="tr-TR"/>
+        </w:rPr>
+      </w:pPr>
+      <w:r>
+        <w:rPr>
+          <w:noProof/>
+          <w:sz w:val="24"/>
+          <w:szCs w:val="24"/>
+          <w:lang w:val="tr-TR"/>
+        </w:rPr>
+        <w:t xml:space="preserve">          └── </w:t>
+      </w:r>
+      <w:r>
+        <w:rPr>
+          <w:b/>
+          <w:bCs/>
+          <w:noProof/>
+          <w:sz w:val="24"/>
+          <w:szCs w:val="24"/>
+          <w:lang w:val="tr-TR"/>
+        </w:rPr>
+        <w:t>results</w:t>
+      </w:r>
+      <w:r>
+        <w:rPr>
+          <w:noProof/>
+          <w:sz w:val="24"/>
+          <w:szCs w:val="24"/>
+          <w:lang w:val="tr-TR"/>
+        </w:rPr>
+        <w:t>/</w:t>
+      </w:r>
+    </w:p>
+    <w:p>
+      <w:pPr>
+        <w:spacing w:after="0" w:line="240" w:lineRule="auto"/>
+        <w:rPr>
+          <w:noProof/>
+          <w:sz w:val="24"/>
+          <w:szCs w:val="24"/>
+          <w:lang w:val="tr-TR"/>
+        </w:rPr>
+      </w:pPr>
+      <w:r>
+        <w:rPr>
+          <w:noProof/>
+          <w:sz w:val="24"/>
+          <w:szCs w:val="24"/>
+          <w:lang w:val="tr-TR"/>
+        </w:rPr>
+        <w:t xml:space="preserve">              └── 732B-5610110/</w:t>
+      </w:r>
+    </w:p>
+    <w:p>
+      <w:pPr>
+        <w:spacing w:after="0" w:line="240" w:lineRule="auto"/>
+        <w:rPr>
+          <w:noProof/>
+          <w:sz w:val="24"/>
+          <w:szCs w:val="24"/>
+          <w:lang w:val="tr-TR"/>
+        </w:rPr>
+      </w:pPr>
+      <w:r>
+        <w:rPr>
+          <w:noProof/>
+          <w:sz w:val="24"/>
+          <w:szCs w:val="24"/>
+          <w:lang w:val="tr-TR"/>
+        </w:rPr>
+        <w:t xml:space="preserve">                  └── KalmanLSTM/</w:t>
+      </w:r>
+    </w:p>
+    <w:p>
+      <w:pPr>
+        <w:spacing w:after="0" w:line="240" w:lineRule="auto"/>
+        <w:rPr>
+          <w:noProof/>
+          <w:sz w:val="24"/>
+          <w:szCs w:val="24"/>
+          <w:lang w:val="tr-TR"/>
+        </w:rPr>
+      </w:pPr>
+      <w:r>
+        <w:rPr>
+          <w:noProof/>
+          <w:sz w:val="24"/>
+          <w:szCs w:val="24"/>
+          <w:lang w:val="tr-TR"/>
+        </w:rPr>
+        <w:t xml:space="preserve">                      └── 20260813_150244_773043/</w:t>
       </w:r>
     </w:p>
     <w:sectPr>
@@ -28685,6 +29802,7 @@
   <w:style w:type="character" w:default="1" w:styleId="VarsaylanParagrafYazTipi">
     <w:name w:val="Default Paragraph Font"/>
     <w:uiPriority w:val="1"/>
+    <w:semiHidden/>
     <w:unhideWhenUsed/>
   </w:style>
   <w:style w:type="table" w:default="1" w:styleId="NormalTablo">

</xml_diff>

<commit_message>
feat(data): add processed dataset consumption layer
</commit_message>
<xml_diff>
--- a/docs/draft/development_flow.docx
+++ b/docs/draft/development_flow.docx
@@ -1,6 +1,6 @@
 
 <file path=word/document.xml><?xml version="1.0" encoding="utf-8"?>
-<w:document xmlns:wpc="http://schemas.microsoft.com/office/word/2010/wordprocessingCanvas" xmlns:cx="http://schemas.microsoft.com/office/drawing/2014/chartex" xmlns:cx1="http://schemas.microsoft.com/office/drawing/2015/9/8/chartex" xmlns:cx2="http://schemas.microsoft.com/office/drawing/2015/10/21/chartex" xmlns:cx3="http://schemas.microsoft.com/office/drawing/2016/5/9/chartex" xmlns:cx4="http://schemas.microsoft.com/office/drawing/2016/5/10/chartex" xmlns:cx5="http://schemas.microsoft.com/office/drawing/2016/5/11/chartex" xmlns:cx6="http://schemas.microsoft.com/office/drawing/2016/5/12/chartex" xmlns:cx7="http://schemas.microsoft.com/office/drawing/2016/5/13/chartex" xmlns:cx8="http://schemas.microsoft.com/office/drawing/2016/5/14/chartex" xmlns:mc="http://schemas.openxmlformats.org/markup-compatibility/2006" xmlns:aink="http://schemas.microsoft.com/office/drawing/2016/ink" xmlns:am3d="http://schemas.microsoft.com/office/drawing/2017/model3d" xmlns:o="urn:schemas-microsoft-com:office:office" xmlns:oel="http://schemas.microsoft.com/office/2019/extlst" xmlns:r="http://schemas.openxmlformats.org/officeDocument/2006/relationships" xmlns:m="http://schemas.openxmlformats.org/officeDocument/2006/math" xmlns:v="urn:schemas-microsoft-com:vml" xmlns:wp14="http://schemas.microsoft.com/office/word/2010/wordprocessingDrawing" xmlns:wp="http://schemas.openxmlformats.org/drawingml/2006/wordprocessingDrawing" xmlns:w10="urn:schemas-microsoft-com:office:word" xmlns:w="http://schemas.openxmlformats.org/wordprocessingml/2006/main" xmlns:w14="http://schemas.microsoft.com/office/word/2010/wordml" xmlns:w15="http://schemas.microsoft.com/office/word/2012/wordml" xmlns:w16cei="http://schemas.microsoft.com/office/word/2026/wordml/cei" xmlns:w16cex="http://schemas.microsoft.com/office/word/2018/wordml/cex" xmlns:w16cid="http://schemas.microsoft.com/office/word/2016/wordml/cid" xmlns:w16="http://schemas.microsoft.com/office/word/2018/wordml" xmlns:w16du="http://schemas.microsoft.com/office/word/2023/wordml/word16du" xmlns:w16sdtdh="http://schemas.microsoft.com/office/word/2020/wordml/sdtdatahash" xmlns:w16sdtfl="http://schemas.microsoft.com/office/word/2024/wordml/sdtformatlock" xmlns:w16se="http://schemas.microsoft.com/office/word/2015/wordml/symex" xmlns:wpg="http://schemas.microsoft.com/office/word/2010/wordprocessingGroup" xmlns:wpi="http://schemas.microsoft.com/office/word/2010/wordprocessingInk" xmlns:wne="http://schemas.microsoft.com/office/word/2006/wordml" xmlns:wps="http://schemas.microsoft.com/office/word/2010/wordprocessingShape" mc:Ignorable="w14 w15 w16se w16cid w16 w16cex w16sdtdh w16sdtfl w16du wp14">
+<w:document xmlns:wpc="http://schemas.microsoft.com/office/word/2010/wordprocessingCanvas" xmlns:cx="http://schemas.microsoft.com/office/drawing/2014/chartex" xmlns:cx1="http://schemas.microsoft.com/office/drawing/2015/9/8/chartex" xmlns:cx2="http://schemas.microsoft.com/office/drawing/2015/10/21/chartex" xmlns:cx3="http://schemas.microsoft.com/office/drawing/2016/5/9/chartex" xmlns:cx4="http://schemas.microsoft.com/office/drawing/2016/5/10/chartex" xmlns:cx5="http://schemas.microsoft.com/office/drawing/2016/5/11/chartex" xmlns:cx6="http://schemas.microsoft.com/office/drawing/2016/5/12/chartex" xmlns:cx7="http://schemas.microsoft.com/office/drawing/2016/5/13/chartex" xmlns:cx8="http://schemas.microsoft.com/office/drawing/2016/5/14/chartex" xmlns:mc="http://schemas.openxmlformats.org/markup-compatibility/2006" xmlns:aink="http://schemas.microsoft.com/office/drawing/2016/ink" xmlns:am3d="http://schemas.microsoft.com/office/drawing/2017/model3d" xmlns:o="urn:schemas-microsoft-com:office:office" xmlns:oel="http://schemas.microsoft.com/office/2019/extlst" xmlns:r="http://schemas.openxmlformats.org/officeDocument/2006/relationships" xmlns:m="http://schemas.openxmlformats.org/officeDocument/2006/math" xmlns:v="urn:schemas-microsoft-com:vml" xmlns:wp14="http://schemas.microsoft.com/office/word/2010/wordprocessingDrawing" xmlns:wp="http://schemas.openxmlformats.org/drawingml/2006/wordprocessingDrawing" xmlns:w10="urn:schemas-microsoft-com:office:word" xmlns:w="http://schemas.openxmlformats.org/wordprocessingml/2006/main" xmlns:w14="http://schemas.microsoft.com/office/word/2010/wordml" xmlns:w15="http://schemas.microsoft.com/office/word/2012/wordml" xmlns:w16cex="http://schemas.microsoft.com/office/word/2018/wordml/cex" xmlns:w16cid="http://schemas.microsoft.com/office/word/2016/wordml/cid" xmlns:w16="http://schemas.microsoft.com/office/word/2018/wordml" xmlns:w16du="http://schemas.microsoft.com/office/word/2023/wordml/word16du" xmlns:w16sdtdh="http://schemas.microsoft.com/office/word/2020/wordml/sdtdatahash" xmlns:w16sdtfl="http://schemas.microsoft.com/office/word/2024/wordml/sdtformatlock" xmlns:w16se="http://schemas.microsoft.com/office/word/2015/wordml/symex" xmlns:wpg="http://schemas.microsoft.com/office/word/2010/wordprocessingGroup" xmlns:wpi="http://schemas.microsoft.com/office/word/2010/wordprocessingInk" xmlns:wne="http://schemas.microsoft.com/office/word/2006/wordml" xmlns:wps="http://schemas.microsoft.com/office/word/2010/wordprocessingShape" mc:Ignorable="w14 w15 w16se w16cid w16 w16cex w16sdtdh w16sdtfl w16du wp14">
   <w:body>
     <w:p>
       <w:pPr>
@@ -25507,6 +25507,579 @@
         <w:t xml:space="preserve">                      └── 20260813_150244_773043/</w:t>
       </w:r>
     </w:p>
+    <w:p>
+      <w:pPr>
+        <w:spacing w:after="0" w:line="240" w:lineRule="auto"/>
+        <w:rPr>
+          <w:noProof/>
+          <w:sz w:val="24"/>
+          <w:szCs w:val="24"/>
+          <w:lang w:val="tr-TR"/>
+        </w:rPr>
+      </w:pPr>
+    </w:p>
+    <w:p>
+      <w:pPr>
+        <w:rPr>
+          <w:noProof/>
+          <w:sz w:val="24"/>
+          <w:szCs w:val="24"/>
+          <w:lang w:val="tr-TR"/>
+        </w:rPr>
+      </w:pPr>
+      <w:r>
+        <w:rPr>
+          <w:noProof/>
+          <w:sz w:val="24"/>
+          <w:szCs w:val="24"/>
+          <w:lang w:val="tr-TR"/>
+        </w:rPr>
+        <w:br w:type="page"/>
+      </w:r>
+    </w:p>
+    <w:p>
+      <w:pPr>
+        <w:spacing w:after="0" w:line="240" w:lineRule="auto"/>
+        <w:rPr>
+          <w:b/>
+          <w:bCs/>
+          <w:noProof/>
+          <w:sz w:val="32"/>
+          <w:szCs w:val="32"/>
+          <w:lang w:val="tr-TR"/>
+        </w:rPr>
+      </w:pPr>
+      <w:r>
+        <w:rPr>
+          <w:b/>
+          <w:bCs/>
+          <w:noProof/>
+          <w:sz w:val="32"/>
+          <w:szCs w:val="32"/>
+          <w:lang w:val="tr-TR"/>
+        </w:rPr>
+        <w:lastRenderedPageBreak/>
+        <w:t>Processed dataset = structural/canonical preparation. Train-fitted transformations = evaluation/model pipeline.</w:t>
+      </w:r>
+    </w:p>
+    <w:p>
+      <w:pPr>
+        <w:spacing w:after="0" w:line="240" w:lineRule="auto"/>
+        <w:rPr>
+          <w:noProof/>
+          <w:sz w:val="24"/>
+          <w:szCs w:val="24"/>
+          <w:lang w:val="tr-TR"/>
+        </w:rPr>
+      </w:pPr>
+    </w:p>
+    <w:p>
+      <w:pPr>
+        <w:spacing w:after="0" w:line="240" w:lineRule="auto"/>
+        <w:rPr>
+          <w:noProof/>
+          <w:sz w:val="24"/>
+          <w:szCs w:val="24"/>
+          <w:lang w:val="tr-TR"/>
+        </w:rPr>
+      </w:pPr>
+      <w:r>
+        <w:rPr>
+          <w:noProof/>
+          <w:sz w:val="24"/>
+          <w:szCs w:val="24"/>
+          <w:lang w:val="tr-TR"/>
+        </w:rPr>
+        <w:t>That means ForecastEvaluator should continue to make the holdout split before anything that learns parameters from values.</w:t>
+      </w:r>
+    </w:p>
+    <w:p>
+      <w:pPr>
+        <w:spacing w:after="0" w:line="240" w:lineRule="auto"/>
+        <w:rPr>
+          <w:noProof/>
+          <w:sz w:val="24"/>
+          <w:szCs w:val="24"/>
+          <w:lang w:val="tr-TR"/>
+        </w:rPr>
+      </w:pPr>
+    </w:p>
+    <w:p>
+      <w:pPr>
+        <w:spacing w:after="0" w:line="240" w:lineRule="auto"/>
+        <w:rPr>
+          <w:b/>
+          <w:bCs/>
+          <w:noProof/>
+          <w:sz w:val="24"/>
+          <w:szCs w:val="24"/>
+          <w:lang w:val="tr-TR"/>
+        </w:rPr>
+      </w:pPr>
+      <w:r>
+        <w:rPr>
+          <w:b/>
+          <w:bCs/>
+          <w:noProof/>
+          <w:sz w:val="24"/>
+          <w:szCs w:val="24"/>
+          <w:lang w:val="tr-TR"/>
+        </w:rPr>
+        <w:t>processed dataset</w:t>
+      </w:r>
+    </w:p>
+    <w:p>
+      <w:pPr>
+        <w:spacing w:after="0" w:line="240" w:lineRule="auto"/>
+        <w:rPr>
+          <w:noProof/>
+          <w:sz w:val="24"/>
+          <w:szCs w:val="24"/>
+          <w:lang w:val="tr-TR"/>
+        </w:rPr>
+      </w:pPr>
+      <w:r>
+        <w:rPr>
+          <w:noProof/>
+          <w:sz w:val="24"/>
+          <w:szCs w:val="24"/>
+          <w:lang w:val="tr-TR"/>
+        </w:rPr>
+        <w:t xml:space="preserve">      ↓</w:t>
+      </w:r>
+    </w:p>
+    <w:p>
+      <w:pPr>
+        <w:spacing w:after="0" w:line="240" w:lineRule="auto"/>
+        <w:rPr>
+          <w:noProof/>
+          <w:sz w:val="24"/>
+          <w:szCs w:val="24"/>
+          <w:lang w:val="tr-TR"/>
+        </w:rPr>
+      </w:pPr>
+      <w:r>
+        <w:rPr>
+          <w:noProof/>
+          <w:sz w:val="24"/>
+          <w:szCs w:val="24"/>
+          <w:lang w:val="tr-TR"/>
+        </w:rPr>
+        <w:t>holdout split</w:t>
+      </w:r>
+    </w:p>
+    <w:p>
+      <w:pPr>
+        <w:spacing w:after="0" w:line="240" w:lineRule="auto"/>
+        <w:rPr>
+          <w:noProof/>
+          <w:sz w:val="24"/>
+          <w:szCs w:val="24"/>
+          <w:lang w:val="tr-TR"/>
+        </w:rPr>
+      </w:pPr>
+      <w:r>
+        <w:rPr>
+          <w:noProof/>
+          <w:sz w:val="24"/>
+          <w:szCs w:val="24"/>
+          <w:lang w:val="tr-TR"/>
+        </w:rPr>
+        <w:t xml:space="preserve">      </w:t>
+      </w:r>
+      <w:r>
+        <w:rPr>
+          <w:rFonts w:ascii="MS Gothic" w:eastAsia="MS Gothic" w:hAnsi="MS Gothic" w:cs="MS Gothic" w:hint="eastAsia"/>
+          <w:noProof/>
+          <w:sz w:val="24"/>
+          <w:szCs w:val="24"/>
+          <w:lang w:val="tr-TR"/>
+        </w:rPr>
+        <w:t>├</w:t>
+      </w:r>
+      <w:r>
+        <w:rPr>
+          <w:rFonts w:ascii="Calibri" w:hAnsi="Calibri" w:cs="Calibri"/>
+          <w:noProof/>
+          <w:sz w:val="24"/>
+          <w:szCs w:val="24"/>
+          <w:lang w:val="tr-TR"/>
+        </w:rPr>
+        <w:t>──</w:t>
+      </w:r>
+      <w:r>
+        <w:rPr>
+          <w:noProof/>
+          <w:sz w:val="24"/>
+          <w:szCs w:val="24"/>
+          <w:lang w:val="tr-TR"/>
+        </w:rPr>
+        <w:t xml:space="preserve"> training</w:t>
+      </w:r>
+    </w:p>
+    <w:p>
+      <w:pPr>
+        <w:spacing w:after="0" w:line="240" w:lineRule="auto"/>
+        <w:rPr>
+          <w:noProof/>
+          <w:sz w:val="24"/>
+          <w:szCs w:val="24"/>
+          <w:lang w:val="tr-TR"/>
+        </w:rPr>
+      </w:pPr>
+      <w:r>
+        <w:rPr>
+          <w:noProof/>
+          <w:sz w:val="24"/>
+          <w:szCs w:val="24"/>
+          <w:lang w:val="tr-TR"/>
+        </w:rPr>
+        <w:t xml:space="preserve">      │      ↓</w:t>
+      </w:r>
+    </w:p>
+    <w:p>
+      <w:pPr>
+        <w:spacing w:after="0" w:line="240" w:lineRule="auto"/>
+        <w:rPr>
+          <w:noProof/>
+          <w:sz w:val="24"/>
+          <w:szCs w:val="24"/>
+          <w:lang w:val="tr-TR"/>
+        </w:rPr>
+      </w:pPr>
+      <w:r>
+        <w:rPr>
+          <w:noProof/>
+          <w:sz w:val="24"/>
+          <w:szCs w:val="24"/>
+          <w:lang w:val="tr-TR"/>
+        </w:rPr>
+        <w:t xml:space="preserve">      │   fit scaler</w:t>
+      </w:r>
+    </w:p>
+    <w:p>
+      <w:pPr>
+        <w:spacing w:after="0" w:line="240" w:lineRule="auto"/>
+        <w:rPr>
+          <w:noProof/>
+          <w:sz w:val="24"/>
+          <w:szCs w:val="24"/>
+          <w:lang w:val="tr-TR"/>
+        </w:rPr>
+      </w:pPr>
+      <w:r>
+        <w:rPr>
+          <w:noProof/>
+          <w:sz w:val="24"/>
+          <w:szCs w:val="24"/>
+          <w:lang w:val="tr-TR"/>
+        </w:rPr>
+        <w:t xml:space="preserve">      │      ↓</w:t>
+      </w:r>
+    </w:p>
+    <w:p>
+      <w:pPr>
+        <w:spacing w:after="0" w:line="240" w:lineRule="auto"/>
+        <w:rPr>
+          <w:noProof/>
+          <w:sz w:val="24"/>
+          <w:szCs w:val="24"/>
+          <w:lang w:val="tr-TR"/>
+        </w:rPr>
+      </w:pPr>
+      <w:r>
+        <w:rPr>
+          <w:noProof/>
+          <w:sz w:val="24"/>
+          <w:szCs w:val="24"/>
+          <w:lang w:val="tr-TR"/>
+        </w:rPr>
+        <w:t xml:space="preserve">      │   create windows</w:t>
+      </w:r>
+    </w:p>
+    <w:p>
+      <w:pPr>
+        <w:spacing w:after="0" w:line="240" w:lineRule="auto"/>
+        <w:rPr>
+          <w:noProof/>
+          <w:sz w:val="24"/>
+          <w:szCs w:val="24"/>
+          <w:lang w:val="tr-TR"/>
+        </w:rPr>
+      </w:pPr>
+      <w:r>
+        <w:rPr>
+          <w:noProof/>
+          <w:sz w:val="24"/>
+          <w:szCs w:val="24"/>
+          <w:lang w:val="tr-TR"/>
+        </w:rPr>
+        <w:t xml:space="preserve">      │      ↓</w:t>
+      </w:r>
+    </w:p>
+    <w:p>
+      <w:pPr>
+        <w:spacing w:after="0" w:line="240" w:lineRule="auto"/>
+        <w:rPr>
+          <w:noProof/>
+          <w:sz w:val="24"/>
+          <w:szCs w:val="24"/>
+          <w:lang w:val="tr-TR"/>
+        </w:rPr>
+      </w:pPr>
+      <w:r>
+        <w:rPr>
+          <w:noProof/>
+          <w:sz w:val="24"/>
+          <w:szCs w:val="24"/>
+          <w:lang w:val="tr-TR"/>
+        </w:rPr>
+        <w:t xml:space="preserve">      │   train LSTM/GRU</w:t>
+      </w:r>
+    </w:p>
+    <w:p>
+      <w:pPr>
+        <w:spacing w:after="0" w:line="240" w:lineRule="auto"/>
+        <w:rPr>
+          <w:noProof/>
+          <w:sz w:val="24"/>
+          <w:szCs w:val="24"/>
+          <w:lang w:val="tr-TR"/>
+        </w:rPr>
+      </w:pPr>
+      <w:r>
+        <w:rPr>
+          <w:noProof/>
+          <w:sz w:val="24"/>
+          <w:szCs w:val="24"/>
+          <w:lang w:val="tr-TR"/>
+        </w:rPr>
+        <w:t xml:space="preserve">      │</w:t>
+      </w:r>
+    </w:p>
+    <w:p>
+      <w:pPr>
+        <w:spacing w:after="0" w:line="240" w:lineRule="auto"/>
+        <w:rPr>
+          <w:noProof/>
+          <w:sz w:val="24"/>
+          <w:szCs w:val="24"/>
+          <w:lang w:val="tr-TR"/>
+        </w:rPr>
+      </w:pPr>
+      <w:r>
+        <w:rPr>
+          <w:noProof/>
+          <w:sz w:val="24"/>
+          <w:szCs w:val="24"/>
+          <w:lang w:val="tr-TR"/>
+        </w:rPr>
+        <w:t xml:space="preserve">      └── validation</w:t>
+      </w:r>
+    </w:p>
+    <w:p>
+      <w:pPr>
+        <w:spacing w:after="0" w:line="240" w:lineRule="auto"/>
+        <w:rPr>
+          <w:noProof/>
+          <w:sz w:val="24"/>
+          <w:szCs w:val="24"/>
+          <w:lang w:val="tr-TR"/>
+        </w:rPr>
+      </w:pPr>
+      <w:r>
+        <w:rPr>
+          <w:noProof/>
+          <w:sz w:val="24"/>
+          <w:szCs w:val="24"/>
+          <w:lang w:val="tr-TR"/>
+        </w:rPr>
+        <w:t xml:space="preserve">             ↓</w:t>
+      </w:r>
+    </w:p>
+    <w:p>
+      <w:pPr>
+        <w:spacing w:after="0" w:line="240" w:lineRule="auto"/>
+        <w:rPr>
+          <w:noProof/>
+          <w:sz w:val="24"/>
+          <w:szCs w:val="24"/>
+          <w:lang w:val="tr-TR"/>
+        </w:rPr>
+      </w:pPr>
+      <w:r>
+        <w:rPr>
+          <w:noProof/>
+          <w:sz w:val="24"/>
+          <w:szCs w:val="24"/>
+          <w:lang w:val="tr-TR"/>
+        </w:rPr>
+        <w:t xml:space="preserve">         transform using</w:t>
+      </w:r>
+    </w:p>
+    <w:p>
+      <w:pPr>
+        <w:spacing w:after="0" w:line="240" w:lineRule="auto"/>
+        <w:rPr>
+          <w:noProof/>
+          <w:sz w:val="24"/>
+          <w:szCs w:val="24"/>
+          <w:lang w:val="tr-TR"/>
+        </w:rPr>
+      </w:pPr>
+      <w:r>
+        <w:rPr>
+          <w:noProof/>
+          <w:sz w:val="24"/>
+          <w:szCs w:val="24"/>
+          <w:lang w:val="tr-TR"/>
+        </w:rPr>
+        <w:t xml:space="preserve">         TRAINING scaler</w:t>
+      </w:r>
+    </w:p>
+    <w:p>
+      <w:pPr>
+        <w:spacing w:after="0" w:line="240" w:lineRule="auto"/>
+        <w:rPr>
+          <w:noProof/>
+          <w:sz w:val="24"/>
+          <w:szCs w:val="24"/>
+          <w:lang w:val="tr-TR"/>
+        </w:rPr>
+      </w:pPr>
+    </w:p>
+    <w:p>
+      <w:pPr>
+        <w:spacing w:after="0" w:line="240" w:lineRule="auto"/>
+        <w:rPr>
+          <w:noProof/>
+          <w:sz w:val="24"/>
+          <w:szCs w:val="24"/>
+          <w:lang w:val="tr-TR"/>
+        </w:rPr>
+      </w:pPr>
+    </w:p>
+    <w:p>
+      <w:pPr>
+        <w:spacing w:after="0" w:line="240" w:lineRule="auto"/>
+        <w:rPr>
+          <w:b/>
+          <w:bCs/>
+          <w:noProof/>
+          <w:sz w:val="32"/>
+          <w:szCs w:val="32"/>
+          <w:lang w:val="tr-TR"/>
+        </w:rPr>
+      </w:pPr>
+      <w:r>
+        <w:rPr>
+          <w:b/>
+          <w:bCs/>
+          <w:noProof/>
+          <w:sz w:val="32"/>
+          <w:szCs w:val="32"/>
+          <w:lang w:val="tr-TR"/>
+        </w:rPr>
+        <w:t>Sprint 12:</w:t>
+      </w:r>
+    </w:p>
+    <w:p>
+      <w:pPr>
+        <w:spacing w:after="0" w:line="240" w:lineRule="auto"/>
+        <w:rPr>
+          <w:noProof/>
+          <w:sz w:val="24"/>
+          <w:szCs w:val="24"/>
+          <w:lang w:val="tr-TR"/>
+        </w:rPr>
+      </w:pPr>
+      <w:r>
+        <w:rPr>
+          <w:noProof/>
+          <w:sz w:val="24"/>
+          <w:szCs w:val="24"/>
+          <w:lang w:val="tr-TR"/>
+        </w:rPr>
+        <w:t>"What exactly is the common data and evaluation protocol?"</w:t>
+      </w:r>
+    </w:p>
+    <w:p>
+      <w:pPr>
+        <w:spacing w:after="0" w:line="240" w:lineRule="auto"/>
+        <w:rPr>
+          <w:noProof/>
+          <w:sz w:val="24"/>
+          <w:szCs w:val="24"/>
+          <w:lang w:val="tr-TR"/>
+        </w:rPr>
+      </w:pPr>
+    </w:p>
+    <w:p>
+      <w:pPr>
+        <w:spacing w:after="0" w:line="240" w:lineRule="auto"/>
+        <w:rPr>
+          <w:b/>
+          <w:bCs/>
+          <w:noProof/>
+          <w:sz w:val="32"/>
+          <w:szCs w:val="32"/>
+          <w:lang w:val="tr-TR"/>
+        </w:rPr>
+      </w:pPr>
+      <w:r>
+        <w:rPr>
+          <w:b/>
+          <w:bCs/>
+          <w:noProof/>
+          <w:sz w:val="32"/>
+          <w:szCs w:val="32"/>
+          <w:lang w:val="tr-TR"/>
+        </w:rPr>
+        <w:t>Sprint 13:</w:t>
+      </w:r>
+    </w:p>
+    <w:p>
+      <w:pPr>
+        <w:spacing w:after="0" w:line="240" w:lineRule="auto"/>
+        <w:rPr>
+          <w:noProof/>
+          <w:sz w:val="24"/>
+          <w:szCs w:val="24"/>
+          <w:lang w:val="tr-TR"/>
+        </w:rPr>
+      </w:pPr>
+      <w:r>
+        <w:rPr>
+          <w:noProof/>
+          <w:sz w:val="24"/>
+          <w:szCs w:val="24"/>
+          <w:lang w:val="tr-TR"/>
+        </w:rPr>
+        <w:t>"What configuration makes each model perform best?"</w:t>
+      </w:r>
+    </w:p>
+    <w:p>
+      <w:pPr>
+        <w:spacing w:after="0" w:line="240" w:lineRule="auto"/>
+        <w:rPr>
+          <w:noProof/>
+          <w:sz w:val="24"/>
+          <w:szCs w:val="24"/>
+          <w:lang w:val="tr-TR"/>
+        </w:rPr>
+      </w:pPr>
+    </w:p>
+    <w:p>
+      <w:pPr>
+        <w:spacing w:after="0" w:line="240" w:lineRule="auto"/>
+        <w:rPr>
+          <w:noProof/>
+          <w:sz w:val="24"/>
+          <w:szCs w:val="24"/>
+          <w:lang w:val="tr-TR"/>
+        </w:rPr>
+      </w:pPr>
+    </w:p>
     <w:sectPr>
       <w:pgSz w:w="11906" w:h="16838"/>
       <w:pgMar w:top="1417" w:right="1417" w:bottom="1417" w:left="1417" w:header="708" w:footer="708" w:gutter="0"/>
@@ -25518,7 +26091,7 @@
 </file>
 
 <file path=word/numbering.xml><?xml version="1.0" encoding="utf-8"?>
-<w:numbering xmlns:wpc="http://schemas.microsoft.com/office/word/2010/wordprocessingCanvas" xmlns:cx="http://schemas.microsoft.com/office/drawing/2014/chartex" xmlns:cx1="http://schemas.microsoft.com/office/drawing/2015/9/8/chartex" xmlns:cx2="http://schemas.microsoft.com/office/drawing/2015/10/21/chartex" xmlns:cx3="http://schemas.microsoft.com/office/drawing/2016/5/9/chartex" xmlns:cx4="http://schemas.microsoft.com/office/drawing/2016/5/10/chartex" xmlns:cx5="http://schemas.microsoft.com/office/drawing/2016/5/11/chartex" xmlns:cx6="http://schemas.microsoft.com/office/drawing/2016/5/12/chartex" xmlns:cx7="http://schemas.microsoft.com/office/drawing/2016/5/13/chartex" xmlns:cx8="http://schemas.microsoft.com/office/drawing/2016/5/14/chartex" xmlns:mc="http://schemas.openxmlformats.org/markup-compatibility/2006" xmlns:aink="http://schemas.microsoft.com/office/drawing/2016/ink" xmlns:am3d="http://schemas.microsoft.com/office/drawing/2017/model3d" xmlns:o="urn:schemas-microsoft-com:office:office" xmlns:oel="http://schemas.microsoft.com/office/2019/extlst" xmlns:r="http://schemas.openxmlformats.org/officeDocument/2006/relationships" xmlns:m="http://schemas.openxmlformats.org/officeDocument/2006/math" xmlns:v="urn:schemas-microsoft-com:vml" xmlns:wp14="http://schemas.microsoft.com/office/word/2010/wordprocessingDrawing" xmlns:wp="http://schemas.openxmlformats.org/drawingml/2006/wordprocessingDrawing" xmlns:w10="urn:schemas-microsoft-com:office:word" xmlns:w="http://schemas.openxmlformats.org/wordprocessingml/2006/main" xmlns:w14="http://schemas.microsoft.com/office/word/2010/wordml" xmlns:w15="http://schemas.microsoft.com/office/word/2012/wordml" xmlns:w16cei="http://schemas.microsoft.com/office/word/2026/wordml/cei" xmlns:w16cex="http://schemas.microsoft.com/office/word/2018/wordml/cex" xmlns:w16cid="http://schemas.microsoft.com/office/word/2016/wordml/cid" xmlns:w16="http://schemas.microsoft.com/office/word/2018/wordml" xmlns:w16du="http://schemas.microsoft.com/office/word/2023/wordml/word16du" xmlns:w16sdtdh="http://schemas.microsoft.com/office/word/2020/wordml/sdtdatahash" xmlns:w16sdtfl="http://schemas.microsoft.com/office/word/2024/wordml/sdtformatlock" xmlns:w16se="http://schemas.microsoft.com/office/word/2015/wordml/symex" xmlns:wpg="http://schemas.microsoft.com/office/word/2010/wordprocessingGroup" xmlns:wpi="http://schemas.microsoft.com/office/word/2010/wordprocessingInk" xmlns:wne="http://schemas.microsoft.com/office/word/2006/wordml" xmlns:wps="http://schemas.microsoft.com/office/word/2010/wordprocessingShape" mc:Ignorable="w14 w15 w16se w16cid w16 w16cex w16sdtdh w16sdtfl w16du wp14">
+<w:numbering xmlns:wpc="http://schemas.microsoft.com/office/word/2010/wordprocessingCanvas" xmlns:cx="http://schemas.microsoft.com/office/drawing/2014/chartex" xmlns:cx1="http://schemas.microsoft.com/office/drawing/2015/9/8/chartex" xmlns:cx2="http://schemas.microsoft.com/office/drawing/2015/10/21/chartex" xmlns:cx3="http://schemas.microsoft.com/office/drawing/2016/5/9/chartex" xmlns:cx4="http://schemas.microsoft.com/office/drawing/2016/5/10/chartex" xmlns:cx5="http://schemas.microsoft.com/office/drawing/2016/5/11/chartex" xmlns:cx6="http://schemas.microsoft.com/office/drawing/2016/5/12/chartex" xmlns:cx7="http://schemas.microsoft.com/office/drawing/2016/5/13/chartex" xmlns:cx8="http://schemas.microsoft.com/office/drawing/2016/5/14/chartex" xmlns:mc="http://schemas.openxmlformats.org/markup-compatibility/2006" xmlns:aink="http://schemas.microsoft.com/office/drawing/2016/ink" xmlns:am3d="http://schemas.microsoft.com/office/drawing/2017/model3d" xmlns:o="urn:schemas-microsoft-com:office:office" xmlns:oel="http://schemas.microsoft.com/office/2019/extlst" xmlns:r="http://schemas.openxmlformats.org/officeDocument/2006/relationships" xmlns:m="http://schemas.openxmlformats.org/officeDocument/2006/math" xmlns:v="urn:schemas-microsoft-com:vml" xmlns:wp14="http://schemas.microsoft.com/office/word/2010/wordprocessingDrawing" xmlns:wp="http://schemas.openxmlformats.org/drawingml/2006/wordprocessingDrawing" xmlns:w10="urn:schemas-microsoft-com:office:word" xmlns:w="http://schemas.openxmlformats.org/wordprocessingml/2006/main" xmlns:w14="http://schemas.microsoft.com/office/word/2010/wordml" xmlns:w15="http://schemas.microsoft.com/office/word/2012/wordml" xmlns:w16cex="http://schemas.microsoft.com/office/word/2018/wordml/cex" xmlns:w16cid="http://schemas.microsoft.com/office/word/2016/wordml/cid" xmlns:w16="http://schemas.microsoft.com/office/word/2018/wordml" xmlns:w16du="http://schemas.microsoft.com/office/word/2023/wordml/word16du" xmlns:w16sdtdh="http://schemas.microsoft.com/office/word/2020/wordml/sdtdatahash" xmlns:w16sdtfl="http://schemas.microsoft.com/office/word/2024/wordml/sdtformatlock" xmlns:w16se="http://schemas.microsoft.com/office/word/2015/wordml/symex" xmlns:wpg="http://schemas.microsoft.com/office/word/2010/wordprocessingGroup" xmlns:wpi="http://schemas.microsoft.com/office/word/2010/wordprocessingInk" xmlns:wne="http://schemas.microsoft.com/office/word/2006/wordml" xmlns:wps="http://schemas.microsoft.com/office/word/2010/wordprocessingShape" mc:Ignorable="w14 w15 w16se w16cid w16 w16cex w16sdtdh w16sdtfl w16du wp14">
   <w:abstractNum w:abstractNumId="0" w15:restartNumberingAfterBreak="0">
     <w:nsid w:val="017D5122"/>
     <w:multiLevelType w:val="multilevel"/>
@@ -29802,7 +30375,6 @@
   <w:style w:type="character" w:default="1" w:styleId="VarsaylanParagrafYazTipi">
     <w:name w:val="Default Paragraph Font"/>
     <w:uiPriority w:val="1"/>
-    <w:semiHidden/>
     <w:unhideWhenUsed/>
   </w:style>
   <w:style w:type="table" w:default="1" w:styleId="NormalTablo">

</xml_diff>

<commit_message>
feat(benchmark): add optimized multi-model benchmark
</commit_message>
<xml_diff>
--- a/docs/draft/development_flow.docx
+++ b/docs/draft/development_flow.docx
@@ -36117,9 +36117,1143 @@
           <w:lang w:val="tr-TR"/>
         </w:rPr>
         <w:lastRenderedPageBreak/>
-        <w:t>Sprint 14</w:t>
-      </w:r>
-      <w:r>
+        <w:t>Sprint 14.1A:</w:t>
+      </w:r>
+    </w:p>
+    <w:p>
+      <w:pPr>
+        <w:spacing w:after="0" w:line="240" w:lineRule="auto"/>
+        <w:jc w:val="center"/>
+        <w:rPr>
+          <w:noProof/>
+          <w:sz w:val="24"/>
+          <w:szCs w:val="24"/>
+          <w:lang w:val="tr-TR"/>
+        </w:rPr>
+      </w:pPr>
+    </w:p>
+    <w:p>
+      <w:pPr>
+        <w:spacing w:after="0" w:line="240" w:lineRule="auto"/>
+        <w:jc w:val="center"/>
+        <w:rPr>
+          <w:b/>
+          <w:bCs/>
+          <w:noProof/>
+          <w:sz w:val="24"/>
+          <w:szCs w:val="24"/>
+          <w:lang w:val="tr-TR"/>
+        </w:rPr>
+      </w:pPr>
+      <w:r>
+        <w:rPr>
+          <w:b/>
+          <w:bCs/>
+          <w:noProof/>
+          <w:sz w:val="24"/>
+          <w:szCs w:val="24"/>
+          <w:lang w:val="tr-TR"/>
+        </w:rPr>
+        <w:t xml:space="preserve">                  FINAL BENCHMARK HOLDOUT</w:t>
+      </w:r>
+    </w:p>
+    <w:p>
+      <w:pPr>
+        <w:spacing w:after="0" w:line="240" w:lineRule="auto"/>
+        <w:jc w:val="center"/>
+        <w:rPr>
+          <w:noProof/>
+          <w:sz w:val="24"/>
+          <w:szCs w:val="24"/>
+          <w:lang w:val="tr-TR"/>
+        </w:rPr>
+      </w:pPr>
+      <w:r>
+        <w:rPr>
+          <w:noProof/>
+          <w:sz w:val="24"/>
+          <w:szCs w:val="24"/>
+          <w:lang w:val="tr-TR"/>
+        </w:rPr>
+        <w:t xml:space="preserve">                   </w:t>
+      </w:r>
+      <w:r>
+        <w:rPr>
+          <w:rFonts w:ascii="Arial" w:hAnsi="Arial" w:cs="Arial"/>
+          <w:noProof/>
+          <w:sz w:val="24"/>
+          <w:szCs w:val="24"/>
+          <w:lang w:val="tr-TR"/>
+        </w:rPr>
+        <w:t>▲</w:t>
+      </w:r>
+    </w:p>
+    <w:p>
+      <w:pPr>
+        <w:spacing w:after="0" w:line="240" w:lineRule="auto"/>
+        <w:jc w:val="center"/>
+        <w:rPr>
+          <w:noProof/>
+          <w:sz w:val="24"/>
+          <w:szCs w:val="24"/>
+          <w:lang w:val="tr-TR"/>
+        </w:rPr>
+      </w:pPr>
+      <w:r>
+        <w:rPr>
+          <w:noProof/>
+          <w:sz w:val="24"/>
+          <w:szCs w:val="24"/>
+          <w:lang w:val="tr-TR"/>
+        </w:rPr>
+        <w:t xml:space="preserve">                   │</w:t>
+      </w:r>
+    </w:p>
+    <w:p>
+      <w:pPr>
+        <w:spacing w:after="0" w:line="240" w:lineRule="auto"/>
+        <w:jc w:val="center"/>
+        <w:rPr>
+          <w:noProof/>
+          <w:sz w:val="24"/>
+          <w:szCs w:val="24"/>
+          <w:lang w:val="tr-TR"/>
+        </w:rPr>
+      </w:pPr>
+      <w:r>
+        <w:rPr>
+          <w:noProof/>
+          <w:sz w:val="24"/>
+          <w:szCs w:val="24"/>
+          <w:lang w:val="tr-TR"/>
+        </w:rPr>
+        <w:t xml:space="preserve">                    never used for</w:t>
+      </w:r>
+    </w:p>
+    <w:p>
+      <w:pPr>
+        <w:spacing w:after="0" w:line="240" w:lineRule="auto"/>
+        <w:jc w:val="center"/>
+        <w:rPr>
+          <w:noProof/>
+          <w:sz w:val="24"/>
+          <w:szCs w:val="24"/>
+          <w:lang w:val="tr-TR"/>
+        </w:rPr>
+      </w:pPr>
+      <w:r>
+        <w:rPr>
+          <w:noProof/>
+          <w:sz w:val="24"/>
+          <w:szCs w:val="24"/>
+          <w:lang w:val="tr-TR"/>
+        </w:rPr>
+        <w:t xml:space="preserve">                  parameter selection</w:t>
+      </w:r>
+    </w:p>
+    <w:p>
+      <w:pPr>
+        <w:spacing w:after="0" w:line="240" w:lineRule="auto"/>
+        <w:jc w:val="center"/>
+        <w:rPr>
+          <w:noProof/>
+          <w:sz w:val="24"/>
+          <w:szCs w:val="24"/>
+          <w:lang w:val="tr-TR"/>
+        </w:rPr>
+      </w:pPr>
+      <w:r>
+        <w:rPr>
+          <w:noProof/>
+          <w:sz w:val="24"/>
+          <w:szCs w:val="24"/>
+          <w:lang w:val="tr-TR"/>
+        </w:rPr>
+        <w:t xml:space="preserve">                  │</w:t>
+      </w:r>
+    </w:p>
+    <w:p>
+      <w:pPr>
+        <w:spacing w:after="0" w:line="240" w:lineRule="auto"/>
+        <w:jc w:val="center"/>
+        <w:rPr>
+          <w:noProof/>
+          <w:sz w:val="24"/>
+          <w:szCs w:val="24"/>
+          <w:lang w:val="tr-TR"/>
+        </w:rPr>
+      </w:pPr>
+      <w:r>
+        <w:rPr>
+          <w:noProof/>
+          <w:sz w:val="24"/>
+          <w:szCs w:val="24"/>
+          <w:lang w:val="tr-TR"/>
+        </w:rPr>
+        <w:t xml:space="preserve">                  ┌────────</w:t>
+      </w:r>
+      <w:r>
+        <w:rPr>
+          <w:rFonts w:ascii="MS Gothic" w:eastAsia="MS Gothic" w:hAnsi="MS Gothic" w:cs="MS Gothic" w:hint="eastAsia"/>
+          <w:noProof/>
+          <w:sz w:val="24"/>
+          <w:szCs w:val="24"/>
+          <w:lang w:val="tr-TR"/>
+        </w:rPr>
+        <w:t>┴</w:t>
+      </w:r>
+      <w:r>
+        <w:rPr>
+          <w:rFonts w:ascii="Calibri" w:hAnsi="Calibri" w:cs="Calibri"/>
+          <w:noProof/>
+          <w:sz w:val="24"/>
+          <w:szCs w:val="24"/>
+          <w:lang w:val="tr-TR"/>
+        </w:rPr>
+        <w:t>────────┐</w:t>
+      </w:r>
+    </w:p>
+    <w:p>
+      <w:pPr>
+        <w:spacing w:after="0" w:line="240" w:lineRule="auto"/>
+        <w:rPr>
+          <w:noProof/>
+          <w:sz w:val="24"/>
+          <w:szCs w:val="24"/>
+          <w:lang w:val="tr-TR"/>
+        </w:rPr>
+      </w:pPr>
+      <w:r>
+        <w:rPr>
+          <w:noProof/>
+          <w:sz w:val="24"/>
+          <w:szCs w:val="24"/>
+          <w:lang w:val="tr-TR"/>
+        </w:rPr>
+        <w:t xml:space="preserve">      </w:t>
+      </w:r>
+      <w:r>
+        <w:rPr>
+          <w:noProof/>
+          <w:sz w:val="24"/>
+          <w:szCs w:val="24"/>
+          <w:lang w:val="tr-TR"/>
+        </w:rPr>
+        <w:t xml:space="preserve">                                                                 </w:t>
+      </w:r>
+      <w:r>
+        <w:rPr>
+          <w:noProof/>
+          <w:sz w:val="24"/>
+          <w:szCs w:val="24"/>
+          <w:lang w:val="tr-TR"/>
+        </w:rPr>
+        <w:t xml:space="preserve">│ </w:t>
+      </w:r>
+      <w:r>
+        <w:rPr>
+          <w:noProof/>
+          <w:sz w:val="24"/>
+          <w:szCs w:val="24"/>
+          <w:lang w:val="tr-TR"/>
+        </w:rPr>
+        <w:t xml:space="preserve">      </w:t>
+      </w:r>
+      <w:r>
+        <w:rPr>
+          <w:noProof/>
+          <w:sz w:val="24"/>
+          <w:szCs w:val="24"/>
+          <w:lang w:val="tr-TR"/>
+        </w:rPr>
+        <w:t xml:space="preserve">historical data </w:t>
+      </w:r>
+      <w:r>
+        <w:rPr>
+          <w:noProof/>
+          <w:sz w:val="24"/>
+          <w:szCs w:val="24"/>
+          <w:lang w:val="tr-TR"/>
+        </w:rPr>
+        <w:t xml:space="preserve">      </w:t>
+      </w:r>
+      <w:r>
+        <w:rPr>
+          <w:noProof/>
+          <w:sz w:val="24"/>
+          <w:szCs w:val="24"/>
+          <w:lang w:val="tr-TR"/>
+        </w:rPr>
+        <w:t>│</w:t>
+      </w:r>
+    </w:p>
+    <w:p>
+      <w:pPr>
+        <w:spacing w:after="0" w:line="240" w:lineRule="auto"/>
+        <w:jc w:val="center"/>
+        <w:rPr>
+          <w:noProof/>
+          <w:sz w:val="24"/>
+          <w:szCs w:val="24"/>
+          <w:lang w:val="tr-TR"/>
+        </w:rPr>
+      </w:pPr>
+      <w:r>
+        <w:rPr>
+          <w:noProof/>
+          <w:sz w:val="24"/>
+          <w:szCs w:val="24"/>
+          <w:lang w:val="tr-TR"/>
+        </w:rPr>
+        <w:t xml:space="preserve">                  └────────</w:t>
+      </w:r>
+      <w:r>
+        <w:rPr>
+          <w:rFonts w:ascii="MS Gothic" w:eastAsia="MS Gothic" w:hAnsi="MS Gothic" w:cs="MS Gothic" w:hint="eastAsia"/>
+          <w:noProof/>
+          <w:sz w:val="24"/>
+          <w:szCs w:val="24"/>
+          <w:lang w:val="tr-TR"/>
+        </w:rPr>
+        <w:t>┬</w:t>
+      </w:r>
+      <w:r>
+        <w:rPr>
+          <w:rFonts w:ascii="Calibri" w:hAnsi="Calibri" w:cs="Calibri"/>
+          <w:noProof/>
+          <w:sz w:val="24"/>
+          <w:szCs w:val="24"/>
+          <w:lang w:val="tr-TR"/>
+        </w:rPr>
+        <w:t>────────┘</w:t>
+      </w:r>
+    </w:p>
+    <w:p>
+      <w:pPr>
+        <w:spacing w:after="0" w:line="240" w:lineRule="auto"/>
+        <w:jc w:val="center"/>
+        <w:rPr>
+          <w:noProof/>
+          <w:sz w:val="24"/>
+          <w:szCs w:val="24"/>
+          <w:lang w:val="tr-TR"/>
+        </w:rPr>
+      </w:pPr>
+      <w:r>
+        <w:rPr>
+          <w:noProof/>
+          <w:sz w:val="24"/>
+          <w:szCs w:val="24"/>
+          <w:lang w:val="tr-TR"/>
+        </w:rPr>
+        <w:t xml:space="preserve">                  │</w:t>
+      </w:r>
+    </w:p>
+    <w:p>
+      <w:pPr>
+        <w:spacing w:after="0" w:line="240" w:lineRule="auto"/>
+        <w:jc w:val="center"/>
+        <w:rPr>
+          <w:noProof/>
+          <w:sz w:val="24"/>
+          <w:szCs w:val="24"/>
+          <w:lang w:val="tr-TR"/>
+        </w:rPr>
+      </w:pPr>
+      <w:r>
+        <w:rPr>
+          <w:noProof/>
+          <w:sz w:val="24"/>
+          <w:szCs w:val="24"/>
+          <w:lang w:val="tr-TR"/>
+        </w:rPr>
+        <w:t xml:space="preserve">                 optimization region</w:t>
+      </w:r>
+    </w:p>
+    <w:p>
+      <w:pPr>
+        <w:spacing w:after="0" w:line="240" w:lineRule="auto"/>
+        <w:jc w:val="center"/>
+        <w:rPr>
+          <w:noProof/>
+          <w:sz w:val="24"/>
+          <w:szCs w:val="24"/>
+          <w:lang w:val="tr-TR"/>
+        </w:rPr>
+      </w:pPr>
+      <w:r>
+        <w:rPr>
+          <w:noProof/>
+          <w:sz w:val="24"/>
+          <w:szCs w:val="24"/>
+          <w:lang w:val="tr-TR"/>
+        </w:rPr>
+        <w:t xml:space="preserve">                │</w:t>
+      </w:r>
+    </w:p>
+    <w:p>
+      <w:pPr>
+        <w:spacing w:after="0" w:line="240" w:lineRule="auto"/>
+        <w:jc w:val="center"/>
+        <w:rPr>
+          <w:noProof/>
+          <w:sz w:val="24"/>
+          <w:szCs w:val="24"/>
+          <w:lang w:val="tr-TR"/>
+        </w:rPr>
+      </w:pPr>
+      <w:r>
+        <w:rPr>
+          <w:noProof/>
+          <w:sz w:val="24"/>
+          <w:szCs w:val="24"/>
+          <w:lang w:val="tr-TR"/>
+        </w:rPr>
+        <w:t xml:space="preserve">              ┌────────────</w:t>
+      </w:r>
+      <w:r>
+        <w:rPr>
+          <w:rFonts w:ascii="MS Gothic" w:eastAsia="MS Gothic" w:hAnsi="MS Gothic" w:cs="MS Gothic" w:hint="eastAsia"/>
+          <w:noProof/>
+          <w:sz w:val="24"/>
+          <w:szCs w:val="24"/>
+          <w:lang w:val="tr-TR"/>
+        </w:rPr>
+        <w:t>┴</w:t>
+      </w:r>
+      <w:r>
+        <w:rPr>
+          <w:rFonts w:ascii="Calibri" w:hAnsi="Calibri" w:cs="Calibri"/>
+          <w:noProof/>
+          <w:sz w:val="24"/>
+          <w:szCs w:val="24"/>
+          <w:lang w:val="tr-TR"/>
+        </w:rPr>
+        <w:t>────────────┐</w:t>
+      </w:r>
+    </w:p>
+    <w:p>
+      <w:pPr>
+        <w:spacing w:after="0" w:line="240" w:lineRule="auto"/>
+        <w:rPr>
+          <w:noProof/>
+          <w:sz w:val="24"/>
+          <w:szCs w:val="24"/>
+          <w:lang w:val="tr-TR"/>
+        </w:rPr>
+      </w:pPr>
+      <w:r>
+        <w:rPr>
+          <w:noProof/>
+          <w:sz w:val="24"/>
+          <w:szCs w:val="24"/>
+          <w:lang w:val="tr-TR"/>
+        </w:rPr>
+        <w:t xml:space="preserve">                                                            </w:t>
+      </w:r>
+      <w:r>
+        <w:rPr>
+          <w:noProof/>
+          <w:sz w:val="24"/>
+          <w:szCs w:val="24"/>
+          <w:lang w:val="tr-TR"/>
+        </w:rPr>
+        <w:t xml:space="preserve">│                         </w:t>
+      </w:r>
+      <w:r>
+        <w:rPr>
+          <w:noProof/>
+          <w:sz w:val="24"/>
+          <w:szCs w:val="24"/>
+          <w:lang w:val="tr-TR"/>
+        </w:rPr>
+        <w:t xml:space="preserve">                                </w:t>
+      </w:r>
+      <w:r>
+        <w:rPr>
+          <w:noProof/>
+          <w:sz w:val="24"/>
+          <w:szCs w:val="24"/>
+          <w:lang w:val="tr-TR"/>
+        </w:rPr>
+        <w:t>│</w:t>
+      </w:r>
+    </w:p>
+    <w:p>
+      <w:pPr>
+        <w:spacing w:after="0" w:line="240" w:lineRule="auto"/>
+        <w:rPr>
+          <w:noProof/>
+          <w:sz w:val="24"/>
+          <w:szCs w:val="24"/>
+          <w:lang w:val="tr-TR"/>
+        </w:rPr>
+      </w:pPr>
+      <w:r>
+        <w:rPr>
+          <w:noProof/>
+          <w:sz w:val="24"/>
+          <w:szCs w:val="24"/>
+          <w:lang w:val="tr-TR"/>
+        </w:rPr>
+        <w:t xml:space="preserve">         </w:t>
+      </w:r>
+      <w:r>
+        <w:rPr>
+          <w:noProof/>
+          <w:sz w:val="24"/>
+          <w:szCs w:val="24"/>
+          <w:lang w:val="tr-TR"/>
+        </w:rPr>
+        <w:t xml:space="preserve">                                          </w:t>
+      </w:r>
+      <w:r>
+        <w:rPr>
+          <w:noProof/>
+          <w:sz w:val="24"/>
+          <w:szCs w:val="24"/>
+          <w:lang w:val="tr-TR"/>
+        </w:rPr>
+        <w:t xml:space="preserve">candidate A               </w:t>
+      </w:r>
+      <w:r>
+        <w:rPr>
+          <w:noProof/>
+          <w:sz w:val="24"/>
+          <w:szCs w:val="24"/>
+          <w:lang w:val="tr-TR"/>
+        </w:rPr>
+        <w:t xml:space="preserve">                     </w:t>
+      </w:r>
+      <w:r>
+        <w:rPr>
+          <w:noProof/>
+          <w:sz w:val="24"/>
+          <w:szCs w:val="24"/>
+          <w:lang w:val="tr-TR"/>
+        </w:rPr>
+        <w:t>candidate B</w:t>
+      </w:r>
+    </w:p>
+    <w:p>
+      <w:pPr>
+        <w:spacing w:after="0" w:line="240" w:lineRule="auto"/>
+        <w:rPr>
+          <w:noProof/>
+          <w:sz w:val="24"/>
+          <w:szCs w:val="24"/>
+          <w:lang w:val="tr-TR"/>
+        </w:rPr>
+      </w:pPr>
+      <w:r>
+        <w:rPr>
+          <w:noProof/>
+          <w:sz w:val="24"/>
+          <w:szCs w:val="24"/>
+          <w:lang w:val="tr-TR"/>
+        </w:rPr>
+        <w:t xml:space="preserve">              </w:t>
+      </w:r>
+      <w:r>
+        <w:rPr>
+          <w:noProof/>
+          <w:sz w:val="24"/>
+          <w:szCs w:val="24"/>
+          <w:lang w:val="tr-TR"/>
+        </w:rPr>
+        <w:t xml:space="preserve">                                              </w:t>
+      </w:r>
+      <w:r>
+        <w:rPr>
+          <w:noProof/>
+          <w:sz w:val="24"/>
+          <w:szCs w:val="24"/>
+          <w:lang w:val="tr-TR"/>
+        </w:rPr>
+        <w:t xml:space="preserve">│                         </w:t>
+      </w:r>
+      <w:r>
+        <w:rPr>
+          <w:noProof/>
+          <w:sz w:val="24"/>
+          <w:szCs w:val="24"/>
+          <w:lang w:val="tr-TR"/>
+        </w:rPr>
+        <w:t xml:space="preserve">                                </w:t>
+      </w:r>
+      <w:r>
+        <w:rPr>
+          <w:noProof/>
+          <w:sz w:val="24"/>
+          <w:szCs w:val="24"/>
+          <w:lang w:val="tr-TR"/>
+        </w:rPr>
+        <w:t>│</w:t>
+      </w:r>
+    </w:p>
+    <w:p>
+      <w:pPr>
+        <w:spacing w:after="0" w:line="240" w:lineRule="auto"/>
+        <w:rPr>
+          <w:noProof/>
+          <w:sz w:val="24"/>
+          <w:szCs w:val="24"/>
+          <w:lang w:val="tr-TR"/>
+        </w:rPr>
+      </w:pPr>
+      <w:r>
+        <w:rPr>
+          <w:noProof/>
+          <w:sz w:val="24"/>
+          <w:szCs w:val="24"/>
+          <w:lang w:val="tr-TR"/>
+        </w:rPr>
+        <w:t xml:space="preserve">        </w:t>
+      </w:r>
+      <w:r>
+        <w:rPr>
+          <w:noProof/>
+          <w:sz w:val="24"/>
+          <w:szCs w:val="24"/>
+          <w:lang w:val="tr-TR"/>
+        </w:rPr>
+        <w:t xml:space="preserve">                                      </w:t>
+      </w:r>
+      <w:r>
+        <w:rPr>
+          <w:noProof/>
+          <w:sz w:val="24"/>
+          <w:szCs w:val="24"/>
+          <w:lang w:val="tr-TR"/>
+        </w:rPr>
+        <w:t xml:space="preserve">internal temporal        </w:t>
+      </w:r>
+      <w:r>
+        <w:rPr>
+          <w:noProof/>
+          <w:sz w:val="24"/>
+          <w:szCs w:val="24"/>
+          <w:lang w:val="tr-TR"/>
+        </w:rPr>
+        <w:t xml:space="preserve">                </w:t>
+      </w:r>
+      <w:r>
+        <w:rPr>
+          <w:noProof/>
+          <w:sz w:val="24"/>
+          <w:szCs w:val="24"/>
+          <w:lang w:val="tr-TR"/>
+        </w:rPr>
+        <w:t xml:space="preserve"> </w:t>
+      </w:r>
+      <w:r>
+        <w:rPr>
+          <w:noProof/>
+          <w:sz w:val="24"/>
+          <w:szCs w:val="24"/>
+          <w:lang w:val="tr-TR"/>
+        </w:rPr>
+        <w:t xml:space="preserve">   </w:t>
+      </w:r>
+      <w:r>
+        <w:rPr>
+          <w:noProof/>
+          <w:sz w:val="24"/>
+          <w:szCs w:val="24"/>
+          <w:lang w:val="tr-TR"/>
+        </w:rPr>
+        <w:t>internal temporal</w:t>
+      </w:r>
+    </w:p>
+    <w:p>
+      <w:pPr>
+        <w:spacing w:after="0" w:line="240" w:lineRule="auto"/>
+        <w:rPr>
+          <w:noProof/>
+          <w:sz w:val="24"/>
+          <w:szCs w:val="24"/>
+          <w:lang w:val="tr-TR"/>
+        </w:rPr>
+      </w:pPr>
+      <w:r>
+        <w:rPr>
+          <w:noProof/>
+          <w:sz w:val="24"/>
+          <w:szCs w:val="24"/>
+          <w:lang w:val="tr-TR"/>
+        </w:rPr>
+        <w:t xml:space="preserve">          </w:t>
+      </w:r>
+      <w:r>
+        <w:rPr>
+          <w:noProof/>
+          <w:sz w:val="24"/>
+          <w:szCs w:val="24"/>
+          <w:lang w:val="tr-TR"/>
+        </w:rPr>
+        <w:t xml:space="preserve">                                           </w:t>
+      </w:r>
+      <w:r>
+        <w:rPr>
+          <w:noProof/>
+          <w:sz w:val="24"/>
+          <w:szCs w:val="24"/>
+          <w:lang w:val="tr-TR"/>
+        </w:rPr>
+        <w:t xml:space="preserve">validation                </w:t>
+      </w:r>
+      <w:r>
+        <w:rPr>
+          <w:noProof/>
+          <w:sz w:val="24"/>
+          <w:szCs w:val="24"/>
+          <w:lang w:val="tr-TR"/>
+        </w:rPr>
+        <w:t xml:space="preserve">                       </w:t>
+      </w:r>
+      <w:r>
+        <w:rPr>
+          <w:noProof/>
+          <w:sz w:val="24"/>
+          <w:szCs w:val="24"/>
+          <w:lang w:val="tr-TR"/>
+        </w:rPr>
+        <w:t>validation</w:t>
+      </w:r>
+    </w:p>
+    <w:p>
+      <w:pPr>
+        <w:spacing w:after="0" w:line="240" w:lineRule="auto"/>
+        <w:rPr>
+          <w:noProof/>
+          <w:sz w:val="24"/>
+          <w:szCs w:val="24"/>
+          <w:lang w:val="tr-TR"/>
+        </w:rPr>
+      </w:pPr>
+      <w:r>
+        <w:rPr>
+          <w:noProof/>
+          <w:sz w:val="24"/>
+          <w:szCs w:val="24"/>
+          <w:lang w:val="tr-TR"/>
+        </w:rPr>
+        <w:t xml:space="preserve">              </w:t>
+      </w:r>
+      <w:r>
+        <w:rPr>
+          <w:noProof/>
+          <w:sz w:val="24"/>
+          <w:szCs w:val="24"/>
+          <w:lang w:val="tr-TR"/>
+        </w:rPr>
+        <w:t xml:space="preserve">                                              </w:t>
+      </w:r>
+      <w:r>
+        <w:rPr>
+          <w:noProof/>
+          <w:sz w:val="24"/>
+          <w:szCs w:val="24"/>
+          <w:lang w:val="tr-TR"/>
+        </w:rPr>
+        <w:t xml:space="preserve">│                         </w:t>
+      </w:r>
+      <w:r>
+        <w:rPr>
+          <w:noProof/>
+          <w:sz w:val="24"/>
+          <w:szCs w:val="24"/>
+          <w:lang w:val="tr-TR"/>
+        </w:rPr>
+        <w:t xml:space="preserve">                                </w:t>
+      </w:r>
+      <w:r>
+        <w:rPr>
+          <w:noProof/>
+          <w:sz w:val="24"/>
+          <w:szCs w:val="24"/>
+          <w:lang w:val="tr-TR"/>
+        </w:rPr>
+        <w:t>│</w:t>
+      </w:r>
+    </w:p>
+    <w:p>
+      <w:pPr>
+        <w:spacing w:after="0" w:line="240" w:lineRule="auto"/>
+        <w:jc w:val="center"/>
+        <w:rPr>
+          <w:noProof/>
+          <w:sz w:val="24"/>
+          <w:szCs w:val="24"/>
+          <w:lang w:val="tr-TR"/>
+        </w:rPr>
+      </w:pPr>
+      <w:r>
+        <w:rPr>
+          <w:noProof/>
+          <w:sz w:val="24"/>
+          <w:szCs w:val="24"/>
+          <w:lang w:val="tr-TR"/>
+        </w:rPr>
+        <w:t xml:space="preserve">              └────────────</w:t>
+      </w:r>
+      <w:r>
+        <w:rPr>
+          <w:rFonts w:ascii="MS Gothic" w:eastAsia="MS Gothic" w:hAnsi="MS Gothic" w:cs="MS Gothic" w:hint="eastAsia"/>
+          <w:noProof/>
+          <w:sz w:val="24"/>
+          <w:szCs w:val="24"/>
+          <w:lang w:val="tr-TR"/>
+        </w:rPr>
+        <w:t>┬</w:t>
+      </w:r>
+      <w:r>
+        <w:rPr>
+          <w:rFonts w:ascii="Calibri" w:hAnsi="Calibri" w:cs="Calibri"/>
+          <w:noProof/>
+          <w:sz w:val="24"/>
+          <w:szCs w:val="24"/>
+          <w:lang w:val="tr-TR"/>
+        </w:rPr>
+        <w:t>────────────┘</w:t>
+      </w:r>
+    </w:p>
+    <w:p>
+      <w:pPr>
+        <w:spacing w:after="0" w:line="240" w:lineRule="auto"/>
+        <w:jc w:val="center"/>
+        <w:rPr>
+          <w:noProof/>
+          <w:sz w:val="24"/>
+          <w:szCs w:val="24"/>
+          <w:lang w:val="tr-TR"/>
+        </w:rPr>
+      </w:pPr>
+      <w:r>
+        <w:rPr>
+          <w:noProof/>
+          <w:sz w:val="24"/>
+          <w:szCs w:val="24"/>
+          <w:lang w:val="tr-TR"/>
+        </w:rPr>
+        <w:t xml:space="preserve">              │</w:t>
+      </w:r>
+    </w:p>
+    <w:p>
+      <w:pPr>
+        <w:spacing w:after="0" w:line="240" w:lineRule="auto"/>
+        <w:jc w:val="center"/>
+        <w:rPr>
+          <w:noProof/>
+          <w:sz w:val="24"/>
+          <w:szCs w:val="24"/>
+          <w:lang w:val="tr-TR"/>
+        </w:rPr>
+      </w:pPr>
+      <w:r>
+        <w:rPr>
+          <w:noProof/>
+          <w:sz w:val="24"/>
+          <w:szCs w:val="24"/>
+          <w:lang w:val="tr-TR"/>
+        </w:rPr>
+        <w:t xml:space="preserve">           select best</w:t>
+      </w:r>
+    </w:p>
+    <w:p>
+      <w:pPr>
+        <w:spacing w:after="0" w:line="240" w:lineRule="auto"/>
+        <w:jc w:val="center"/>
+        <w:rPr>
+          <w:noProof/>
+          <w:sz w:val="24"/>
+          <w:szCs w:val="24"/>
+          <w:lang w:val="tr-TR"/>
+        </w:rPr>
+      </w:pPr>
+      <w:r>
+        <w:rPr>
+          <w:noProof/>
+          <w:sz w:val="24"/>
+          <w:szCs w:val="24"/>
+          <w:lang w:val="tr-TR"/>
+        </w:rPr>
+        <w:t xml:space="preserve">              │</w:t>
+      </w:r>
+    </w:p>
+    <w:p>
+      <w:pPr>
+        <w:spacing w:after="0" w:line="240" w:lineRule="auto"/>
+        <w:jc w:val="center"/>
+        <w:rPr>
+          <w:noProof/>
+          <w:sz w:val="24"/>
+          <w:szCs w:val="24"/>
+          <w:lang w:val="tr-TR"/>
+        </w:rPr>
+      </w:pPr>
+      <w:r>
+        <w:rPr>
+          <w:noProof/>
+          <w:sz w:val="24"/>
+          <w:szCs w:val="24"/>
+          <w:lang w:val="tr-TR"/>
+        </w:rPr>
+        <w:t xml:space="preserve">              </w:t>
+      </w:r>
+      <w:r>
+        <w:rPr>
+          <w:rFonts w:ascii="Arial" w:hAnsi="Arial" w:cs="Arial"/>
+          <w:noProof/>
+          <w:sz w:val="24"/>
+          <w:szCs w:val="24"/>
+          <w:lang w:val="tr-TR"/>
+        </w:rPr>
+        <w:t>▼</w:t>
+      </w:r>
+    </w:p>
+    <w:p>
+      <w:pPr>
+        <w:spacing w:after="0" w:line="240" w:lineRule="auto"/>
+        <w:jc w:val="center"/>
+        <w:rPr>
+          <w:noProof/>
+          <w:sz w:val="24"/>
+          <w:szCs w:val="24"/>
+          <w:lang w:val="tr-TR"/>
+        </w:rPr>
+      </w:pPr>
+      <w:r>
+        <w:rPr>
+          <w:noProof/>
+          <w:sz w:val="24"/>
+          <w:szCs w:val="24"/>
+          <w:lang w:val="tr-TR"/>
+        </w:rPr>
+        <w:t xml:space="preserve">        OptimizationResult</w:t>
+      </w:r>
+    </w:p>
+    <w:p>
+      <w:pPr>
+        <w:spacing w:after="0" w:line="240" w:lineRule="auto"/>
+        <w:jc w:val="center"/>
+        <w:rPr>
+          <w:noProof/>
+          <w:sz w:val="24"/>
+          <w:szCs w:val="24"/>
+          <w:lang w:val="tr-TR"/>
+        </w:rPr>
+      </w:pPr>
+      <w:r>
+        <w:rPr>
+          <w:noProof/>
+          <w:sz w:val="24"/>
+          <w:szCs w:val="24"/>
+          <w:lang w:val="tr-TR"/>
+        </w:rPr>
+        <w:t xml:space="preserve">              │</w:t>
+      </w:r>
+    </w:p>
+    <w:p>
+      <w:pPr>
+        <w:spacing w:after="0" w:line="240" w:lineRule="auto"/>
+        <w:jc w:val="center"/>
+        <w:rPr>
+          <w:noProof/>
+          <w:sz w:val="24"/>
+          <w:szCs w:val="24"/>
+          <w:lang w:val="tr-TR"/>
+        </w:rPr>
+      </w:pPr>
+      <w:r>
+        <w:rPr>
+          <w:noProof/>
+          <w:sz w:val="24"/>
+          <w:szCs w:val="24"/>
+          <w:lang w:val="tr-TR"/>
+        </w:rPr>
+        <w:t xml:space="preserve">              </w:t>
+      </w:r>
+      <w:r>
+        <w:rPr>
+          <w:rFonts w:ascii="Arial" w:hAnsi="Arial" w:cs="Arial"/>
+          <w:noProof/>
+          <w:sz w:val="24"/>
+          <w:szCs w:val="24"/>
+          <w:lang w:val="tr-TR"/>
+        </w:rPr>
+        <w:t>▼</w:t>
+      </w:r>
+    </w:p>
+    <w:p>
+      <w:pPr>
+        <w:spacing w:after="0" w:line="240" w:lineRule="auto"/>
+        <w:jc w:val="center"/>
+        <w:rPr>
+          <w:noProof/>
+          <w:sz w:val="24"/>
+          <w:szCs w:val="24"/>
+          <w:lang w:val="tr-TR"/>
+        </w:rPr>
+      </w:pPr>
+      <w:r>
+        <w:rPr>
+          <w:noProof/>
+          <w:sz w:val="24"/>
+          <w:szCs w:val="24"/>
+          <w:lang w:val="tr-TR"/>
+        </w:rPr>
+        <w:t xml:space="preserve">         selected config</w:t>
+      </w:r>
+    </w:p>
+    <w:p>
+      <w:pPr>
+        <w:spacing w:after="0" w:line="240" w:lineRule="auto"/>
+        <w:jc w:val="center"/>
+        <w:rPr>
+          <w:noProof/>
+          <w:sz w:val="24"/>
+          <w:szCs w:val="24"/>
+          <w:lang w:val="tr-TR"/>
+        </w:rPr>
+      </w:pPr>
+      <w:r>
+        <w:rPr>
+          <w:noProof/>
+          <w:sz w:val="24"/>
+          <w:szCs w:val="24"/>
+          <w:lang w:val="tr-TR"/>
+        </w:rPr>
+        <w:t xml:space="preserve">               │</w:t>
+      </w:r>
+    </w:p>
+    <w:p>
+      <w:pPr>
+        <w:spacing w:after="0" w:line="240" w:lineRule="auto"/>
+        <w:jc w:val="center"/>
+        <w:rPr>
+          <w:noProof/>
+          <w:sz w:val="24"/>
+          <w:szCs w:val="24"/>
+          <w:lang w:val="tr-TR"/>
+        </w:rPr>
+      </w:pPr>
+      <w:r>
+        <w:rPr>
+          <w:noProof/>
+          <w:sz w:val="24"/>
+          <w:szCs w:val="24"/>
+          <w:lang w:val="tr-TR"/>
+        </w:rPr>
+        <w:t xml:space="preserve">              </w:t>
+      </w:r>
+      <w:r>
+        <w:rPr>
+          <w:noProof/>
+          <w:sz w:val="24"/>
+          <w:szCs w:val="24"/>
+          <w:lang w:val="tr-TR"/>
+        </w:rPr>
+        <w:t xml:space="preserve"> </w:t>
+      </w:r>
+      <w:r>
+        <w:rPr>
+          <w:rFonts w:ascii="Arial" w:hAnsi="Arial" w:cs="Arial"/>
+          <w:noProof/>
+          <w:sz w:val="24"/>
+          <w:szCs w:val="24"/>
+          <w:lang w:val="tr-TR"/>
+        </w:rPr>
+        <w:t>▼</w:t>
+      </w:r>
+    </w:p>
+    <w:p>
+      <w:pPr>
+        <w:spacing w:after="0" w:line="240" w:lineRule="auto"/>
+        <w:jc w:val="center"/>
+        <w:rPr>
+          <w:noProof/>
+          <w:sz w:val="24"/>
+          <w:szCs w:val="24"/>
+          <w:lang w:val="tr-TR"/>
+        </w:rPr>
+      </w:pPr>
+      <w:r>
+        <w:rPr>
+          <w:noProof/>
+          <w:sz w:val="24"/>
+          <w:szCs w:val="24"/>
+          <w:lang w:val="tr-TR"/>
+        </w:rPr>
+        <w:t xml:space="preserve">              standardized final benchmark</w:t>
+      </w:r>
+    </w:p>
+    <w:p>
+      <w:pPr>
+        <w:spacing w:after="0" w:line="240" w:lineRule="auto"/>
+        <w:jc w:val="center"/>
+        <w:rPr>
+          <w:noProof/>
+          <w:sz w:val="24"/>
+          <w:szCs w:val="24"/>
+          <w:lang w:val="tr-TR"/>
+        </w:rPr>
+      </w:pPr>
+      <w:r>
+        <w:rPr>
+          <w:noProof/>
+          <w:sz w:val="24"/>
+          <w:szCs w:val="24"/>
+          <w:lang w:val="tr-TR"/>
+        </w:rPr>
+        <w:t xml:space="preserve">                  ForecastEvaluator</w:t>
+      </w:r>
+    </w:p>
+    <w:p>
+      <w:pPr>
+        <w:spacing w:after="0" w:line="240" w:lineRule="auto"/>
+        <w:jc w:val="center"/>
+        <w:rPr>
+          <w:noProof/>
+          <w:sz w:val="24"/>
+          <w:szCs w:val="24"/>
+          <w:lang w:val="tr-TR"/>
+        </w:rPr>
+      </w:pPr>
+    </w:p>
+    <w:p>
+      <w:pPr>
+        <w:rPr>
+          <w:noProof/>
+          <w:sz w:val="24"/>
+          <w:szCs w:val="24"/>
+          <w:lang w:val="tr-TR"/>
+        </w:rPr>
+      </w:pPr>
+    </w:p>
+    <w:p>
+      <w:pPr>
+        <w:rPr>
+          <w:noProof/>
+          <w:sz w:val="24"/>
+          <w:szCs w:val="24"/>
+          <w:lang w:val="tr-TR"/>
+        </w:rPr>
+      </w:pPr>
+      <w:r>
+        <w:rPr>
+          <w:noProof/>
+          <w:sz w:val="24"/>
+          <w:szCs w:val="24"/>
+          <w:lang w:val="tr-TR"/>
+        </w:rPr>
+        <w:br w:type="page"/>
+      </w:r>
+    </w:p>
+    <w:p>
+      <w:pPr>
+        <w:spacing w:after="0" w:line="240" w:lineRule="auto"/>
+        <w:jc w:val="center"/>
         <w:rPr>
           <w:b/>
           <w:bCs/>
@@ -36129,1143 +37263,8 @@
           <w:u w:val="single"/>
           <w:lang w:val="tr-TR"/>
         </w:rPr>
-        <w:t>.1A:</w:t>
-      </w:r>
-    </w:p>
-    <w:p>
-      <w:pPr>
-        <w:spacing w:after="0" w:line="240" w:lineRule="auto"/>
-        <w:jc w:val="center"/>
-        <w:rPr>
-          <w:noProof/>
-          <w:sz w:val="24"/>
-          <w:szCs w:val="24"/>
-          <w:lang w:val="tr-TR"/>
-        </w:rPr>
-      </w:pPr>
-    </w:p>
-    <w:p>
-      <w:pPr>
-        <w:spacing w:after="0" w:line="240" w:lineRule="auto"/>
-        <w:jc w:val="center"/>
-        <w:rPr>
-          <w:b/>
-          <w:bCs/>
-          <w:noProof/>
-          <w:sz w:val="24"/>
-          <w:szCs w:val="24"/>
-          <w:lang w:val="tr-TR"/>
-        </w:rPr>
-      </w:pPr>
-      <w:r>
-        <w:rPr>
-          <w:b/>
-          <w:bCs/>
-          <w:noProof/>
-          <w:sz w:val="24"/>
-          <w:szCs w:val="24"/>
-          <w:lang w:val="tr-TR"/>
-        </w:rPr>
-        <w:t xml:space="preserve">                  FINAL BENCHMARK HOLDOUT</w:t>
-      </w:r>
-    </w:p>
-    <w:p>
-      <w:pPr>
-        <w:spacing w:after="0" w:line="240" w:lineRule="auto"/>
-        <w:jc w:val="center"/>
-        <w:rPr>
-          <w:noProof/>
-          <w:sz w:val="24"/>
-          <w:szCs w:val="24"/>
-          <w:lang w:val="tr-TR"/>
-        </w:rPr>
-      </w:pPr>
-      <w:r>
-        <w:rPr>
-          <w:noProof/>
-          <w:sz w:val="24"/>
-          <w:szCs w:val="24"/>
-          <w:lang w:val="tr-TR"/>
-        </w:rPr>
-        <w:t xml:space="preserve">                   </w:t>
-      </w:r>
-      <w:r>
-        <w:rPr>
-          <w:rFonts w:ascii="Arial" w:hAnsi="Arial" w:cs="Arial"/>
-          <w:noProof/>
-          <w:sz w:val="24"/>
-          <w:szCs w:val="24"/>
-          <w:lang w:val="tr-TR"/>
-        </w:rPr>
-        <w:t>▲</w:t>
-      </w:r>
-    </w:p>
-    <w:p>
-      <w:pPr>
-        <w:spacing w:after="0" w:line="240" w:lineRule="auto"/>
-        <w:jc w:val="center"/>
-        <w:rPr>
-          <w:noProof/>
-          <w:sz w:val="24"/>
-          <w:szCs w:val="24"/>
-          <w:lang w:val="tr-TR"/>
-        </w:rPr>
-      </w:pPr>
-      <w:r>
-        <w:rPr>
-          <w:noProof/>
-          <w:sz w:val="24"/>
-          <w:szCs w:val="24"/>
-          <w:lang w:val="tr-TR"/>
-        </w:rPr>
-        <w:t xml:space="preserve">                   │</w:t>
-      </w:r>
-    </w:p>
-    <w:p>
-      <w:pPr>
-        <w:spacing w:after="0" w:line="240" w:lineRule="auto"/>
-        <w:jc w:val="center"/>
-        <w:rPr>
-          <w:noProof/>
-          <w:sz w:val="24"/>
-          <w:szCs w:val="24"/>
-          <w:lang w:val="tr-TR"/>
-        </w:rPr>
-      </w:pPr>
-      <w:r>
-        <w:rPr>
-          <w:noProof/>
-          <w:sz w:val="24"/>
-          <w:szCs w:val="24"/>
-          <w:lang w:val="tr-TR"/>
-        </w:rPr>
-        <w:t xml:space="preserve">                    never used for</w:t>
-      </w:r>
-    </w:p>
-    <w:p>
-      <w:pPr>
-        <w:spacing w:after="0" w:line="240" w:lineRule="auto"/>
-        <w:jc w:val="center"/>
-        <w:rPr>
-          <w:noProof/>
-          <w:sz w:val="24"/>
-          <w:szCs w:val="24"/>
-          <w:lang w:val="tr-TR"/>
-        </w:rPr>
-      </w:pPr>
-      <w:r>
-        <w:rPr>
-          <w:noProof/>
-          <w:sz w:val="24"/>
-          <w:szCs w:val="24"/>
-          <w:lang w:val="tr-TR"/>
-        </w:rPr>
-        <w:t xml:space="preserve">                  parameter selection</w:t>
-      </w:r>
-    </w:p>
-    <w:p>
-      <w:pPr>
-        <w:spacing w:after="0" w:line="240" w:lineRule="auto"/>
-        <w:jc w:val="center"/>
-        <w:rPr>
-          <w:noProof/>
-          <w:sz w:val="24"/>
-          <w:szCs w:val="24"/>
-          <w:lang w:val="tr-TR"/>
-        </w:rPr>
-      </w:pPr>
-      <w:r>
-        <w:rPr>
-          <w:noProof/>
-          <w:sz w:val="24"/>
-          <w:szCs w:val="24"/>
-          <w:lang w:val="tr-TR"/>
-        </w:rPr>
-        <w:t xml:space="preserve">                  │</w:t>
-      </w:r>
-    </w:p>
-    <w:p>
-      <w:pPr>
-        <w:spacing w:after="0" w:line="240" w:lineRule="auto"/>
-        <w:jc w:val="center"/>
-        <w:rPr>
-          <w:noProof/>
-          <w:sz w:val="24"/>
-          <w:szCs w:val="24"/>
-          <w:lang w:val="tr-TR"/>
-        </w:rPr>
-      </w:pPr>
-      <w:r>
-        <w:rPr>
-          <w:noProof/>
-          <w:sz w:val="24"/>
-          <w:szCs w:val="24"/>
-          <w:lang w:val="tr-TR"/>
-        </w:rPr>
-        <w:t xml:space="preserve">                  ┌────────</w:t>
-      </w:r>
-      <w:r>
-        <w:rPr>
-          <w:rFonts w:ascii="MS Gothic" w:eastAsia="MS Gothic" w:hAnsi="MS Gothic" w:cs="MS Gothic" w:hint="eastAsia"/>
-          <w:noProof/>
-          <w:sz w:val="24"/>
-          <w:szCs w:val="24"/>
-          <w:lang w:val="tr-TR"/>
-        </w:rPr>
-        <w:t>┴</w:t>
-      </w:r>
-      <w:r>
-        <w:rPr>
-          <w:rFonts w:ascii="Calibri" w:hAnsi="Calibri" w:cs="Calibri"/>
-          <w:noProof/>
-          <w:sz w:val="24"/>
-          <w:szCs w:val="24"/>
-          <w:lang w:val="tr-TR"/>
-        </w:rPr>
-        <w:t>────────┐</w:t>
-      </w:r>
-    </w:p>
-    <w:p>
-      <w:pPr>
-        <w:spacing w:after="0" w:line="240" w:lineRule="auto"/>
-        <w:rPr>
-          <w:noProof/>
-          <w:sz w:val="24"/>
-          <w:szCs w:val="24"/>
-          <w:lang w:val="tr-TR"/>
-        </w:rPr>
-      </w:pPr>
-      <w:r>
-        <w:rPr>
-          <w:noProof/>
-          <w:sz w:val="24"/>
-          <w:szCs w:val="24"/>
-          <w:lang w:val="tr-TR"/>
-        </w:rPr>
-        <w:t xml:space="preserve">      </w:t>
-      </w:r>
-      <w:r>
-        <w:rPr>
-          <w:noProof/>
-          <w:sz w:val="24"/>
-          <w:szCs w:val="24"/>
-          <w:lang w:val="tr-TR"/>
-        </w:rPr>
-        <w:t xml:space="preserve">                                                                 </w:t>
-      </w:r>
-      <w:r>
-        <w:rPr>
-          <w:noProof/>
-          <w:sz w:val="24"/>
-          <w:szCs w:val="24"/>
-          <w:lang w:val="tr-TR"/>
-        </w:rPr>
-        <w:t xml:space="preserve">│ </w:t>
-      </w:r>
-      <w:r>
-        <w:rPr>
-          <w:noProof/>
-          <w:sz w:val="24"/>
-          <w:szCs w:val="24"/>
-          <w:lang w:val="tr-TR"/>
-        </w:rPr>
-        <w:t xml:space="preserve">      </w:t>
-      </w:r>
-      <w:r>
-        <w:rPr>
-          <w:noProof/>
-          <w:sz w:val="24"/>
-          <w:szCs w:val="24"/>
-          <w:lang w:val="tr-TR"/>
-        </w:rPr>
-        <w:t xml:space="preserve">historical data </w:t>
-      </w:r>
-      <w:r>
-        <w:rPr>
-          <w:noProof/>
-          <w:sz w:val="24"/>
-          <w:szCs w:val="24"/>
-          <w:lang w:val="tr-TR"/>
-        </w:rPr>
-        <w:t xml:space="preserve">      </w:t>
-      </w:r>
-      <w:r>
-        <w:rPr>
-          <w:noProof/>
-          <w:sz w:val="24"/>
-          <w:szCs w:val="24"/>
-          <w:lang w:val="tr-TR"/>
-        </w:rPr>
-        <w:t>│</w:t>
-      </w:r>
-    </w:p>
-    <w:p>
-      <w:pPr>
-        <w:spacing w:after="0" w:line="240" w:lineRule="auto"/>
-        <w:jc w:val="center"/>
-        <w:rPr>
-          <w:noProof/>
-          <w:sz w:val="24"/>
-          <w:szCs w:val="24"/>
-          <w:lang w:val="tr-TR"/>
-        </w:rPr>
-      </w:pPr>
-      <w:r>
-        <w:rPr>
-          <w:noProof/>
-          <w:sz w:val="24"/>
-          <w:szCs w:val="24"/>
-          <w:lang w:val="tr-TR"/>
-        </w:rPr>
-        <w:t xml:space="preserve">                  └────────</w:t>
-      </w:r>
-      <w:r>
-        <w:rPr>
-          <w:rFonts w:ascii="MS Gothic" w:eastAsia="MS Gothic" w:hAnsi="MS Gothic" w:cs="MS Gothic" w:hint="eastAsia"/>
-          <w:noProof/>
-          <w:sz w:val="24"/>
-          <w:szCs w:val="24"/>
-          <w:lang w:val="tr-TR"/>
-        </w:rPr>
-        <w:t>┬</w:t>
-      </w:r>
-      <w:r>
-        <w:rPr>
-          <w:rFonts w:ascii="Calibri" w:hAnsi="Calibri" w:cs="Calibri"/>
-          <w:noProof/>
-          <w:sz w:val="24"/>
-          <w:szCs w:val="24"/>
-          <w:lang w:val="tr-TR"/>
-        </w:rPr>
-        <w:t>────────┘</w:t>
-      </w:r>
-    </w:p>
-    <w:p>
-      <w:pPr>
-        <w:spacing w:after="0" w:line="240" w:lineRule="auto"/>
-        <w:jc w:val="center"/>
-        <w:rPr>
-          <w:noProof/>
-          <w:sz w:val="24"/>
-          <w:szCs w:val="24"/>
-          <w:lang w:val="tr-TR"/>
-        </w:rPr>
-      </w:pPr>
-      <w:r>
-        <w:rPr>
-          <w:noProof/>
-          <w:sz w:val="24"/>
-          <w:szCs w:val="24"/>
-          <w:lang w:val="tr-TR"/>
-        </w:rPr>
-        <w:t xml:space="preserve">                  │</w:t>
-      </w:r>
-    </w:p>
-    <w:p>
-      <w:pPr>
-        <w:spacing w:after="0" w:line="240" w:lineRule="auto"/>
-        <w:jc w:val="center"/>
-        <w:rPr>
-          <w:noProof/>
-          <w:sz w:val="24"/>
-          <w:szCs w:val="24"/>
-          <w:lang w:val="tr-TR"/>
-        </w:rPr>
-      </w:pPr>
-      <w:r>
-        <w:rPr>
-          <w:noProof/>
-          <w:sz w:val="24"/>
-          <w:szCs w:val="24"/>
-          <w:lang w:val="tr-TR"/>
-        </w:rPr>
-        <w:t xml:space="preserve">                 optimization region</w:t>
-      </w:r>
-    </w:p>
-    <w:p>
-      <w:pPr>
-        <w:spacing w:after="0" w:line="240" w:lineRule="auto"/>
-        <w:jc w:val="center"/>
-        <w:rPr>
-          <w:noProof/>
-          <w:sz w:val="24"/>
-          <w:szCs w:val="24"/>
-          <w:lang w:val="tr-TR"/>
-        </w:rPr>
-      </w:pPr>
-      <w:r>
-        <w:rPr>
-          <w:noProof/>
-          <w:sz w:val="24"/>
-          <w:szCs w:val="24"/>
-          <w:lang w:val="tr-TR"/>
-        </w:rPr>
-        <w:t xml:space="preserve">                │</w:t>
-      </w:r>
-    </w:p>
-    <w:p>
-      <w:pPr>
-        <w:spacing w:after="0" w:line="240" w:lineRule="auto"/>
-        <w:jc w:val="center"/>
-        <w:rPr>
-          <w:noProof/>
-          <w:sz w:val="24"/>
-          <w:szCs w:val="24"/>
-          <w:lang w:val="tr-TR"/>
-        </w:rPr>
-      </w:pPr>
-      <w:r>
-        <w:rPr>
-          <w:noProof/>
-          <w:sz w:val="24"/>
-          <w:szCs w:val="24"/>
-          <w:lang w:val="tr-TR"/>
-        </w:rPr>
-        <w:t xml:space="preserve">              ┌────────────</w:t>
-      </w:r>
-      <w:r>
-        <w:rPr>
-          <w:rFonts w:ascii="MS Gothic" w:eastAsia="MS Gothic" w:hAnsi="MS Gothic" w:cs="MS Gothic" w:hint="eastAsia"/>
-          <w:noProof/>
-          <w:sz w:val="24"/>
-          <w:szCs w:val="24"/>
-          <w:lang w:val="tr-TR"/>
-        </w:rPr>
-        <w:t>┴</w:t>
-      </w:r>
-      <w:r>
-        <w:rPr>
-          <w:rFonts w:ascii="Calibri" w:hAnsi="Calibri" w:cs="Calibri"/>
-          <w:noProof/>
-          <w:sz w:val="24"/>
-          <w:szCs w:val="24"/>
-          <w:lang w:val="tr-TR"/>
-        </w:rPr>
-        <w:t>────────────┐</w:t>
-      </w:r>
-    </w:p>
-    <w:p>
-      <w:pPr>
-        <w:spacing w:after="0" w:line="240" w:lineRule="auto"/>
-        <w:rPr>
-          <w:noProof/>
-          <w:sz w:val="24"/>
-          <w:szCs w:val="24"/>
-          <w:lang w:val="tr-TR"/>
-        </w:rPr>
-      </w:pPr>
-      <w:r>
-        <w:rPr>
-          <w:noProof/>
-          <w:sz w:val="24"/>
-          <w:szCs w:val="24"/>
-          <w:lang w:val="tr-TR"/>
-        </w:rPr>
-        <w:t xml:space="preserve">                                                            </w:t>
-      </w:r>
-      <w:r>
-        <w:rPr>
-          <w:noProof/>
-          <w:sz w:val="24"/>
-          <w:szCs w:val="24"/>
-          <w:lang w:val="tr-TR"/>
-        </w:rPr>
-        <w:t xml:space="preserve">│                         </w:t>
-      </w:r>
-      <w:r>
-        <w:rPr>
-          <w:noProof/>
-          <w:sz w:val="24"/>
-          <w:szCs w:val="24"/>
-          <w:lang w:val="tr-TR"/>
-        </w:rPr>
-        <w:t xml:space="preserve">                                </w:t>
-      </w:r>
-      <w:r>
-        <w:rPr>
-          <w:noProof/>
-          <w:sz w:val="24"/>
-          <w:szCs w:val="24"/>
-          <w:lang w:val="tr-TR"/>
-        </w:rPr>
-        <w:t>│</w:t>
-      </w:r>
-    </w:p>
-    <w:p>
-      <w:pPr>
-        <w:spacing w:after="0" w:line="240" w:lineRule="auto"/>
-        <w:rPr>
-          <w:noProof/>
-          <w:sz w:val="24"/>
-          <w:szCs w:val="24"/>
-          <w:lang w:val="tr-TR"/>
-        </w:rPr>
-      </w:pPr>
-      <w:r>
-        <w:rPr>
-          <w:noProof/>
-          <w:sz w:val="24"/>
-          <w:szCs w:val="24"/>
-          <w:lang w:val="tr-TR"/>
-        </w:rPr>
-        <w:t xml:space="preserve">         </w:t>
-      </w:r>
-      <w:r>
-        <w:rPr>
-          <w:noProof/>
-          <w:sz w:val="24"/>
-          <w:szCs w:val="24"/>
-          <w:lang w:val="tr-TR"/>
-        </w:rPr>
-        <w:t xml:space="preserve">                                          </w:t>
-      </w:r>
-      <w:r>
-        <w:rPr>
-          <w:noProof/>
-          <w:sz w:val="24"/>
-          <w:szCs w:val="24"/>
-          <w:lang w:val="tr-TR"/>
-        </w:rPr>
-        <w:t xml:space="preserve">candidate A               </w:t>
-      </w:r>
-      <w:r>
-        <w:rPr>
-          <w:noProof/>
-          <w:sz w:val="24"/>
-          <w:szCs w:val="24"/>
-          <w:lang w:val="tr-TR"/>
-        </w:rPr>
-        <w:t xml:space="preserve">                     </w:t>
-      </w:r>
-      <w:r>
-        <w:rPr>
-          <w:noProof/>
-          <w:sz w:val="24"/>
-          <w:szCs w:val="24"/>
-          <w:lang w:val="tr-TR"/>
-        </w:rPr>
-        <w:t>candidate B</w:t>
-      </w:r>
-    </w:p>
-    <w:p>
-      <w:pPr>
-        <w:spacing w:after="0" w:line="240" w:lineRule="auto"/>
-        <w:rPr>
-          <w:noProof/>
-          <w:sz w:val="24"/>
-          <w:szCs w:val="24"/>
-          <w:lang w:val="tr-TR"/>
-        </w:rPr>
-      </w:pPr>
-      <w:r>
-        <w:rPr>
-          <w:noProof/>
-          <w:sz w:val="24"/>
-          <w:szCs w:val="24"/>
-          <w:lang w:val="tr-TR"/>
-        </w:rPr>
-        <w:t xml:space="preserve">              </w:t>
-      </w:r>
-      <w:r>
-        <w:rPr>
-          <w:noProof/>
-          <w:sz w:val="24"/>
-          <w:szCs w:val="24"/>
-          <w:lang w:val="tr-TR"/>
-        </w:rPr>
-        <w:t xml:space="preserve">                                              </w:t>
-      </w:r>
-      <w:r>
-        <w:rPr>
-          <w:noProof/>
-          <w:sz w:val="24"/>
-          <w:szCs w:val="24"/>
-          <w:lang w:val="tr-TR"/>
-        </w:rPr>
-        <w:t xml:space="preserve">│                         </w:t>
-      </w:r>
-      <w:r>
-        <w:rPr>
-          <w:noProof/>
-          <w:sz w:val="24"/>
-          <w:szCs w:val="24"/>
-          <w:lang w:val="tr-TR"/>
-        </w:rPr>
-        <w:t xml:space="preserve">                                </w:t>
-      </w:r>
-      <w:r>
-        <w:rPr>
-          <w:noProof/>
-          <w:sz w:val="24"/>
-          <w:szCs w:val="24"/>
-          <w:lang w:val="tr-TR"/>
-        </w:rPr>
-        <w:t>│</w:t>
-      </w:r>
-    </w:p>
-    <w:p>
-      <w:pPr>
-        <w:spacing w:after="0" w:line="240" w:lineRule="auto"/>
-        <w:rPr>
-          <w:noProof/>
-          <w:sz w:val="24"/>
-          <w:szCs w:val="24"/>
-          <w:lang w:val="tr-TR"/>
-        </w:rPr>
-      </w:pPr>
-      <w:r>
-        <w:rPr>
-          <w:noProof/>
-          <w:sz w:val="24"/>
-          <w:szCs w:val="24"/>
-          <w:lang w:val="tr-TR"/>
-        </w:rPr>
-        <w:t xml:space="preserve">        </w:t>
-      </w:r>
-      <w:r>
-        <w:rPr>
-          <w:noProof/>
-          <w:sz w:val="24"/>
-          <w:szCs w:val="24"/>
-          <w:lang w:val="tr-TR"/>
-        </w:rPr>
-        <w:t xml:space="preserve">                                      </w:t>
-      </w:r>
-      <w:r>
-        <w:rPr>
-          <w:noProof/>
-          <w:sz w:val="24"/>
-          <w:szCs w:val="24"/>
-          <w:lang w:val="tr-TR"/>
-        </w:rPr>
-        <w:t xml:space="preserve">internal temporal        </w:t>
-      </w:r>
-      <w:r>
-        <w:rPr>
-          <w:noProof/>
-          <w:sz w:val="24"/>
-          <w:szCs w:val="24"/>
-          <w:lang w:val="tr-TR"/>
-        </w:rPr>
-        <w:t xml:space="preserve">                </w:t>
-      </w:r>
-      <w:r>
-        <w:rPr>
-          <w:noProof/>
-          <w:sz w:val="24"/>
-          <w:szCs w:val="24"/>
-          <w:lang w:val="tr-TR"/>
-        </w:rPr>
-        <w:t xml:space="preserve"> </w:t>
-      </w:r>
-      <w:r>
-        <w:rPr>
-          <w:noProof/>
-          <w:sz w:val="24"/>
-          <w:szCs w:val="24"/>
-          <w:lang w:val="tr-TR"/>
-        </w:rPr>
-        <w:t xml:space="preserve">   </w:t>
-      </w:r>
-      <w:r>
-        <w:rPr>
-          <w:noProof/>
-          <w:sz w:val="24"/>
-          <w:szCs w:val="24"/>
-          <w:lang w:val="tr-TR"/>
-        </w:rPr>
-        <w:t>internal temporal</w:t>
-      </w:r>
-    </w:p>
-    <w:p>
-      <w:pPr>
-        <w:spacing w:after="0" w:line="240" w:lineRule="auto"/>
-        <w:rPr>
-          <w:noProof/>
-          <w:sz w:val="24"/>
-          <w:szCs w:val="24"/>
-          <w:lang w:val="tr-TR"/>
-        </w:rPr>
-      </w:pPr>
-      <w:r>
-        <w:rPr>
-          <w:noProof/>
-          <w:sz w:val="24"/>
-          <w:szCs w:val="24"/>
-          <w:lang w:val="tr-TR"/>
-        </w:rPr>
-        <w:t xml:space="preserve">          </w:t>
-      </w:r>
-      <w:r>
-        <w:rPr>
-          <w:noProof/>
-          <w:sz w:val="24"/>
-          <w:szCs w:val="24"/>
-          <w:lang w:val="tr-TR"/>
-        </w:rPr>
-        <w:t xml:space="preserve">                                           </w:t>
-      </w:r>
-      <w:r>
-        <w:rPr>
-          <w:noProof/>
-          <w:sz w:val="24"/>
-          <w:szCs w:val="24"/>
-          <w:lang w:val="tr-TR"/>
-        </w:rPr>
-        <w:t xml:space="preserve">validation                </w:t>
-      </w:r>
-      <w:r>
-        <w:rPr>
-          <w:noProof/>
-          <w:sz w:val="24"/>
-          <w:szCs w:val="24"/>
-          <w:lang w:val="tr-TR"/>
-        </w:rPr>
-        <w:t xml:space="preserve">                       </w:t>
-      </w:r>
-      <w:r>
-        <w:rPr>
-          <w:noProof/>
-          <w:sz w:val="24"/>
-          <w:szCs w:val="24"/>
-          <w:lang w:val="tr-TR"/>
-        </w:rPr>
-        <w:t>validation</w:t>
-      </w:r>
-    </w:p>
-    <w:p>
-      <w:pPr>
-        <w:spacing w:after="0" w:line="240" w:lineRule="auto"/>
-        <w:rPr>
-          <w:noProof/>
-          <w:sz w:val="24"/>
-          <w:szCs w:val="24"/>
-          <w:lang w:val="tr-TR"/>
-        </w:rPr>
-      </w:pPr>
-      <w:r>
-        <w:rPr>
-          <w:noProof/>
-          <w:sz w:val="24"/>
-          <w:szCs w:val="24"/>
-          <w:lang w:val="tr-TR"/>
-        </w:rPr>
-        <w:t xml:space="preserve">              </w:t>
-      </w:r>
-      <w:r>
-        <w:rPr>
-          <w:noProof/>
-          <w:sz w:val="24"/>
-          <w:szCs w:val="24"/>
-          <w:lang w:val="tr-TR"/>
-        </w:rPr>
-        <w:t xml:space="preserve">                                              </w:t>
-      </w:r>
-      <w:r>
-        <w:rPr>
-          <w:noProof/>
-          <w:sz w:val="24"/>
-          <w:szCs w:val="24"/>
-          <w:lang w:val="tr-TR"/>
-        </w:rPr>
-        <w:t xml:space="preserve">│                         </w:t>
-      </w:r>
-      <w:r>
-        <w:rPr>
-          <w:noProof/>
-          <w:sz w:val="24"/>
-          <w:szCs w:val="24"/>
-          <w:lang w:val="tr-TR"/>
-        </w:rPr>
-        <w:t xml:space="preserve">                                </w:t>
-      </w:r>
-      <w:r>
-        <w:rPr>
-          <w:noProof/>
-          <w:sz w:val="24"/>
-          <w:szCs w:val="24"/>
-          <w:lang w:val="tr-TR"/>
-        </w:rPr>
-        <w:t>│</w:t>
-      </w:r>
-    </w:p>
-    <w:p>
-      <w:pPr>
-        <w:spacing w:after="0" w:line="240" w:lineRule="auto"/>
-        <w:jc w:val="center"/>
-        <w:rPr>
-          <w:noProof/>
-          <w:sz w:val="24"/>
-          <w:szCs w:val="24"/>
-          <w:lang w:val="tr-TR"/>
-        </w:rPr>
-      </w:pPr>
-      <w:r>
-        <w:rPr>
-          <w:noProof/>
-          <w:sz w:val="24"/>
-          <w:szCs w:val="24"/>
-          <w:lang w:val="tr-TR"/>
-        </w:rPr>
-        <w:t xml:space="preserve">              └────────────</w:t>
-      </w:r>
-      <w:r>
-        <w:rPr>
-          <w:rFonts w:ascii="MS Gothic" w:eastAsia="MS Gothic" w:hAnsi="MS Gothic" w:cs="MS Gothic" w:hint="eastAsia"/>
-          <w:noProof/>
-          <w:sz w:val="24"/>
-          <w:szCs w:val="24"/>
-          <w:lang w:val="tr-TR"/>
-        </w:rPr>
-        <w:t>┬</w:t>
-      </w:r>
-      <w:r>
-        <w:rPr>
-          <w:rFonts w:ascii="Calibri" w:hAnsi="Calibri" w:cs="Calibri"/>
-          <w:noProof/>
-          <w:sz w:val="24"/>
-          <w:szCs w:val="24"/>
-          <w:lang w:val="tr-TR"/>
-        </w:rPr>
-        <w:t>────────────┘</w:t>
-      </w:r>
-    </w:p>
-    <w:p>
-      <w:pPr>
-        <w:spacing w:after="0" w:line="240" w:lineRule="auto"/>
-        <w:jc w:val="center"/>
-        <w:rPr>
-          <w:noProof/>
-          <w:sz w:val="24"/>
-          <w:szCs w:val="24"/>
-          <w:lang w:val="tr-TR"/>
-        </w:rPr>
-      </w:pPr>
-      <w:r>
-        <w:rPr>
-          <w:noProof/>
-          <w:sz w:val="24"/>
-          <w:szCs w:val="24"/>
-          <w:lang w:val="tr-TR"/>
-        </w:rPr>
-        <w:t xml:space="preserve">              │</w:t>
-      </w:r>
-    </w:p>
-    <w:p>
-      <w:pPr>
-        <w:spacing w:after="0" w:line="240" w:lineRule="auto"/>
-        <w:jc w:val="center"/>
-        <w:rPr>
-          <w:noProof/>
-          <w:sz w:val="24"/>
-          <w:szCs w:val="24"/>
-          <w:lang w:val="tr-TR"/>
-        </w:rPr>
-      </w:pPr>
-      <w:r>
-        <w:rPr>
-          <w:noProof/>
-          <w:sz w:val="24"/>
-          <w:szCs w:val="24"/>
-          <w:lang w:val="tr-TR"/>
-        </w:rPr>
-        <w:t xml:space="preserve">           select best</w:t>
-      </w:r>
-    </w:p>
-    <w:p>
-      <w:pPr>
-        <w:spacing w:after="0" w:line="240" w:lineRule="auto"/>
-        <w:jc w:val="center"/>
-        <w:rPr>
-          <w:noProof/>
-          <w:sz w:val="24"/>
-          <w:szCs w:val="24"/>
-          <w:lang w:val="tr-TR"/>
-        </w:rPr>
-      </w:pPr>
-      <w:r>
-        <w:rPr>
-          <w:noProof/>
-          <w:sz w:val="24"/>
-          <w:szCs w:val="24"/>
-          <w:lang w:val="tr-TR"/>
-        </w:rPr>
-        <w:t xml:space="preserve">              │</w:t>
-      </w:r>
-    </w:p>
-    <w:p>
-      <w:pPr>
-        <w:spacing w:after="0" w:line="240" w:lineRule="auto"/>
-        <w:jc w:val="center"/>
-        <w:rPr>
-          <w:noProof/>
-          <w:sz w:val="24"/>
-          <w:szCs w:val="24"/>
-          <w:lang w:val="tr-TR"/>
-        </w:rPr>
-      </w:pPr>
-      <w:r>
-        <w:rPr>
-          <w:noProof/>
-          <w:sz w:val="24"/>
-          <w:szCs w:val="24"/>
-          <w:lang w:val="tr-TR"/>
-        </w:rPr>
-        <w:t xml:space="preserve">              </w:t>
-      </w:r>
-      <w:r>
-        <w:rPr>
-          <w:rFonts w:ascii="Arial" w:hAnsi="Arial" w:cs="Arial"/>
-          <w:noProof/>
-          <w:sz w:val="24"/>
-          <w:szCs w:val="24"/>
-          <w:lang w:val="tr-TR"/>
-        </w:rPr>
-        <w:t>▼</w:t>
-      </w:r>
-    </w:p>
-    <w:p>
-      <w:pPr>
-        <w:spacing w:after="0" w:line="240" w:lineRule="auto"/>
-        <w:jc w:val="center"/>
-        <w:rPr>
-          <w:noProof/>
-          <w:sz w:val="24"/>
-          <w:szCs w:val="24"/>
-          <w:lang w:val="tr-TR"/>
-        </w:rPr>
-      </w:pPr>
-      <w:r>
-        <w:rPr>
-          <w:noProof/>
-          <w:sz w:val="24"/>
-          <w:szCs w:val="24"/>
-          <w:lang w:val="tr-TR"/>
-        </w:rPr>
-        <w:t xml:space="preserve">        OptimizationResult</w:t>
-      </w:r>
-    </w:p>
-    <w:p>
-      <w:pPr>
-        <w:spacing w:after="0" w:line="240" w:lineRule="auto"/>
-        <w:jc w:val="center"/>
-        <w:rPr>
-          <w:noProof/>
-          <w:sz w:val="24"/>
-          <w:szCs w:val="24"/>
-          <w:lang w:val="tr-TR"/>
-        </w:rPr>
-      </w:pPr>
-      <w:r>
-        <w:rPr>
-          <w:noProof/>
-          <w:sz w:val="24"/>
-          <w:szCs w:val="24"/>
-          <w:lang w:val="tr-TR"/>
-        </w:rPr>
-        <w:t xml:space="preserve">              │</w:t>
-      </w:r>
-    </w:p>
-    <w:p>
-      <w:pPr>
-        <w:spacing w:after="0" w:line="240" w:lineRule="auto"/>
-        <w:jc w:val="center"/>
-        <w:rPr>
-          <w:noProof/>
-          <w:sz w:val="24"/>
-          <w:szCs w:val="24"/>
-          <w:lang w:val="tr-TR"/>
-        </w:rPr>
-      </w:pPr>
-      <w:r>
-        <w:rPr>
-          <w:noProof/>
-          <w:sz w:val="24"/>
-          <w:szCs w:val="24"/>
-          <w:lang w:val="tr-TR"/>
-        </w:rPr>
-        <w:t xml:space="preserve">              </w:t>
-      </w:r>
-      <w:r>
-        <w:rPr>
-          <w:rFonts w:ascii="Arial" w:hAnsi="Arial" w:cs="Arial"/>
-          <w:noProof/>
-          <w:sz w:val="24"/>
-          <w:szCs w:val="24"/>
-          <w:lang w:val="tr-TR"/>
-        </w:rPr>
-        <w:t>▼</w:t>
-      </w:r>
-    </w:p>
-    <w:p>
-      <w:pPr>
-        <w:spacing w:after="0" w:line="240" w:lineRule="auto"/>
-        <w:jc w:val="center"/>
-        <w:rPr>
-          <w:noProof/>
-          <w:sz w:val="24"/>
-          <w:szCs w:val="24"/>
-          <w:lang w:val="tr-TR"/>
-        </w:rPr>
-      </w:pPr>
-      <w:r>
-        <w:rPr>
-          <w:noProof/>
-          <w:sz w:val="24"/>
-          <w:szCs w:val="24"/>
-          <w:lang w:val="tr-TR"/>
-        </w:rPr>
-        <w:t xml:space="preserve">         selected config</w:t>
-      </w:r>
-    </w:p>
-    <w:p>
-      <w:pPr>
-        <w:spacing w:after="0" w:line="240" w:lineRule="auto"/>
-        <w:jc w:val="center"/>
-        <w:rPr>
-          <w:noProof/>
-          <w:sz w:val="24"/>
-          <w:szCs w:val="24"/>
-          <w:lang w:val="tr-TR"/>
-        </w:rPr>
-      </w:pPr>
-      <w:r>
-        <w:rPr>
-          <w:noProof/>
-          <w:sz w:val="24"/>
-          <w:szCs w:val="24"/>
-          <w:lang w:val="tr-TR"/>
-        </w:rPr>
-        <w:t xml:space="preserve">               │</w:t>
-      </w:r>
-    </w:p>
-    <w:p>
-      <w:pPr>
-        <w:spacing w:after="0" w:line="240" w:lineRule="auto"/>
-        <w:jc w:val="center"/>
-        <w:rPr>
-          <w:noProof/>
-          <w:sz w:val="24"/>
-          <w:szCs w:val="24"/>
-          <w:lang w:val="tr-TR"/>
-        </w:rPr>
-      </w:pPr>
-      <w:r>
-        <w:rPr>
-          <w:noProof/>
-          <w:sz w:val="24"/>
-          <w:szCs w:val="24"/>
-          <w:lang w:val="tr-TR"/>
-        </w:rPr>
-        <w:t xml:space="preserve">              </w:t>
-      </w:r>
-      <w:r>
-        <w:rPr>
-          <w:noProof/>
-          <w:sz w:val="24"/>
-          <w:szCs w:val="24"/>
-          <w:lang w:val="tr-TR"/>
-        </w:rPr>
-        <w:t xml:space="preserve"> </w:t>
-      </w:r>
-      <w:r>
-        <w:rPr>
-          <w:rFonts w:ascii="Arial" w:hAnsi="Arial" w:cs="Arial"/>
-          <w:noProof/>
-          <w:sz w:val="24"/>
-          <w:szCs w:val="24"/>
-          <w:lang w:val="tr-TR"/>
-        </w:rPr>
-        <w:t>▼</w:t>
-      </w:r>
-    </w:p>
-    <w:p>
-      <w:pPr>
-        <w:spacing w:after="0" w:line="240" w:lineRule="auto"/>
-        <w:jc w:val="center"/>
-        <w:rPr>
-          <w:noProof/>
-          <w:sz w:val="24"/>
-          <w:szCs w:val="24"/>
-          <w:lang w:val="tr-TR"/>
-        </w:rPr>
-      </w:pPr>
-      <w:r>
-        <w:rPr>
-          <w:noProof/>
-          <w:sz w:val="24"/>
-          <w:szCs w:val="24"/>
-          <w:lang w:val="tr-TR"/>
-        </w:rPr>
-        <w:t xml:space="preserve">              standardized final benchmark</w:t>
-      </w:r>
-    </w:p>
-    <w:p>
-      <w:pPr>
-        <w:spacing w:after="0" w:line="240" w:lineRule="auto"/>
-        <w:jc w:val="center"/>
-        <w:rPr>
-          <w:noProof/>
-          <w:sz w:val="24"/>
-          <w:szCs w:val="24"/>
-          <w:lang w:val="tr-TR"/>
-        </w:rPr>
-      </w:pPr>
-      <w:r>
-        <w:rPr>
-          <w:noProof/>
-          <w:sz w:val="24"/>
-          <w:szCs w:val="24"/>
-          <w:lang w:val="tr-TR"/>
-        </w:rPr>
-        <w:t xml:space="preserve">                  ForecastEvaluator</w:t>
-      </w:r>
-    </w:p>
-    <w:p>
-      <w:pPr>
-        <w:spacing w:after="0" w:line="240" w:lineRule="auto"/>
-        <w:jc w:val="center"/>
-        <w:rPr>
-          <w:noProof/>
-          <w:sz w:val="24"/>
-          <w:szCs w:val="24"/>
-          <w:lang w:val="tr-TR"/>
-        </w:rPr>
-      </w:pPr>
-    </w:p>
-    <w:p>
-      <w:pPr>
-        <w:rPr>
-          <w:noProof/>
-          <w:sz w:val="24"/>
-          <w:szCs w:val="24"/>
-          <w:lang w:val="tr-TR"/>
-        </w:rPr>
-      </w:pPr>
-    </w:p>
-    <w:p>
-      <w:pPr>
-        <w:rPr>
-          <w:noProof/>
-          <w:sz w:val="24"/>
-          <w:szCs w:val="24"/>
-          <w:lang w:val="tr-TR"/>
-        </w:rPr>
-      </w:pPr>
-      <w:r>
-        <w:rPr>
-          <w:noProof/>
-          <w:sz w:val="24"/>
-          <w:szCs w:val="24"/>
-          <w:lang w:val="tr-TR"/>
-        </w:rPr>
-        <w:br w:type="page"/>
-      </w:r>
-    </w:p>
-    <w:p>
-      <w:pPr>
-        <w:spacing w:after="0" w:line="240" w:lineRule="auto"/>
-        <w:jc w:val="center"/>
+      </w:pPr>
+      <w:r>
         <w:rPr>
           <w:b/>
           <w:bCs/>
@@ -37275,67 +37274,8 @@
           <w:u w:val="single"/>
           <w:lang w:val="tr-TR"/>
         </w:rPr>
-      </w:pPr>
-      <w:r>
-        <w:rPr>
-          <w:b/>
-          <w:bCs/>
-          <w:noProof/>
-          <w:sz w:val="32"/>
-          <w:szCs w:val="32"/>
-          <w:u w:val="single"/>
-          <w:lang w:val="tr-TR"/>
-        </w:rPr>
         <w:lastRenderedPageBreak/>
-        <w:t>S</w:t>
-      </w:r>
-      <w:r>
-        <w:rPr>
-          <w:b/>
-          <w:bCs/>
-          <w:noProof/>
-          <w:sz w:val="32"/>
-          <w:szCs w:val="32"/>
-          <w:u w:val="single"/>
-          <w:lang w:val="tr-TR"/>
-        </w:rPr>
-        <w:t xml:space="preserve">cientific </w:t>
-      </w:r>
-      <w:r>
-        <w:rPr>
-          <w:b/>
-          <w:bCs/>
-          <w:noProof/>
-          <w:sz w:val="32"/>
-          <w:szCs w:val="32"/>
-          <w:u w:val="single"/>
-          <w:lang w:val="tr-TR"/>
-        </w:rPr>
-        <w:t>C</w:t>
-      </w:r>
-      <w:r>
-        <w:rPr>
-          <w:b/>
-          <w:bCs/>
-          <w:noProof/>
-          <w:sz w:val="32"/>
-          <w:szCs w:val="32"/>
-          <w:u w:val="single"/>
-          <w:lang w:val="tr-TR"/>
-        </w:rPr>
-        <w:t>ontract</w:t>
-      </w:r>
-      <w:r>
-        <w:rPr>
-          <w:b/>
-          <w:bCs/>
-          <w:noProof/>
-          <w:sz w:val="32"/>
-          <w:szCs w:val="32"/>
-          <w:u w:val="single"/>
-          <w:lang w:val="tr-TR"/>
-        </w:rPr>
-        <w:t xml:space="preserve"> for Optimization:</w:t>
+        <w:t>Scientific Contract for Optimization:</w:t>
       </w:r>
     </w:p>
     <w:p>
@@ -41903,6 +41843,9 @@
             </m:e>
           </m:d>
           <m:r>
+            <m:rPr>
+              <m:sty m:val="p"/>
+            </m:rPr>
             <w:rPr>
               <w:noProof/>
               <w:lang w:val="tr-TR"/>
@@ -43600,19 +43543,7 @@
           <w:u w:val="single"/>
           <w:lang w:val="tr-TR"/>
         </w:rPr>
-        <w:t>T</w:t>
-      </w:r>
-      <w:r>
-        <w:rPr>
-          <w:b/>
-          <w:bCs/>
-          <w:noProof/>
-          <w:sz w:val="32"/>
-          <w:szCs w:val="32"/>
-          <w:u w:val="single"/>
-          <w:lang w:val="tr-TR"/>
-        </w:rPr>
-        <w:t>here is a common signal:</w:t>
+        <w:t>There is a common signal:</w:t>
       </w:r>
     </w:p>
     <w:p>
@@ -44180,31 +44111,7 @@
           <w:u w:val="single"/>
           <w:lang w:val="tr-TR"/>
         </w:rPr>
-        <w:t>B</w:t>
-      </w:r>
-      <w:r>
-        <w:rPr>
-          <w:b/>
-          <w:bCs/>
-          <w:noProof/>
-          <w:sz w:val="32"/>
-          <w:szCs w:val="32"/>
-          <w:u w:val="single"/>
-          <w:lang w:val="tr-TR"/>
-        </w:rPr>
-        <w:t>ehavior for Kalman and neural optimization</w:t>
-      </w:r>
-      <w:r>
-        <w:rPr>
-          <w:b/>
-          <w:bCs/>
-          <w:noProof/>
-          <w:sz w:val="32"/>
-          <w:szCs w:val="32"/>
-          <w:u w:val="single"/>
-          <w:lang w:val="tr-TR"/>
-        </w:rPr>
-        <w:t>:</w:t>
+        <w:t>Behavior for Kalman and neural optimization:</w:t>
       </w:r>
     </w:p>
     <w:p>
@@ -45198,6 +45105,612 @@
           <w:lang w:val="tr-TR"/>
         </w:rPr>
       </w:pPr>
+    </w:p>
+    <w:p>
+      <w:pPr>
+        <w:rPr>
+          <w:noProof/>
+          <w:lang w:val="tr-TR"/>
+        </w:rPr>
+      </w:pPr>
+      <w:r>
+        <w:rPr>
+          <w:noProof/>
+          <w:lang w:val="tr-TR"/>
+        </w:rPr>
+        <w:br w:type="page"/>
+      </w:r>
+    </w:p>
+    <w:p>
+      <w:pPr>
+        <w:spacing w:after="0" w:line="240" w:lineRule="auto"/>
+        <w:rPr>
+          <w:b/>
+          <w:bCs/>
+          <w:noProof/>
+          <w:sz w:val="32"/>
+          <w:szCs w:val="32"/>
+          <w:u w:val="single"/>
+          <w:lang w:val="tr-TR"/>
+        </w:rPr>
+      </w:pPr>
+      <w:r>
+        <w:rPr>
+          <w:b/>
+          <w:bCs/>
+          <w:noProof/>
+          <w:sz w:val="32"/>
+          <w:szCs w:val="32"/>
+          <w:u w:val="single"/>
+          <w:lang w:val="tr-TR"/>
+        </w:rPr>
+        <w:lastRenderedPageBreak/>
+        <w:t>Scientific observations worth preserving</w:t>
+      </w:r>
+    </w:p>
+    <w:p>
+      <w:pPr>
+        <w:spacing w:after="0" w:line="240" w:lineRule="auto"/>
+        <w:rPr>
+          <w:b/>
+          <w:bCs/>
+          <w:noProof/>
+          <w:lang w:val="tr-TR"/>
+        </w:rPr>
+      </w:pPr>
+    </w:p>
+    <w:p>
+      <w:pPr>
+        <w:spacing w:after="0" w:line="240" w:lineRule="auto"/>
+        <w:rPr>
+          <w:noProof/>
+          <w:lang w:val="tr-TR"/>
+        </w:rPr>
+      </w:pPr>
+      <w:r>
+        <w:rPr>
+          <w:noProof/>
+          <w:lang w:val="tr-TR"/>
+        </w:rPr>
+        <w:t>The two datasets tell substantially different stories.</w:t>
+      </w:r>
+    </w:p>
+    <w:p>
+      <w:pPr>
+        <w:spacing w:after="0" w:line="240" w:lineRule="auto"/>
+        <w:rPr>
+          <w:noProof/>
+          <w:lang w:val="tr-TR"/>
+        </w:rPr>
+      </w:pPr>
+    </w:p>
+    <w:p>
+      <w:pPr>
+        <w:spacing w:after="0" w:line="240" w:lineRule="auto"/>
+        <w:rPr>
+          <w:noProof/>
+          <w:lang w:val="tr-TR"/>
+        </w:rPr>
+      </w:pPr>
+      <w:r>
+        <w:rPr>
+          <w:noProof/>
+          <w:lang w:val="tr-TR"/>
+        </w:rPr>
+        <w:t xml:space="preserve">For </w:t>
+      </w:r>
+      <w:r>
+        <w:rPr>
+          <w:b/>
+          <w:bCs/>
+          <w:noProof/>
+          <w:lang w:val="tr-TR"/>
+        </w:rPr>
+        <w:t>410</w:t>
+      </w:r>
+      <w:r>
+        <w:rPr>
+          <w:noProof/>
+          <w:lang w:val="tr-TR"/>
+        </w:rPr>
+        <w:t>, the hybrid forecasts preserve the increasing degradation trajectory better than the standalone neural models. LSTM and GRU increasingly underpredict across the six-step horizon. KalmanLSTM has the lowest final RMSE here, although it initially overpredicts and then approaches the observations.</w:t>
+      </w:r>
+    </w:p>
+    <w:p>
+      <w:pPr>
+        <w:spacing w:after="0" w:line="240" w:lineRule="auto"/>
+        <w:rPr>
+          <w:noProof/>
+          <w:lang w:val="tr-TR"/>
+        </w:rPr>
+      </w:pPr>
+    </w:p>
+    <w:p>
+      <w:pPr>
+        <w:spacing w:after="0" w:line="240" w:lineRule="auto"/>
+        <w:rPr>
+          <w:noProof/>
+          <w:lang w:val="tr-TR"/>
+        </w:rPr>
+      </w:pPr>
+      <w:r>
+        <w:rPr>
+          <w:noProof/>
+          <w:lang w:val="tr-TR"/>
+        </w:rPr>
+        <w:t xml:space="preserve">For </w:t>
+      </w:r>
+      <w:r>
+        <w:rPr>
+          <w:b/>
+          <w:bCs/>
+          <w:noProof/>
+          <w:lang w:val="tr-TR"/>
+        </w:rPr>
+        <w:t>110</w:t>
+      </w:r>
+      <w:r>
+        <w:rPr>
+          <w:noProof/>
+          <w:lang w:val="tr-TR"/>
+        </w:rPr>
+        <w:t>, Kalman tracks the five held-out observations very closely. LSTM and GRU also remain close, while both hybrid models systematically overpredict. KalmanLSTM's overprediction grows substantially across the horizon.</w:t>
+      </w:r>
+    </w:p>
+    <w:p>
+      <w:pPr>
+        <w:spacing w:after="0" w:line="240" w:lineRule="auto"/>
+        <w:rPr>
+          <w:noProof/>
+          <w:lang w:val="tr-TR"/>
+        </w:rPr>
+      </w:pPr>
+      <w:r>
+        <w:rPr>
+          <w:noProof/>
+          <w:lang w:val="tr-TR"/>
+        </w:rPr>
+        <w:t xml:space="preserve">This is useful evidence that model behavior is </w:t>
+      </w:r>
+      <w:r>
+        <w:rPr>
+          <w:b/>
+          <w:bCs/>
+          <w:noProof/>
+          <w:lang w:val="tr-TR"/>
+        </w:rPr>
+        <w:t>dataset-dependent</w:t>
+      </w:r>
+      <w:r>
+        <w:rPr>
+          <w:noProof/>
+          <w:lang w:val="tr-TR"/>
+        </w:rPr>
+        <w:t>. We should preserve it descriptively rather than turning it into new tuning rules.</w:t>
+      </w:r>
+    </w:p>
+    <w:p>
+      <w:pPr>
+        <w:spacing w:after="0" w:line="240" w:lineRule="auto"/>
+        <w:rPr>
+          <w:noProof/>
+          <w:lang w:val="tr-TR"/>
+        </w:rPr>
+      </w:pPr>
+    </w:p>
+    <w:p>
+      <w:pPr>
+        <w:spacing w:after="0" w:line="240" w:lineRule="auto"/>
+        <w:rPr>
+          <w:noProof/>
+          <w:lang w:val="tr-TR"/>
+        </w:rPr>
+      </w:pPr>
+      <w:r>
+        <w:rPr>
+          <w:noProof/>
+          <w:lang w:val="tr-TR"/>
+        </w:rPr>
+        <w:t>There is another important result from the optimization architecture itself:</w:t>
+      </w:r>
+    </w:p>
+    <w:p>
+      <w:pPr>
+        <w:spacing w:after="0" w:line="240" w:lineRule="auto"/>
+        <w:rPr>
+          <w:noProof/>
+          <w:lang w:val="tr-TR"/>
+        </w:rPr>
+      </w:pPr>
+    </w:p>
+    <w:p>
+      <w:pPr>
+        <w:spacing w:after="0" w:line="240" w:lineRule="auto"/>
+        <w:jc w:val="center"/>
+        <w:rPr>
+          <w:noProof/>
+          <w:lang w:val="tr-TR"/>
+        </w:rPr>
+      </w:pPr>
+      <w:r>
+        <w:rPr>
+          <w:noProof/>
+          <w:lang w:val="tr-TR"/>
+        </w:rPr>
+        <w:t>internal temporal validation performance</w:t>
+      </w:r>
+    </w:p>
+    <w:p>
+      <w:pPr>
+        <w:spacing w:after="0" w:line="240" w:lineRule="auto"/>
+        <w:jc w:val="center"/>
+        <w:rPr>
+          <w:noProof/>
+          <w:lang w:val="tr-TR"/>
+        </w:rPr>
+      </w:pPr>
+      <w:r>
+        <w:rPr>
+          <w:noProof/>
+          <w:lang w:val="tr-TR"/>
+        </w:rPr>
+        <w:t>≠</w:t>
+      </w:r>
+    </w:p>
+    <w:p>
+      <w:pPr>
+        <w:spacing w:after="0" w:line="240" w:lineRule="auto"/>
+        <w:jc w:val="center"/>
+        <w:rPr>
+          <w:noProof/>
+          <w:lang w:val="tr-TR"/>
+        </w:rPr>
+      </w:pPr>
+      <w:r>
+        <w:rPr>
+          <w:noProof/>
+          <w:lang w:val="tr-TR"/>
+        </w:rPr>
+        <w:t>guaranteed final benchmark performance</w:t>
+      </w:r>
+    </w:p>
+    <w:p>
+      <w:pPr>
+        <w:spacing w:after="0" w:line="240" w:lineRule="auto"/>
+        <w:jc w:val="center"/>
+        <w:rPr>
+          <w:noProof/>
+          <w:lang w:val="tr-TR"/>
+        </w:rPr>
+      </w:pPr>
+    </w:p>
+    <w:p>
+      <w:pPr>
+        <w:spacing w:after="0" w:line="240" w:lineRule="auto"/>
+        <w:rPr>
+          <w:noProof/>
+        </w:rPr>
+      </w:pPr>
+      <w:r>
+        <w:rPr>
+          <w:noProof/>
+        </w:rPr>
+        <w:t>That is exactly why keeping the final holdout untouched was worthwhile.</w:t>
+      </w:r>
+    </w:p>
+    <w:p>
+      <w:pPr>
+        <w:spacing w:after="0" w:line="240" w:lineRule="auto"/>
+        <w:rPr>
+          <w:noProof/>
+        </w:rPr>
+      </w:pPr>
+    </w:p>
+    <w:p>
+      <w:pPr>
+        <w:spacing w:after="0" w:line="240" w:lineRule="auto"/>
+        <w:rPr>
+          <w:noProof/>
+        </w:rPr>
+      </w:pPr>
+    </w:p>
+    <w:p>
+      <w:pPr>
+        <w:spacing w:after="0" w:line="240" w:lineRule="auto"/>
+        <w:jc w:val="center"/>
+        <w:rPr>
+          <w:b/>
+          <w:bCs/>
+          <w:noProof/>
+          <w:sz w:val="32"/>
+          <w:szCs w:val="32"/>
+          <w:u w:val="single"/>
+          <w:lang w:val="tr-TR"/>
+        </w:rPr>
+      </w:pPr>
+      <w:r>
+        <w:rPr>
+          <w:b/>
+          <w:bCs/>
+          <w:noProof/>
+          <w:sz w:val="32"/>
+          <w:szCs w:val="32"/>
+          <w:highlight w:val="yellow"/>
+          <w:u w:val="single"/>
+          <w:lang w:val="tr-TR"/>
+        </w:rPr>
+        <w:t>ResultPackage</w:t>
+      </w:r>
+    </w:p>
+    <w:p>
+      <w:pPr>
+        <w:spacing w:after="0" w:line="240" w:lineRule="auto"/>
+        <w:jc w:val="center"/>
+        <w:rPr>
+          <w:noProof/>
+          <w:lang w:val="tr-TR"/>
+        </w:rPr>
+      </w:pPr>
+      <w:r>
+        <w:rPr>
+          <w:noProof/>
+          <w:lang w:val="tr-TR"/>
+        </w:rPr>
+        <w:t>ResultPackage → ForecastComparison → ComparisonResult</w:t>
+      </w:r>
+    </w:p>
+    <w:p>
+      <w:pPr>
+        <w:spacing w:after="0" w:line="240" w:lineRule="auto"/>
+        <w:jc w:val="center"/>
+        <w:rPr>
+          <w:noProof/>
+          <w:lang w:val="tr-TR"/>
+        </w:rPr>
+      </w:pPr>
+    </w:p>
+    <w:p>
+      <w:pPr>
+        <w:spacing w:after="0" w:line="240" w:lineRule="auto"/>
+        <w:jc w:val="center"/>
+        <w:rPr>
+          <w:b/>
+          <w:bCs/>
+          <w:noProof/>
+          <w:sz w:val="32"/>
+          <w:szCs w:val="32"/>
+          <w:u w:val="single"/>
+          <w:lang w:val="tr-TR"/>
+        </w:rPr>
+      </w:pPr>
+      <w:r>
+        <w:rPr>
+          <w:b/>
+          <w:bCs/>
+          <w:noProof/>
+          <w:sz w:val="32"/>
+          <w:szCs w:val="32"/>
+          <w:u w:val="single"/>
+          <w:lang w:val="tr-TR"/>
+        </w:rPr>
+        <w:t>Result</w:t>
+      </w:r>
+      <w:r>
+        <w:rPr>
+          <w:b/>
+          <w:bCs/>
+          <w:noProof/>
+          <w:sz w:val="32"/>
+          <w:szCs w:val="32"/>
+          <w:u w:val="single"/>
+          <w:lang w:val="tr-TR"/>
+        </w:rPr>
+        <w:t>Loader</w:t>
+      </w:r>
+    </w:p>
+    <w:p>
+      <w:pPr>
+        <w:spacing w:after="0" w:line="240" w:lineRule="auto"/>
+        <w:jc w:val="center"/>
+        <w:rPr>
+          <w:noProof/>
+          <w:lang w:val="tr-TR"/>
+        </w:rPr>
+      </w:pPr>
+      <w:r>
+        <w:rPr>
+          <w:noProof/>
+          <w:lang w:val="tr-TR"/>
+        </w:rPr>
+        <w:t>disk artifacts → ResultLoader → ResultPackage</w:t>
+      </w:r>
+    </w:p>
+    <w:p>
+      <w:pPr>
+        <w:spacing w:after="0" w:line="240" w:lineRule="auto"/>
+        <w:jc w:val="center"/>
+        <w:rPr>
+          <w:noProof/>
+          <w:lang w:val="tr-TR"/>
+        </w:rPr>
+      </w:pPr>
+    </w:p>
+    <w:p>
+      <w:pPr>
+        <w:spacing w:after="0" w:line="240" w:lineRule="auto"/>
+        <w:jc w:val="center"/>
+        <w:rPr>
+          <w:noProof/>
+          <w:lang w:val="tr-TR"/>
+        </w:rPr>
+      </w:pPr>
+    </w:p>
+    <w:p>
+      <w:pPr>
+        <w:spacing w:after="0" w:line="240" w:lineRule="auto"/>
+        <w:jc w:val="center"/>
+        <w:rPr>
+          <w:b/>
+          <w:bCs/>
+          <w:noProof/>
+          <w:sz w:val="32"/>
+          <w:szCs w:val="32"/>
+          <w:lang w:val="tr-TR"/>
+        </w:rPr>
+      </w:pPr>
+      <w:r>
+        <w:rPr>
+          <w:b/>
+          <w:bCs/>
+          <w:noProof/>
+          <w:sz w:val="32"/>
+          <w:szCs w:val="32"/>
+          <w:lang w:val="tr-TR"/>
+        </w:rPr>
+        <w:t>existing ResultLoader tests</w:t>
+      </w:r>
+    </w:p>
+    <w:p>
+      <w:pPr>
+        <w:spacing w:after="0" w:line="240" w:lineRule="auto"/>
+        <w:jc w:val="center"/>
+        <w:rPr>
+          <w:noProof/>
+          <w:lang w:val="tr-TR"/>
+        </w:rPr>
+      </w:pPr>
+      <w:r>
+        <w:rPr>
+          <w:noProof/>
+          <w:lang w:val="tr-TR"/>
+        </w:rPr>
+        <w:t xml:space="preserve">        +</w:t>
+      </w:r>
+    </w:p>
+    <w:p>
+      <w:pPr>
+        <w:spacing w:after="0" w:line="240" w:lineRule="auto"/>
+        <w:jc w:val="center"/>
+        <w:rPr>
+          <w:noProof/>
+          <w:lang w:val="tr-TR"/>
+        </w:rPr>
+      </w:pPr>
+      <w:r>
+        <w:rPr>
+          <w:noProof/>
+          <w:lang w:val="tr-TR"/>
+        </w:rPr>
+        <w:t>new optimized comparison tests</w:t>
+      </w:r>
+    </w:p>
+    <w:p>
+      <w:pPr>
+        <w:spacing w:after="0" w:line="240" w:lineRule="auto"/>
+        <w:jc w:val="center"/>
+        <w:rPr>
+          <w:noProof/>
+          <w:lang w:val="tr-TR"/>
+        </w:rPr>
+      </w:pPr>
+      <w:r>
+        <w:rPr>
+          <w:noProof/>
+          <w:lang w:val="tr-TR"/>
+        </w:rPr>
+        <w:t xml:space="preserve">        ↓</w:t>
+      </w:r>
+    </w:p>
+    <w:p>
+      <w:pPr>
+        <w:spacing w:after="0" w:line="240" w:lineRule="auto"/>
+        <w:jc w:val="center"/>
+        <w:rPr>
+          <w:noProof/>
+          <w:lang w:val="tr-TR"/>
+        </w:rPr>
+      </w:pPr>
+      <w:r>
+        <w:rPr>
+          <w:noProof/>
+          <w:lang w:val="tr-TR"/>
+        </w:rPr>
+        <w:t>disk artifact</w:t>
+      </w:r>
+    </w:p>
+    <w:p>
+      <w:pPr>
+        <w:spacing w:after="0" w:line="240" w:lineRule="auto"/>
+        <w:jc w:val="center"/>
+        <w:rPr>
+          <w:noProof/>
+          <w:lang w:val="tr-TR"/>
+        </w:rPr>
+      </w:pPr>
+      <w:r>
+        <w:rPr>
+          <w:noProof/>
+          <w:lang w:val="tr-TR"/>
+        </w:rPr>
+        <w:t xml:space="preserve"> </w:t>
+      </w:r>
+      <w:r>
+        <w:rPr>
+          <w:b/>
+          <w:bCs/>
+          <w:noProof/>
+          <w:sz w:val="32"/>
+          <w:szCs w:val="32"/>
+          <w:lang w:val="tr-TR"/>
+        </w:rPr>
+        <w:t xml:space="preserve">→ </w:t>
+      </w:r>
+      <w:r>
+        <w:rPr>
+          <w:b/>
+          <w:bCs/>
+          <w:noProof/>
+          <w:sz w:val="32"/>
+          <w:szCs w:val="32"/>
+          <w:highlight w:val="yellow"/>
+          <w:lang w:val="tr-TR"/>
+        </w:rPr>
+        <w:t>ResultPackage</w:t>
+      </w:r>
+    </w:p>
+    <w:p>
+      <w:pPr>
+        <w:spacing w:after="0" w:line="240" w:lineRule="auto"/>
+        <w:jc w:val="center"/>
+        <w:rPr>
+          <w:noProof/>
+          <w:lang w:val="tr-TR"/>
+        </w:rPr>
+      </w:pPr>
+      <w:r>
+        <w:rPr>
+          <w:noProof/>
+          <w:lang w:val="tr-TR"/>
+        </w:rPr>
+        <w:t xml:space="preserve"> → ForecastComparison</w:t>
+      </w:r>
+    </w:p>
+    <w:p>
+      <w:pPr>
+        <w:spacing w:after="0" w:line="240" w:lineRule="auto"/>
+        <w:jc w:val="center"/>
+        <w:rPr>
+          <w:noProof/>
+          <w:lang w:val="tr-TR"/>
+        </w:rPr>
+      </w:pPr>
+      <w:r>
+        <w:rPr>
+          <w:noProof/>
+          <w:lang w:val="tr-TR"/>
+        </w:rPr>
+        <w:t xml:space="preserve"> → ComparisonResult</w:t>
+      </w:r>
     </w:p>
     <w:sectPr>
       <w:pgSz w:w="11906" w:h="16838"/>

</xml_diff>